<commit_message>
Koppel Plas 20 aan M16 M17a en M17b
</commit_message>
<xml_diff>
--- a/docs/database/MEIJENDEL_TABELINVENTARIS.docx
+++ b/docs/database/MEIJENDEL_TABELINVENTARIS.docx
@@ -3749,7 +3749,7 @@
               <w:jc w:val="right"/>
             </w:pPr>
             <w:r>
-              <w:t xml:space="preserve">78</w:t>
+              <w:t xml:space="preserve">79</w:t>
             </w:r>
           </w:p>
         </w:tc>
@@ -4034,18 +4034,18 @@
               <w:jc w:val="right"/>
             </w:pPr>
             <w:r>
-              <w:t xml:space="preserve">32</w:t>
-            </w:r>
-          </w:p>
-        </w:tc>
-        <w:tc>
-          <w:tcPr/>
-          <w:p>
-            <w:pPr>
-              <w:pStyle w:val="Compact"/>
-            </w:pPr>
-            <w:r>
-              <w:t xml:space="preserve">Drie bestaande en 29 nieuwe, geverifieerde directe relaties; de bronnen geven geen doorsnijdingspercentage per plot.</w:t>
+              <w:t xml:space="preserve">35</w:t>
+            </w:r>
+          </w:p>
+        </w:tc>
+        <w:tc>
+          <w:tcPr/>
+          <w:p>
+            <w:pPr>
+              <w:pStyle w:val="Compact"/>
+            </w:pPr>
+            <w:r>
+              <w:t xml:space="preserve">Drie bestaande en 32 nieuwe, geverifieerde directe relaties; de bronnen geven geen doorsnijdingspercentage per plot.</w:t>
             </w:r>
           </w:p>
         </w:tc>
@@ -4151,18 +4151,18 @@
               <w:jc w:val="right"/>
             </w:pPr>
             <w:r>
-              <w:t xml:space="preserve">40</w:t>
-            </w:r>
-          </w:p>
-        </w:tc>
-        <w:tc>
-          <w:tcPr/>
-          <w:p>
-            <w:pPr>
-              <w:pStyle w:val="Compact"/>
-            </w:pPr>
-            <w:r>
-              <w:t xml:space="preserve">Bronvaste plot-jaarregels voor expliciet benoemde kavels in 1967, 1968, 1972–1975, 1988 en 1989.</w:t>
+              <w:t xml:space="preserve">43</w:t>
+            </w:r>
+          </w:p>
+        </w:tc>
+        <w:tc>
+          <w:tcPr/>
+          <w:p>
+            <w:pPr>
+              <w:pStyle w:val="Compact"/>
+            </w:pPr>
+            <w:r>
+              <w:t xml:space="preserve">Bronvaste plot-jaarregels voor expliciet benoemde kavels in 1967–1969, 1972–1975, 1988 en 1989.</w:t>
             </w:r>
           </w:p>
         </w:tc>

</xml_diff>

<commit_message>
Koppel beheer Waalsdorp aan M84 en M43
</commit_message>
<xml_diff>
--- a/docs/database/MEIJENDEL_TABELINVENTARIS.docx
+++ b/docs/database/MEIJENDEL_TABELINVENTARIS.docx
@@ -1590,7 +1590,7 @@
         <w:t xml:space="preserve"> </w:t>
       </w:r>
       <w:r>
-        <w:t xml:space="preserve">voor oorspronkelijke bron-ID's en hun relatie met de gemeenschappelijke objecten.</w:t>
+        <w:t xml:space="preserve">voor oorspronkelijke bron-ID’s en hun relatie met de gemeenschappelijke objecten.</w:t>
       </w:r>
     </w:p>
     <w:p>
@@ -1788,7 +1788,8 @@
     <w:tbl>
       <w:tblPr>
         <w:tblStyle w:val="Table"/>
-        <w:tblW w:type="auto" w:w="0"/>
+        <w:tblW w:type="pct" w:w="5000"/>
+        <w:tblLayout w:type="fixed"/>
         <w:tblLook w:firstRow="1" w:lastRow="0" w:firstColumn="0" w:lastColumn="0" w:noHBand="0" w:noVBand="0" w:val="0020"/>
       </w:tblPr>
       <w:tblGrid>
@@ -2485,13 +2486,14 @@
         <w:t xml:space="preserve"> </w:t>
       </w:r>
       <w:r>
-        <w:t xml:space="preserve">is een importverzameling, geen inhoudelijke hoofdcategorie. De zes datasets omvatten 98.916 resultaten uit 1875–2025 in 10.994 events. Verdeel de resultaten naar de juiste groep of naar PQ; behoud dataset, event, bron-ID's, eenheden, rechten en overlapbesluiten.</w:t>
+        <w:t xml:space="preserve">is een importverzameling, geen inhoudelijke hoofdcategorie. De zes datasets omvatten 98.916 resultaten uit 1875–2025 in 10.994 events. Verdeel de resultaten naar de juiste groep of naar PQ; behoud dataset, event, bron-ID’s, eenheden, rechten en overlapbesluiten.</w:t>
       </w:r>
     </w:p>
     <w:tbl>
       <w:tblPr>
         <w:tblStyle w:val="Table"/>
-        <w:tblW w:type="auto" w:w="0"/>
+        <w:tblW w:type="pct" w:w="5000"/>
+        <w:tblLayout w:type="fixed"/>
         <w:tblLook w:firstRow="1" w:lastRow="0" w:firstColumn="0" w:lastColumn="0" w:noHBand="0" w:noVBand="0" w:val="0020"/>
       </w:tblPr>
       <w:tblGrid>
@@ -2544,7 +2546,7 @@
               <w:pStyle w:val="Compact"/>
             </w:pPr>
             <w:r>
-              <w:t xml:space="preserve">Naar passende watergebonden flora- en faunagroepen; gezamenlijk monster behouden. Alle 1.036 resultaat-JSON's missen kingdom, phylum, class en order en hebben geen exacte naamovereenkomst met de huidige NDFF-taxonnamen. Eerst aanwezige bronmetadata en taxoncodes vertalen; niet alles als insecten behandelen.</w:t>
+              <w:t xml:space="preserve">Naar passende watergebonden flora- en faunagroepen; gezamenlijk monster behouden. Alle 1.036 resultaat-JSON’s missen kingdom, phylum, class en order en hebben geen exacte naamovereenkomst met de huidige NDFF-taxonnamen. Eerst aanwezige bronmetadata en taxoncodes vertalen; niet alles als insecten behandelen.</w:t>
             </w:r>
           </w:p>
         </w:tc>
@@ -2764,7 +2766,7 @@
         <w:t xml:space="preserve">zoogdieren_overig_*</w:t>
       </w:r>
       <w:r>
-        <w:t xml:space="preserve">, op taxon- en vangstniveau. Die verwijzen naar de bestaande vangst-ID's en mogen niet als een tweede verzameling vangsten worden opgeteld.</w:t>
+        <w:t xml:space="preserve">, op taxon- en vangstniveau. Die verwijzen naar de bestaande vangst-ID’s en mogen niet als een tweede verzameling vangsten worden opgeteld.</w:t>
       </w:r>
     </w:p>
     <w:p>
@@ -2817,7 +2819,7 @@
         <w:t xml:space="preserve"> </w:t>
       </w:r>
       <w:r>
-        <w:t xml:space="preserve">blijft behouden en wordt bronoverstijgend gemaakt. De provinciale basis bevat 254 PQ-locaties, 2.007 opnamen en 53.122 taxonresultaten uit 1981–2025. De afleiding naar vogelplots bevat 513 plot-jaarregels uit dezelfde periode. Deze bestaande ID's en uitkomsten vormen de controlebasis.</w:t>
+        <w:t xml:space="preserve">blijft behouden en wordt bronoverstijgend gemaakt. De provinciale basis bevat 254 PQ-locaties, 2.007 opnamen en 53.122 taxonresultaten uit 1981–2025. De afleiding naar vogelplots bevat 513 plot-jaarregels uit dezelfde periode. Deze bestaande ID’s en uitkomsten vormen de controlebasis.</w:t>
       </w:r>
     </w:p>
     <w:p>
@@ -2980,7 +2982,7 @@
         <w:t xml:space="preserve"> </w:t>
       </w:r>
       <w:r>
-        <w:t xml:space="preserve">is onvoldoende wanneer verschillende organisaties hetzelfde nummer gebruiken. Behoud bestaande interne ID's en voeg brongebonden identificaties toe, bijvoorbeeld in</w:t>
+        <w:t xml:space="preserve">is onvoldoende wanneer verschillende organisaties hetzelfde nummer gebruiken. Behoud bestaande interne ID’s en voeg brongebonden identificaties toe, bijvoorbeeld in</w:t>
       </w:r>
       <w:r>
         <w:t xml:space="preserve"> </w:t>
@@ -3027,7 +3029,7 @@
         <w:pStyle w:val="BodyText"/>
       </w:pPr>
       <w:r>
-        <w:t xml:space="preserve">Leg bron, versie, oorspronkelijk locatie- of opname-ID, intern ID, koppelmethode en bewijs vast. Meerdere broncodes mogen naar dezelfde PQ verwijzen wanneer die gelijkheid is vastgesteld. Nieuwe PQ's krijgen een eigen interne identiteit. Nieuwe broncodes worden nooit blind als bestaande provinciale nummers geïnterpreteerd.</w:t>
+        <w:t xml:space="preserve">Leg bron, versie, oorspronkelijk locatie- of opname-ID, intern ID, koppelmethode en bewijs vast. Meerdere broncodes mogen naar dezelfde PQ verwijzen wanneer die gelijkheid is vastgesteld. Nieuwe PQ’s krijgen een eigen interne identiteit. Nieuwe broncodes worden nooit blind als bestaande provinciale nummers geïnterpreteerd.</w:t>
       </w:r>
     </w:p>
     <w:p>
@@ -3091,6 +3093,2077 @@
       </w:pPr>
       <w:r>
         <w:t xml:space="preserve">Het volledige voorstel is een gegevensmigratie. De complexiteit zit vooral in identiteit, gemengde meetstructuren en behoud van de bestaande betekenis.</w:t>
+      </w:r>
+    </w:p>
+    <w:tbl>
+      <w:tblPr>
+        <w:tblStyle w:val="Table"/>
+        <w:tblW w:type="pct" w:w="5000"/>
+        <w:tblLayout w:type="fixed"/>
+        <w:tblLook w:firstRow="1" w:lastRow="0" w:firstColumn="0" w:lastColumn="0" w:noHBand="0" w:noVBand="0" w:val="0020"/>
+      </w:tblPr>
+      <w:tblGrid>
+        <w:gridCol w:w="2640"/>
+        <w:gridCol w:w="2640"/>
+        <w:gridCol w:w="2640"/>
+      </w:tblGrid>
+      <w:tr>
+        <w:trPr>
+          <w:tblHeader w:val="on"/>
+        </w:trPr>
+        <w:tc>
+          <w:tcPr/>
+          <w:p>
+            <w:pPr>
+              <w:pStyle w:val="Compact"/>
+            </w:pPr>
+            <w:r>
+              <w:t xml:space="preserve">Onderdeel</w:t>
+            </w:r>
+          </w:p>
+        </w:tc>
+        <w:tc>
+          <w:tcPr/>
+          <w:p>
+            <w:pPr>
+              <w:pStyle w:val="Compact"/>
+            </w:pPr>
+            <w:r>
+              <w:t xml:space="preserve">Zwaarte</w:t>
+            </w:r>
+          </w:p>
+        </w:tc>
+        <w:tc>
+          <w:tcPr/>
+          <w:p>
+            <w:pPr>
+              <w:pStyle w:val="Compact"/>
+            </w:pPr>
+            <w:r>
+              <w:t xml:space="preserve">Wat het vergt</w:t>
+            </w:r>
+          </w:p>
+        </w:tc>
+      </w:tr>
+      <w:tr>
+        <w:tc>
+          <w:tcPr/>
+          <w:p>
+            <w:pPr>
+              <w:pStyle w:val="Compact"/>
+            </w:pPr>
+            <w:r>
+              <w:t xml:space="preserve">Een afgebakende meetfamilie hernoemen</w:t>
+            </w:r>
+          </w:p>
+        </w:tc>
+        <w:tc>
+          <w:tcPr/>
+          <w:p>
+            <w:pPr>
+              <w:pStyle w:val="Compact"/>
+            </w:pPr>
+            <w:r>
+              <w:t xml:space="preserve">Beperkt tot middelgroot</w:t>
+            </w:r>
+          </w:p>
+        </w:tc>
+        <w:tc>
+          <w:tcPr/>
+          <w:p>
+            <w:pPr>
+              <w:pStyle w:val="Compact"/>
+            </w:pPr>
+            <w:r>
+              <w:t xml:space="preserve">Schema, verwijzingen, import en tests samen aanpassen. De vier huidige</w:t>
+            </w:r>
+            <w:r>
+              <w:t xml:space="preserve"> </w:t>
+            </w:r>
+            <w:r>
+              <w:rPr>
+                <w:rStyle w:val="VerbatimChar"/>
+              </w:rPr>
+              <w:t xml:space="preserve">ndff_libel_*</w:t>
+            </w:r>
+            <w:r>
+              <w:t xml:space="preserve">-tabellen zijn een afgebakend voorbeeld.</w:t>
+            </w:r>
+          </w:p>
+        </w:tc>
+      </w:tr>
+      <w:tr>
+        <w:tc>
+          <w:tcPr/>
+          <w:p>
+            <w:pPr>
+              <w:pStyle w:val="Compact"/>
+            </w:pPr>
+            <w:r>
+              <w:t xml:space="preserve">NDFF-waarnemingen naar echte groepsfamilies verdelen</w:t>
+            </w:r>
+          </w:p>
+        </w:tc>
+        <w:tc>
+          <w:tcPr/>
+          <w:p>
+            <w:pPr>
+              <w:pStyle w:val="Compact"/>
+            </w:pPr>
+            <w:r>
+              <w:t xml:space="preserve">Groot</w:t>
+            </w:r>
+          </w:p>
+        </w:tc>
+        <w:tc>
+          <w:tcPr/>
+          <w:p>
+            <w:pPr>
+              <w:pStyle w:val="Compact"/>
+            </w:pPr>
+            <w:r>
+              <w:t xml:space="preserve">Stabiele ID’s, ruimtelijke beoordeling, protocollen, analysebesluiten en de 233 dubbele lidmaatschappen correct meenemen.</w:t>
+            </w:r>
+          </w:p>
+        </w:tc>
+      </w:tr>
+      <w:tr>
+        <w:tc>
+          <w:tcPr/>
+          <w:p>
+            <w:pPr>
+              <w:pStyle w:val="Compact"/>
+            </w:pPr>
+            <w:r>
+              <w:t xml:space="preserve">De zes externe datasets aansluiten</w:t>
+            </w:r>
+          </w:p>
+        </w:tc>
+        <w:tc>
+          <w:tcPr/>
+          <w:p>
+            <w:pPr>
+              <w:pStyle w:val="Compact"/>
+            </w:pPr>
+            <w:r>
+              <w:t xml:space="preserve">Middelgroot tot groot</w:t>
+            </w:r>
+          </w:p>
+        </w:tc>
+        <w:tc>
+          <w:tcPr/>
+          <w:p>
+            <w:pPr>
+              <w:pStyle w:val="Compact"/>
+            </w:pPr>
+            <w:r>
+              <w:t xml:space="preserve">98.916 resultaten uit 1875–2025 per taxon en meetvorm toewijzen. Coleoptera is eenvoudiger af te bakenen dan STOWA.</w:t>
+            </w:r>
+          </w:p>
+        </w:tc>
+      </w:tr>
+      <w:tr>
+        <w:tc>
+          <w:tcPr/>
+          <w:p>
+            <w:pPr>
+              <w:pStyle w:val="Compact"/>
+            </w:pPr>
+            <w:r>
+              <w:t xml:space="preserve">Vangblik vanuit soortgroepen bereikbaar maken</w:t>
+            </w:r>
+          </w:p>
+        </w:tc>
+        <w:tc>
+          <w:tcPr/>
+          <w:p>
+            <w:pPr>
+              <w:pStyle w:val="Compact"/>
+            </w:pPr>
+            <w:r>
+              <w:t xml:space="preserve">Middelgroot</w:t>
+            </w:r>
+          </w:p>
+        </w:tc>
+        <w:tc>
+          <w:tcPr/>
+          <w:p>
+            <w:pPr>
+              <w:pStyle w:val="Compact"/>
+            </w:pPr>
+            <w:r>
+              <w:t xml:space="preserve">Taxonkoppelingen en gecontroleerde verwijzingen voor 60.560 resultaten uit 1953–1960, zonder dubbele telling.</w:t>
+            </w:r>
+          </w:p>
+        </w:tc>
+      </w:tr>
+      <w:tr>
+        <w:tc>
+          <w:tcPr/>
+          <w:p>
+            <w:pPr>
+              <w:pStyle w:val="Compact"/>
+            </w:pPr>
+            <w:r>
+              <w:t xml:space="preserve">Verspreide PQ-informatie samenbrengen</w:t>
+            </w:r>
+          </w:p>
+        </w:tc>
+        <w:tc>
+          <w:tcPr/>
+          <w:p>
+            <w:pPr>
+              <w:pStyle w:val="Compact"/>
+            </w:pPr>
+            <w:r>
+              <w:t xml:space="preserve">Groot</w:t>
+            </w:r>
+          </w:p>
+        </w:tc>
+        <w:tc>
+          <w:tcPr/>
+          <w:p>
+            <w:pPr>
+              <w:pStyle w:val="Compact"/>
+            </w:pPr>
+            <w:r>
+              <w:t xml:space="preserve">Bronsleutels, opnamen, lagen, bedekkingsschalen en overlap vergelijken. Bovendien leest Shiny de huidige PQ-afleiding al.</w:t>
+            </w:r>
+          </w:p>
+        </w:tc>
+      </w:tr>
+      <w:tr>
+        <w:tc>
+          <w:tcPr/>
+          <w:p>
+            <w:pPr>
+              <w:pStyle w:val="Compact"/>
+            </w:pPr>
+            <w:r>
+              <w:t xml:space="preserve">Vogels en bestaande toepassingen beschermen</w:t>
+            </w:r>
+          </w:p>
+        </w:tc>
+        <w:tc>
+          <w:tcPr/>
+          <w:p>
+            <w:pPr>
+              <w:pStyle w:val="Compact"/>
+            </w:pPr>
+            <w:r>
+              <w:t xml:space="preserve">Harde voorwaarde</w:t>
+            </w:r>
+          </w:p>
+        </w:tc>
+        <w:tc>
+          <w:tcPr/>
+          <w:p>
+            <w:pPr>
+              <w:pStyle w:val="Compact"/>
+            </w:pPr>
+            <w:r>
+              <w:t xml:space="preserve">Vogel-ID’s, tabellen, berekeningen en scherminhoud gelijk houden; niet alleen controleren of een pagina opent.</w:t>
+            </w:r>
+          </w:p>
+        </w:tc>
+      </w:tr>
+    </w:tbl>
+    <w:p>
+      <w:pPr>
+        <w:pStyle w:val="FirstParagraph"/>
+      </w:pPr>
+      <w:r>
+        <w:t xml:space="preserve">Een betrouwbare urenraming volgt pas uit een proef op een databasekopie. Het aantal nieuwe tabellen staat evenmin vast: sommige structuren worden hernoemd, andere verdeeld, en gedeelde ondersteuning blijft bijeen. De oude rekensom van 149 hernoemingen en veertien behouden namen geldt dus niet meer.</w:t>
+      </w:r>
+    </w:p>
+    <w:p>
+      <w:pPr>
+        <w:pStyle w:val="BodyText"/>
+      </w:pPr>
+      <w:r>
+        <w:t xml:space="preserve">Taxonvertaling is noodzakelijk.</w:t>
+      </w:r>
+      <w:r>
+        <w:t xml:space="preserve"> </w:t>
+      </w:r>
+      <w:r>
+        <w:rPr>
+          <w:rStyle w:val="VerbatimChar"/>
+        </w:rPr>
+        <w:t xml:space="preserve">ndff_soorten</w:t>
+      </w:r>
+      <w:r>
+        <w:t xml:space="preserve"> </w:t>
+      </w:r>
+      <w:r>
+        <w:t xml:space="preserve">heeft 9.828 bronreferenties, Vangblik 275 bij de reeks 1953–1960, PQ 714 bij 1981–2025 en AVIMAP 35 bij 2009–2026. Externe ecologie heeft 2.894 verschillende opgeslagen wetenschappelijke naamwaarden bij de 98.916 resultaten uit 1875–2025, zonder gemeenschappelijke taxon-foreign-key. Behoud bronnamen, rang en versie en leg gecontroleerde overeenkomsten naast de bronidentiteit vast. De vogelgerichte tabel</w:t>
+      </w:r>
+      <w:r>
+        <w:t xml:space="preserve"> </w:t>
+      </w:r>
+      <w:r>
+        <w:rPr>
+          <w:rStyle w:val="VerbatimChar"/>
+        </w:rPr>
+        <w:t xml:space="preserve">soorten</w:t>
+      </w:r>
+      <w:r>
+        <w:t xml:space="preserve"> </w:t>
+      </w:r>
+      <w:r>
+        <w:t xml:space="preserve">blijft onaangetast.</w:t>
+      </w:r>
+    </w:p>
+    <w:p>
+      <w:pPr>
+        <w:pStyle w:val="Heading2"/>
+      </w:pPr>
+      <w:bookmarkStart w:id="22" w:name="_d275c12976b6db7ca538f1cc96154c39857110d"/>
+      <w:r>
+        <w:t xml:space="preserve">Bronvast werkzaamhedenmodel</w:t>
+      </w:r>
+      <w:bookmarkEnd w:id="22"/>
+    </w:p>
+    <w:p>
+      <w:pPr>
+        <w:pStyle w:val="FirstParagraph"/>
+      </w:pPr>
+      <w:r>
+        <w:t xml:space="preserve">De levende lokale database bevat naast de bestaande classificatie een afzonderlijke laag voor projecten, feitelijke of geplande uitvoeringen, expliciete jaarstatussen en bewijsbronnen. Op 14 oktober 2026 is deze laag aangevuld na controle van alle 807 actieve Zotero-bijlagen. De bestaande tabellen</w:t>
+      </w:r>
+      <w:r>
+        <w:t xml:space="preserve"> </w:t>
+      </w:r>
+      <w:r>
+        <w:rPr>
+          <w:rStyle w:val="VerbatimChar"/>
+        </w:rPr>
+        <w:t xml:space="preserve">maatregelen</w:t>
+      </w:r>
+      <w:r>
+        <w:t xml:space="preserve">,</w:t>
+      </w:r>
+      <w:r>
+        <w:t xml:space="preserve"> </w:t>
+      </w:r>
+      <w:r>
+        <w:rPr>
+          <w:rStyle w:val="VerbatimChar"/>
+        </w:rPr>
+        <w:t xml:space="preserve">maatregelen_kernwoorden</w:t>
+      </w:r>
+      <w:r>
+        <w:t xml:space="preserve"> </w:t>
+      </w:r>
+      <w:r>
+        <w:t xml:space="preserve">en</w:t>
+      </w:r>
+      <w:r>
+        <w:t xml:space="preserve"> </w:t>
+      </w:r>
+      <w:r>
+        <w:rPr>
+          <w:rStyle w:val="VerbatimChar"/>
+        </w:rPr>
+        <w:t xml:space="preserve">plot_jaar_maatregel</w:t>
+      </w:r>
+      <w:r>
+        <w:t xml:space="preserve"> </w:t>
+      </w:r>
+      <w:r>
+        <w:t xml:space="preserve">blijven bestaan. De vier algemene kernwoorden voor recreatiebeheer zijn onder de nieuwe hoofdklasse</w:t>
+      </w:r>
+      <w:r>
+        <w:t xml:space="preserve"> </w:t>
+      </w:r>
+      <w:r>
+        <w:rPr>
+          <w:rStyle w:val="VerbatimChar"/>
+        </w:rPr>
+        <w:t xml:space="preserve">rust_en_recreatiebeheer</w:t>
+      </w:r>
+      <w:r>
+        <w:t xml:space="preserve"> </w:t>
+      </w:r>
+      <w:r>
+        <w:t xml:space="preserve">geplaatst;</w:t>
+      </w:r>
+      <w:r>
+        <w:t xml:space="preserve"> </w:t>
+      </w:r>
+      <w:r>
+        <w:rPr>
+          <w:rStyle w:val="VerbatimChar"/>
+        </w:rPr>
+        <w:t xml:space="preserve">strandreservaat</w:t>
+      </w:r>
+      <w:r>
+        <w:t xml:space="preserve"> </w:t>
+      </w:r>
+      <w:r>
+        <w:t xml:space="preserve">blijft als specifiek kernwoord onder</w:t>
+      </w:r>
+      <w:r>
+        <w:t xml:space="preserve"> </w:t>
+      </w:r>
+      <w:r>
+        <w:rPr>
+          <w:rStyle w:val="VerbatimChar"/>
+        </w:rPr>
+        <w:t xml:space="preserve">strandreservaten</w:t>
+      </w:r>
+      <w:r>
+        <w:t xml:space="preserve"> </w:t>
+      </w:r>
+      <w:r>
+        <w:t xml:space="preserve">herkenbaar.</w:t>
+      </w:r>
+    </w:p>
+    <w:tbl>
+      <w:tblPr>
+        <w:tblStyle w:val="Table"/>
+        <w:tblW w:type="pct" w:w="5000"/>
+        <w:tblLayout w:type="fixed"/>
+        <w:tblLook w:firstRow="1" w:lastRow="0" w:firstColumn="0" w:lastColumn="0" w:noHBand="0" w:noVBand="0" w:val="0020"/>
+      </w:tblPr>
+      <w:tblGrid>
+        <w:gridCol w:w="2376"/>
+        <w:gridCol w:w="3168"/>
+        <w:gridCol w:w="2376"/>
+      </w:tblGrid>
+      <w:tr>
+        <w:trPr>
+          <w:tblHeader w:val="on"/>
+        </w:trPr>
+        <w:tc>
+          <w:tcPr/>
+          <w:p>
+            <w:pPr>
+              <w:pStyle w:val="Compact"/>
+            </w:pPr>
+            <w:r>
+              <w:t xml:space="preserve">Tabel of view</w:t>
+            </w:r>
+          </w:p>
+        </w:tc>
+        <w:tc>
+          <w:tcPr/>
+          <w:p>
+            <w:pPr>
+              <w:pStyle w:val="Compact"/>
+              <w:jc w:val="right"/>
+            </w:pPr>
+            <w:r>
+              <w:t xml:space="preserve">Records</w:t>
+            </w:r>
+          </w:p>
+        </w:tc>
+        <w:tc>
+          <w:tcPr/>
+          <w:p>
+            <w:pPr>
+              <w:pStyle w:val="Compact"/>
+            </w:pPr>
+            <w:r>
+              <w:t xml:space="preserve">Betekenis</w:t>
+            </w:r>
+          </w:p>
+        </w:tc>
+      </w:tr>
+      <w:tr>
+        <w:tc>
+          <w:tcPr/>
+          <w:p>
+            <w:pPr>
+              <w:pStyle w:val="Compact"/>
+            </w:pPr>
+            <w:r>
+              <w:rPr>
+                <w:rStyle w:val="VerbatimChar"/>
+              </w:rPr>
+              <w:t xml:space="preserve">maatregel_project</w:t>
+            </w:r>
+          </w:p>
+        </w:tc>
+        <w:tc>
+          <w:tcPr/>
+          <w:p>
+            <w:pPr>
+              <w:pStyle w:val="Compact"/>
+              <w:jc w:val="right"/>
+            </w:pPr>
+            <w:r>
+              <w:t xml:space="preserve">18</w:t>
+            </w:r>
+          </w:p>
+        </w:tc>
+        <w:tc>
+          <w:tcPr/>
+          <w:p>
+            <w:pPr>
+              <w:pStyle w:val="Compact"/>
+            </w:pPr>
+            <w:r>
+              <w:t xml:space="preserve">Samenhangend project of programma; een project kan meerdere uitvoeringen bevatten.</w:t>
+            </w:r>
+          </w:p>
+        </w:tc>
+      </w:tr>
+      <w:tr>
+        <w:tc>
+          <w:tcPr/>
+          <w:p>
+            <w:pPr>
+              <w:pStyle w:val="Compact"/>
+            </w:pPr>
+            <w:r>
+              <w:rPr>
+                <w:rStyle w:val="VerbatimChar"/>
+              </w:rPr>
+              <w:t xml:space="preserve">maatregel_bron</w:t>
+            </w:r>
+          </w:p>
+        </w:tc>
+        <w:tc>
+          <w:tcPr/>
+          <w:p>
+            <w:pPr>
+              <w:pStyle w:val="Compact"/>
+              <w:jc w:val="right"/>
+            </w:pPr>
+            <w:r>
+              <w:t xml:space="preserve">30</w:t>
+            </w:r>
+          </w:p>
+        </w:tc>
+        <w:tc>
+          <w:tcPr/>
+          <w:p>
+            <w:pPr>
+              <w:pStyle w:val="Compact"/>
+            </w:pPr>
+            <w:r>
+              <w:t xml:space="preserve">22 lokaal geraadpleegde Zotero-bronnen en acht officiële webbronnen, ieder met type, datum, status en raadpleegdatum.</w:t>
+            </w:r>
+          </w:p>
+        </w:tc>
+      </w:tr>
+      <w:tr>
+        <w:tc>
+          <w:tcPr/>
+          <w:p>
+            <w:pPr>
+              <w:pStyle w:val="Compact"/>
+            </w:pPr>
+            <w:r>
+              <w:rPr>
+                <w:rStyle w:val="VerbatimChar"/>
+              </w:rPr>
+              <w:t xml:space="preserve">maatregel_uitvoering</w:t>
+            </w:r>
+          </w:p>
+        </w:tc>
+        <w:tc>
+          <w:tcPr/>
+          <w:p>
+            <w:pPr>
+              <w:pStyle w:val="Compact"/>
+              <w:jc w:val="right"/>
+            </w:pPr>
+            <w:r>
+              <w:t xml:space="preserve">61</w:t>
+            </w:r>
+          </w:p>
+        </w:tc>
+        <w:tc>
+          <w:tcPr/>
+          <w:p>
+            <w:pPr>
+              <w:pStyle w:val="Compact"/>
+            </w:pPr>
+            <w:r>
+              <w:t xml:space="preserve">Afzonderlijke werkzaamheden of expliciet niet-uitgevoerde, onbekende of geplande activiteiten.</w:t>
+            </w:r>
+          </w:p>
+        </w:tc>
+      </w:tr>
+      <w:tr>
+        <w:tc>
+          <w:tcPr/>
+          <w:p>
+            <w:pPr>
+              <w:pStyle w:val="Compact"/>
+            </w:pPr>
+            <w:r>
+              <w:rPr>
+                <w:rStyle w:val="VerbatimChar"/>
+              </w:rPr>
+              <w:t xml:space="preserve">maatregel_uitvoering_jaar</w:t>
+            </w:r>
+          </w:p>
+        </w:tc>
+        <w:tc>
+          <w:tcPr/>
+          <w:p>
+            <w:pPr>
+              <w:pStyle w:val="Compact"/>
+              <w:jc w:val="right"/>
+            </w:pPr>
+            <w:r>
+              <w:t xml:space="preserve">100</w:t>
+            </w:r>
+          </w:p>
+        </w:tc>
+        <w:tc>
+          <w:tcPr/>
+          <w:p>
+            <w:pPr>
+              <w:pStyle w:val="Compact"/>
+            </w:pPr>
+            <w:r>
+              <w:t xml:space="preserve">Letterlijk onderbouwde jaarstatussen uit 1967–2025: 84 uitgevoerd, 9 niet uitgevoerd en 7 onbekend.</w:t>
+            </w:r>
+          </w:p>
+        </w:tc>
+      </w:tr>
+      <w:tr>
+        <w:tc>
+          <w:tcPr/>
+          <w:p>
+            <w:pPr>
+              <w:pStyle w:val="Compact"/>
+            </w:pPr>
+            <w:r>
+              <w:rPr>
+                <w:rStyle w:val="VerbatimChar"/>
+              </w:rPr>
+              <w:t xml:space="preserve">maatregel_uitvoering_bron</w:t>
+            </w:r>
+          </w:p>
+        </w:tc>
+        <w:tc>
+          <w:tcPr/>
+          <w:p>
+            <w:pPr>
+              <w:pStyle w:val="Compact"/>
+              <w:jc w:val="right"/>
+            </w:pPr>
+            <w:r>
+              <w:t xml:space="preserve">83</w:t>
+            </w:r>
+          </w:p>
+        </w:tc>
+        <w:tc>
+          <w:tcPr/>
+          <w:p>
+            <w:pPr>
+              <w:pStyle w:val="Compact"/>
+            </w:pPr>
+            <w:r>
+              <w:t xml:space="preserve">Relaties tussen uitvoering en bewijsbron, met bronrol en bewijsnotitie.</w:t>
+            </w:r>
+          </w:p>
+        </w:tc>
+      </w:tr>
+      <w:tr>
+        <w:tc>
+          <w:tcPr/>
+          <w:p>
+            <w:pPr>
+              <w:pStyle w:val="Compact"/>
+            </w:pPr>
+            <w:r>
+              <w:rPr>
+                <w:rStyle w:val="VerbatimChar"/>
+              </w:rPr>
+              <w:t xml:space="preserve">maatregel_geometrie</w:t>
+            </w:r>
+          </w:p>
+        </w:tc>
+        <w:tc>
+          <w:tcPr/>
+          <w:p>
+            <w:pPr>
+              <w:pStyle w:val="Compact"/>
+              <w:jc w:val="right"/>
+            </w:pPr>
+            <w:r>
+              <w:t xml:space="preserve">0</w:t>
+            </w:r>
+          </w:p>
+        </w:tc>
+        <w:tc>
+          <w:tcPr/>
+          <w:p>
+            <w:pPr>
+              <w:pStyle w:val="Compact"/>
+            </w:pPr>
+            <w:r>
+              <w:t xml:space="preserve">Alleen voor later verkregen, bronvaste geometrieën in RD New.</w:t>
+            </w:r>
+          </w:p>
+        </w:tc>
+      </w:tr>
+      <w:tr>
+        <w:tc>
+          <w:tcPr/>
+          <w:p>
+            <w:pPr>
+              <w:pStyle w:val="Compact"/>
+            </w:pPr>
+            <w:r>
+              <w:rPr>
+                <w:rStyle w:val="VerbatimChar"/>
+              </w:rPr>
+              <w:t xml:space="preserve">plot_gebied</w:t>
+            </w:r>
+          </w:p>
+        </w:tc>
+        <w:tc>
+          <w:tcPr/>
+          <w:p>
+            <w:pPr>
+              <w:pStyle w:val="Compact"/>
+              <w:jc w:val="right"/>
+            </w:pPr>
+            <w:r>
+              <w:t xml:space="preserve">8</w:t>
+            </w:r>
+          </w:p>
+        </w:tc>
+        <w:tc>
+          <w:tcPr/>
+          <w:p>
+            <w:pPr>
+              <w:pStyle w:val="Compact"/>
+            </w:pPr>
+            <w:r>
+              <w:t xml:space="preserve">Vijf Meijendel-deelgebieden en drie speciale gebieden.</w:t>
+            </w:r>
+          </w:p>
+        </w:tc>
+      </w:tr>
+      <w:tr>
+        <w:tc>
+          <w:tcPr/>
+          <w:p>
+            <w:pPr>
+              <w:pStyle w:val="Compact"/>
+            </w:pPr>
+            <w:r>
+              <w:rPr>
+                <w:rStyle w:val="VerbatimChar"/>
+              </w:rPr>
+              <w:t xml:space="preserve">plot_gebiedsindeling</w:t>
+            </w:r>
+          </w:p>
+        </w:tc>
+        <w:tc>
+          <w:tcPr/>
+          <w:p>
+            <w:pPr>
+              <w:pStyle w:val="Compact"/>
+              <w:jc w:val="right"/>
+            </w:pPr>
+            <w:r>
+              <w:t xml:space="preserve">1</w:t>
+            </w:r>
+          </w:p>
+        </w:tc>
+        <w:tc>
+          <w:tcPr/>
+          <w:p>
+            <w:pPr>
+              <w:pStyle w:val="Compact"/>
+            </w:pPr>
+            <w:r>
+              <w:t xml:space="preserve">Vastgestelde indeling</w:t>
+            </w:r>
+            <w:r>
+              <w:t xml:space="preserve"> </w:t>
+            </w:r>
+            <w:r>
+              <w:rPr>
+                <w:rStyle w:val="VerbatimChar"/>
+              </w:rPr>
+              <w:t xml:space="preserve">vogelplot-gebiedsindeling-v1</w:t>
+            </w:r>
+            <w:r>
+              <w:t xml:space="preserve">, gekoppeld aan SOVON-plotversie 2025.</w:t>
+            </w:r>
+          </w:p>
+        </w:tc>
+      </w:tr>
+      <w:tr>
+        <w:tc>
+          <w:tcPr/>
+          <w:p>
+            <w:pPr>
+              <w:pStyle w:val="Compact"/>
+            </w:pPr>
+            <w:r>
+              <w:rPr>
+                <w:rStyle w:val="VerbatimChar"/>
+              </w:rPr>
+              <w:t xml:space="preserve">plot_gebied_lidmaatschap</w:t>
+            </w:r>
+          </w:p>
+        </w:tc>
+        <w:tc>
+          <w:tcPr/>
+          <w:p>
+            <w:pPr>
+              <w:pStyle w:val="Compact"/>
+              <w:jc w:val="right"/>
+            </w:pPr>
+            <w:r>
+              <w:t xml:space="preserve">69</w:t>
+            </w:r>
+          </w:p>
+        </w:tc>
+        <w:tc>
+          <w:tcPr/>
+          <w:p>
+            <w:pPr>
+              <w:pStyle w:val="Compact"/>
+            </w:pPr>
+            <w:r>
+              <w:t xml:space="preserve">Alle 55 actuele en 14 historische plots hebben precies één gebied.</w:t>
+            </w:r>
+          </w:p>
+        </w:tc>
+      </w:tr>
+      <w:tr>
+        <w:tc>
+          <w:tcPr/>
+          <w:p>
+            <w:pPr>
+              <w:pStyle w:val="Compact"/>
+            </w:pPr>
+            <w:r>
+              <w:rPr>
+                <w:rStyle w:val="VerbatimChar"/>
+              </w:rPr>
+              <w:t xml:space="preserve">plot_gebied_geometrie</w:t>
+            </w:r>
+          </w:p>
+        </w:tc>
+        <w:tc>
+          <w:tcPr/>
+          <w:p>
+            <w:pPr>
+              <w:pStyle w:val="Compact"/>
+              <w:jc w:val="right"/>
+            </w:pPr>
+            <w:r>
+              <w:t xml:space="preserve">8</w:t>
+            </w:r>
+          </w:p>
+        </w:tc>
+        <w:tc>
+          <w:tcPr/>
+          <w:p>
+            <w:pPr>
+              <w:pStyle w:val="Compact"/>
+            </w:pPr>
+            <w:r>
+              <w:t xml:space="preserve">Topologisch samengevoegde actuele kavelgeometrieën in RD New; samen afgeleid uit 55 plots.</w:t>
+            </w:r>
+          </w:p>
+        </w:tc>
+      </w:tr>
+      <w:tr>
+        <w:tc>
+          <w:tcPr/>
+          <w:p>
+            <w:pPr>
+              <w:pStyle w:val="Compact"/>
+            </w:pPr>
+            <w:r>
+              <w:rPr>
+                <w:rStyle w:val="VerbatimChar"/>
+              </w:rPr>
+              <w:t xml:space="preserve">maatregel_uitvoering_gebied</w:t>
+            </w:r>
+          </w:p>
+        </w:tc>
+        <w:tc>
+          <w:tcPr/>
+          <w:p>
+            <w:pPr>
+              <w:pStyle w:val="Compact"/>
+              <w:jc w:val="right"/>
+            </w:pPr>
+            <w:r>
+              <w:t xml:space="preserve">2</w:t>
+            </w:r>
+          </w:p>
+        </w:tc>
+        <w:tc>
+          <w:tcPr/>
+          <w:p>
+            <w:pPr>
+              <w:pStyle w:val="Compact"/>
+            </w:pPr>
+            <w:r>
+              <w:t xml:space="preserve">Voorlinden als locatie binnen M91 en begrazing vanaf 1990 voor Kijfhoek en Bierlap als volledig benoemd gebied.</w:t>
+            </w:r>
+          </w:p>
+        </w:tc>
+      </w:tr>
+      <w:tr>
+        <w:tc>
+          <w:tcPr/>
+          <w:p>
+            <w:pPr>
+              <w:pStyle w:val="Compact"/>
+            </w:pPr>
+            <w:r>
+              <w:rPr>
+                <w:rStyle w:val="VerbatimChar"/>
+              </w:rPr>
+              <w:t xml:space="preserve">maatregel_plot_koppeling</w:t>
+            </w:r>
+          </w:p>
+        </w:tc>
+        <w:tc>
+          <w:tcPr/>
+          <w:p>
+            <w:pPr>
+              <w:pStyle w:val="Compact"/>
+              <w:jc w:val="right"/>
+            </w:pPr>
+            <w:r>
+              <w:t xml:space="preserve">101</w:t>
+            </w:r>
+          </w:p>
+        </w:tc>
+        <w:tc>
+          <w:tcPr/>
+          <w:p>
+            <w:pPr>
+              <w:pStyle w:val="Compact"/>
+            </w:pPr>
+            <w:r>
+              <w:t xml:space="preserve">36 eerder onderbouwde relaties; 32 relaties via de nameninventaris; 11 voor Pan 13 en Plas 20; telkens 3 voor Helmduinen, Kikkervalleienbegrazing, bodemherstel, infrastructuur en Watercrassula; telkens 1 voor Parnassiapad 1, Parnassiapad 2 en Plas 8.4.2; 2 voor Waalsdorp; en 2 voor de konijnenbijplaatsingsproef. De exacte werkoppervlakken per kavel blijven onbekend.</w:t>
+            </w:r>
+          </w:p>
+        </w:tc>
+      </w:tr>
+      <w:tr>
+        <w:tc>
+          <w:tcPr/>
+          <w:p>
+            <w:pPr>
+              <w:pStyle w:val="Compact"/>
+            </w:pPr>
+            <w:r>
+              <w:rPr>
+                <w:rStyle w:val="VerbatimChar"/>
+              </w:rPr>
+              <w:t xml:space="preserve">v_plot_gebied_actueel</w:t>
+            </w:r>
+          </w:p>
+        </w:tc>
+        <w:tc>
+          <w:tcPr/>
+          <w:p>
+            <w:pPr>
+              <w:pStyle w:val="Compact"/>
+              <w:jc w:val="right"/>
+            </w:pPr>
+            <w:r>
+              <w:t xml:space="preserve">69</w:t>
+            </w:r>
+          </w:p>
+        </w:tc>
+        <w:tc>
+          <w:tcPr/>
+          <w:p>
+            <w:pPr>
+              <w:pStyle w:val="Compact"/>
+            </w:pPr>
+            <w:r>
+              <w:t xml:space="preserve">Actuele leeslaag van de volledige vastgestelde gebiedsindeling.</w:t>
+            </w:r>
+          </w:p>
+        </w:tc>
+      </w:tr>
+      <w:tr>
+        <w:tc>
+          <w:tcPr/>
+          <w:p>
+            <w:pPr>
+              <w:pStyle w:val="Compact"/>
+            </w:pPr>
+            <w:r>
+              <w:rPr>
+                <w:rStyle w:val="VerbatimChar"/>
+              </w:rPr>
+              <w:t xml:space="preserve">v_plot_gebied_geometrie_actueel</w:t>
+            </w:r>
+          </w:p>
+        </w:tc>
+        <w:tc>
+          <w:tcPr/>
+          <w:p>
+            <w:pPr>
+              <w:pStyle w:val="Compact"/>
+              <w:jc w:val="right"/>
+            </w:pPr>
+            <w:r>
+              <w:t xml:space="preserve">8</w:t>
+            </w:r>
+          </w:p>
+        </w:tc>
+        <w:tc>
+          <w:tcPr/>
+          <w:p>
+            <w:pPr>
+              <w:pStyle w:val="Compact"/>
+            </w:pPr>
+            <w:r>
+              <w:t xml:space="preserve">Actuele leeslaag van de afgeleide gebiedsgeometrieën.</w:t>
+            </w:r>
+          </w:p>
+        </w:tc>
+      </w:tr>
+      <w:tr>
+        <w:tc>
+          <w:tcPr/>
+          <w:p>
+            <w:pPr>
+              <w:pStyle w:val="Compact"/>
+            </w:pPr>
+            <w:r>
+              <w:rPr>
+                <w:rStyle w:val="VerbatimChar"/>
+              </w:rPr>
+              <w:t xml:space="preserve">v_plot_jaar_maatregel_bronvast</w:t>
+            </w:r>
+          </w:p>
+        </w:tc>
+        <w:tc>
+          <w:tcPr/>
+          <w:p>
+            <w:pPr>
+              <w:pStyle w:val="Compact"/>
+              <w:jc w:val="right"/>
+            </w:pPr>
+            <w:r>
+              <w:t xml:space="preserve">157</w:t>
+            </w:r>
+          </w:p>
+        </w:tc>
+        <w:tc>
+          <w:tcPr/>
+          <w:p>
+            <w:pPr>
+              <w:pStyle w:val="Compact"/>
+            </w:pPr>
+            <w:r>
+              <w:t xml:space="preserve">Bronvaste plot-jaarregels voor 1967–1969, 1972–1975, 1988–1991, 1993, 1997, 2002, 2005–2006 en 2017–2025. Hieronder vallen Waalsdorp in M84 en M43 in 2016–2019, Parnassiapad 1 in M15 rond 1997, de konijnenbijplaatsingsproef in M8 en M41 in 2024 en de slibverwijdering in Plas 8.4.2 in M32 in 2002.</w:t>
+            </w:r>
+          </w:p>
+        </w:tc>
+      </w:tr>
+    </w:tbl>
+    <w:p>
+      <w:pPr>
+        <w:pStyle w:val="FirstParagraph"/>
+      </w:pPr>
+      <w:r>
+        <w:t xml:space="preserve">De referentietabellen</w:t>
+      </w:r>
+      <w:r>
+        <w:t xml:space="preserve"> </w:t>
+      </w:r>
+      <w:r>
+        <w:rPr>
+          <w:rStyle w:val="VerbatimChar"/>
+        </w:rPr>
+        <w:t xml:space="preserve">maatregel_werkcategorie</w:t>
+      </w:r>
+      <w:r>
+        <w:t xml:space="preserve">,</w:t>
+      </w:r>
+      <w:r>
+        <w:t xml:space="preserve"> </w:t>
+      </w:r>
+      <w:r>
+        <w:rPr>
+          <w:rStyle w:val="VerbatimChar"/>
+        </w:rPr>
+        <w:t xml:space="preserve">maatregel_type</w:t>
+      </w:r>
+      <w:r>
+        <w:t xml:space="preserve">,</w:t>
+      </w:r>
+      <w:r>
+        <w:t xml:space="preserve"> </w:t>
+      </w:r>
+      <w:r>
+        <w:rPr>
+          <w:rStyle w:val="VerbatimChar"/>
+        </w:rPr>
+        <w:t xml:space="preserve">maatregel_activiteit_type</w:t>
+      </w:r>
+      <w:r>
+        <w:t xml:space="preserve">,</w:t>
+      </w:r>
+      <w:r>
+        <w:t xml:space="preserve"> </w:t>
+      </w:r>
+      <w:r>
+        <w:rPr>
+          <w:rStyle w:val="VerbatimChar"/>
+        </w:rPr>
+        <w:t xml:space="preserve">maatregel_uitvoering_status</w:t>
+      </w:r>
+      <w:r>
+        <w:t xml:space="preserve"> </w:t>
+      </w:r>
+      <w:r>
+        <w:t xml:space="preserve">en</w:t>
+      </w:r>
+      <w:r>
+        <w:t xml:space="preserve"> </w:t>
+      </w:r>
+      <w:r>
+        <w:rPr>
+          <w:rStyle w:val="VerbatimChar"/>
+        </w:rPr>
+        <w:t xml:space="preserve">maatregel_brontype</w:t>
+      </w:r>
+      <w:r>
+        <w:t xml:space="preserve"> </w:t>
+      </w:r>
+      <w:r>
+        <w:t xml:space="preserve">scheiden categorie, activiteit, feitelijke status en brontype. Waar passend zijn de Natura 2000-codes MT01–MT07 en activiteitcodes A–G gebruikt; lokale aanvullingen hebben een eigen code. Een subsidie-openstelling, ontwerpplan of actuele werkzaamhedenpagina wordt niet als uitvoering behandeld zolang de feitelijke uitvoering niet is bevestigd.</w:t>
+      </w:r>
+    </w:p>
+    <w:p>
+      <w:pPr>
+        <w:pStyle w:val="BodyText"/>
+      </w:pPr>
+      <w:r>
+        <w:t xml:space="preserve">De 144 bestaande regels in</w:t>
+      </w:r>
+      <w:r>
+        <w:t xml:space="preserve"> </w:t>
+      </w:r>
+      <w:r>
+        <w:rPr>
+          <w:rStyle w:val="VerbatimChar"/>
+        </w:rPr>
+        <w:t xml:space="preserve">plot_jaar_maatregel</w:t>
+      </w:r>
+      <w:r>
+        <w:t xml:space="preserve"> </w:t>
+      </w:r>
+      <w:r>
+        <w:t xml:space="preserve">blijven de historische dashboardlaag voor begrazing in 16 plots uit 1991–1999. Hun aantal en checksum</w:t>
+      </w:r>
+      <w:r>
+        <w:t xml:space="preserve"> </w:t>
+      </w:r>
+      <w:r>
+        <w:rPr>
+          <w:rStyle w:val="VerbatimChar"/>
+        </w:rPr>
+        <w:t xml:space="preserve">306480715648</w:t>
+      </w:r>
+      <w:r>
+        <w:t xml:space="preserve"> </w:t>
+      </w:r>
+      <w:r>
+        <w:t xml:space="preserve">zijn bij de actualisering tot en met 15 oktober 2026 gelijk gebleven. Zij worden niet achteraf als bronvaste projectuitvoering geïnterpreteerd. Nieuwe werkzaamheden gaan pas naar een plot-jaarselectie nadat locatie, jaar en bron voldoende precies zijn vastgesteld.</w:t>
+      </w:r>
+    </w:p>
+    <w:p>
+      <w:pPr>
+        <w:pStyle w:val="BodyText"/>
+      </w:pPr>
+      <w:r>
+        <w:t xml:space="preserve">De gebiedsindeling gebruikt de 55 geldige SOVON-kavelpolygonen uit plotversie 2025, in EPSG:28992. Daaruit zijn vijf geometrieën voor Buitenduin Noord, Buitenduin Zuid, Kijfhoek en Bierlap, Vallei Meijendel en Zuid-oosthoek en drie geometrieën voor Haagsche Golfclub, Voorlinden en Hertenkamp afgeleid. Interne overlap van telplots wordt bij de topologische samenvoeging niet dubbel als gebiedsoppervlak geteld. De 14 historische plots zijn inhoudelijk ingedeeld, maar hebben in plotversie 2025 geen afzonderlijke historische geometrie en worden daarom niet als geometriebron gebruikt.</w:t>
+      </w:r>
+    </w:p>
+    <w:p>
+      <w:pPr>
+        <w:pStyle w:val="BodyText"/>
+      </w:pPr>
+      <w:r>
+        <w:t xml:space="preserve">De actuele aantallen bronplots per geometrie zijn respectievelijk 9, 7, 16, 9 en 11 voor de vijf Meijendel-deelgebieden en 1 voor ieder speciaal gebied. De indeling normaliseert de aangeleverde aanduiding M54q naar het bestaande plot M54a. Historisch M17 volgt M17a en ligt in Buitenduin Noord; M8/11, M8/9, M9 en M11 liggen in Kijfhoek en Bierlap.</w:t>
+      </w:r>
+    </w:p>
+    <w:p>
+      <w:pPr>
+        <w:pStyle w:val="Heading2"/>
+      </w:pPr>
+      <w:bookmarkStart w:id="23" w:name="_1658618e44232e196644eac3525cdf2369e59da"/>
+      <w:r>
+        <w:t xml:space="preserve">Nameninventaris en plotgeometrie</w:t>
+      </w:r>
+      <w:bookmarkEnd w:id="23"/>
+    </w:p>
+    <w:p>
+      <w:pPr>
+        <w:pStyle w:val="FirstParagraph"/>
+      </w:pPr>
+      <w:r>
+        <w:t xml:space="preserve">Versie</w:t>
+      </w:r>
+      <w:r>
+        <w:t xml:space="preserve"> </w:t>
+      </w:r>
+      <w:r>
+        <w:rPr>
+          <w:rStyle w:val="VerbatimChar"/>
+        </w:rPr>
+        <w:t xml:space="preserve">meijendel_nameninventaris_2026-10-14</w:t>
+      </w:r>
+      <w:r>
+        <w:t xml:space="preserve"> </w:t>
+      </w:r>
+      <w:r>
+        <w:t xml:space="preserve">is op 14 oktober 2026 in de levende lokale database opgenomen. De korrel is één naamobject, één bronvermelding of één brongeometrie; naamgeometrie bewijst niet automatisch de exacte grens van een uitgevoerde maatregel.</w:t>
+      </w:r>
+    </w:p>
+    <w:tbl>
+      <w:tblPr>
+        <w:tblStyle w:val="Table"/>
+        <w:tblW w:type="pct" w:w="5000"/>
+        <w:tblLayout w:type="fixed"/>
+        <w:tblLook w:firstRow="1" w:lastRow="0" w:firstColumn="0" w:lastColumn="0" w:noHBand="0" w:noVBand="0" w:val="0020"/>
+      </w:tblPr>
+      <w:tblGrid>
+        <w:gridCol w:w="2376"/>
+        <w:gridCol w:w="3168"/>
+        <w:gridCol w:w="2376"/>
+      </w:tblGrid>
+      <w:tr>
+        <w:trPr>
+          <w:tblHeader w:val="on"/>
+        </w:trPr>
+        <w:tc>
+          <w:tcPr/>
+          <w:p>
+            <w:pPr>
+              <w:pStyle w:val="Compact"/>
+            </w:pPr>
+            <w:r>
+              <w:t xml:space="preserve">Tabel of view</w:t>
+            </w:r>
+          </w:p>
+        </w:tc>
+        <w:tc>
+          <w:tcPr/>
+          <w:p>
+            <w:pPr>
+              <w:pStyle w:val="Compact"/>
+              <w:jc w:val="right"/>
+            </w:pPr>
+            <w:r>
+              <w:t xml:space="preserve">Records</w:t>
+            </w:r>
+          </w:p>
+        </w:tc>
+        <w:tc>
+          <w:tcPr/>
+          <w:p>
+            <w:pPr>
+              <w:pStyle w:val="Compact"/>
+            </w:pPr>
+            <w:r>
+              <w:t xml:space="preserve">Betekenis</w:t>
+            </w:r>
+          </w:p>
+        </w:tc>
+      </w:tr>
+      <w:tr>
+        <w:tc>
+          <w:tcPr/>
+          <w:p>
+            <w:pPr>
+              <w:pStyle w:val="Compact"/>
+            </w:pPr>
+            <w:r>
+              <w:rPr>
+                <w:rStyle w:val="VerbatimChar"/>
+              </w:rPr>
+              <w:t xml:space="preserve">nameninventaris_import</w:t>
+            </w:r>
+          </w:p>
+        </w:tc>
+        <w:tc>
+          <w:tcPr/>
+          <w:p>
+            <w:pPr>
+              <w:pStyle w:val="Compact"/>
+              <w:jc w:val="right"/>
+            </w:pPr>
+            <w:r>
+              <w:t xml:space="preserve">1</w:t>
+            </w:r>
+          </w:p>
+        </w:tc>
+        <w:tc>
+          <w:tcPr/>
+          <w:p>
+            <w:pPr>
+              <w:pStyle w:val="Compact"/>
+            </w:pPr>
+            <w:r>
+              <w:t xml:space="preserve">Herkomst, hash, regelversie en verwachte aantallen van de levering.</w:t>
+            </w:r>
+          </w:p>
+        </w:tc>
+      </w:tr>
+      <w:tr>
+        <w:tc>
+          <w:tcPr/>
+          <w:p>
+            <w:pPr>
+              <w:pStyle w:val="Compact"/>
+            </w:pPr>
+            <w:r>
+              <w:rPr>
+                <w:rStyle w:val="VerbatimChar"/>
+              </w:rPr>
+              <w:t xml:space="preserve">nameninventaris_bron</w:t>
+            </w:r>
+          </w:p>
+        </w:tc>
+        <w:tc>
+          <w:tcPr/>
+          <w:p>
+            <w:pPr>
+              <w:pStyle w:val="Compact"/>
+              <w:jc w:val="right"/>
+            </w:pPr>
+            <w:r>
+              <w:t xml:space="preserve">8</w:t>
+            </w:r>
+          </w:p>
+        </w:tc>
+        <w:tc>
+          <w:tcPr/>
+          <w:p>
+            <w:pPr>
+              <w:pStyle w:val="Compact"/>
+            </w:pPr>
+            <w:r>
+              <w:t xml:space="preserve">Beekman 2021, twee historische artikelen, Neefjes 2010, TOP10NL, OSM en twee Dunea-bronnen.</w:t>
+            </w:r>
+          </w:p>
+        </w:tc>
+      </w:tr>
+      <w:tr>
+        <w:tc>
+          <w:tcPr/>
+          <w:p>
+            <w:pPr>
+              <w:pStyle w:val="Compact"/>
+            </w:pPr>
+            <w:r>
+              <w:rPr>
+                <w:rStyle w:val="VerbatimChar"/>
+              </w:rPr>
+              <w:t xml:space="preserve">nameninventaris_object</w:t>
+            </w:r>
+          </w:p>
+        </w:tc>
+        <w:tc>
+          <w:tcPr/>
+          <w:p>
+            <w:pPr>
+              <w:pStyle w:val="Compact"/>
+              <w:jc w:val="right"/>
+            </w:pPr>
+            <w:r>
+              <w:t xml:space="preserve">182</w:t>
+            </w:r>
+          </w:p>
+        </w:tc>
+        <w:tc>
+          <w:tcPr/>
+          <w:p>
+            <w:pPr>
+              <w:pStyle w:val="Compact"/>
+            </w:pPr>
+            <w:r>
+              <w:t xml:space="preserve">Onderscheiden gebieds-, functionele, pad-, weg- en routeobjecten.</w:t>
+            </w:r>
+          </w:p>
+        </w:tc>
+      </w:tr>
+      <w:tr>
+        <w:tc>
+          <w:tcPr/>
+          <w:p>
+            <w:pPr>
+              <w:pStyle w:val="Compact"/>
+            </w:pPr>
+            <w:r>
+              <w:rPr>
+                <w:rStyle w:val="VerbatimChar"/>
+              </w:rPr>
+              <w:t xml:space="preserve">nameninventaris_vermelding</w:t>
+            </w:r>
+          </w:p>
+        </w:tc>
+        <w:tc>
+          <w:tcPr/>
+          <w:p>
+            <w:pPr>
+              <w:pStyle w:val="Compact"/>
+              <w:jc w:val="right"/>
+            </w:pPr>
+            <w:r>
+              <w:t xml:space="preserve">299</w:t>
+            </w:r>
+          </w:p>
+        </w:tc>
+        <w:tc>
+          <w:tcPr/>
+          <w:p>
+            <w:pPr>
+              <w:pStyle w:val="Compact"/>
+            </w:pPr>
+            <w:r>
+              <w:t xml:space="preserve">Gedateerde naamvermeldingen uit 1602–2026.</w:t>
+            </w:r>
+          </w:p>
+        </w:tc>
+      </w:tr>
+      <w:tr>
+        <w:tc>
+          <w:tcPr/>
+          <w:p>
+            <w:pPr>
+              <w:pStyle w:val="Compact"/>
+            </w:pPr>
+            <w:r>
+              <w:rPr>
+                <w:rStyle w:val="VerbatimChar"/>
+              </w:rPr>
+              <w:t xml:space="preserve">nameninventaris_geometrie</w:t>
+            </w:r>
+          </w:p>
+        </w:tc>
+        <w:tc>
+          <w:tcPr/>
+          <w:p>
+            <w:pPr>
+              <w:pStyle w:val="Compact"/>
+              <w:jc w:val="right"/>
+            </w:pPr>
+            <w:r>
+              <w:t xml:space="preserve">71</w:t>
+            </w:r>
+          </w:p>
+        </w:tc>
+        <w:tc>
+          <w:tcPr/>
+          <w:p>
+            <w:pPr>
+              <w:pStyle w:val="Compact"/>
+            </w:pPr>
+            <w:r>
+              <w:t xml:space="preserve">Brongeometrieën in EPSG:28992 voor 71 objecten.</w:t>
+            </w:r>
+          </w:p>
+        </w:tc>
+      </w:tr>
+      <w:tr>
+        <w:tc>
+          <w:tcPr/>
+          <w:p>
+            <w:pPr>
+              <w:pStyle w:val="Compact"/>
+            </w:pPr>
+            <w:r>
+              <w:rPr>
+                <w:rStyle w:val="VerbatimChar"/>
+              </w:rPr>
+              <w:t xml:space="preserve">nameninventaris_geometrie_bronobject</w:t>
+            </w:r>
+          </w:p>
+        </w:tc>
+        <w:tc>
+          <w:tcPr/>
+          <w:p>
+            <w:pPr>
+              <w:pStyle w:val="Compact"/>
+              <w:jc w:val="right"/>
+            </w:pPr>
+            <w:r>
+              <w:t xml:space="preserve">107</w:t>
+            </w:r>
+          </w:p>
+        </w:tc>
+        <w:tc>
+          <w:tcPr/>
+          <w:p>
+            <w:pPr>
+              <w:pStyle w:val="Compact"/>
+            </w:pPr>
+            <w:r>
+              <w:t xml:space="preserve">Herleidbaarheid van samengevoegde geometrieën naar afzonderlijke bronobjecten.</w:t>
+            </w:r>
+          </w:p>
+        </w:tc>
+      </w:tr>
+      <w:tr>
+        <w:tc>
+          <w:tcPr/>
+          <w:p>
+            <w:pPr>
+              <w:pStyle w:val="Compact"/>
+            </w:pPr>
+            <w:r>
+              <w:rPr>
+                <w:rStyle w:val="VerbatimChar"/>
+              </w:rPr>
+              <w:t xml:space="preserve">nameninventaris_beoordeling</w:t>
+            </w:r>
+          </w:p>
+        </w:tc>
+        <w:tc>
+          <w:tcPr/>
+          <w:p>
+            <w:pPr>
+              <w:pStyle w:val="Compact"/>
+              <w:jc w:val="right"/>
+            </w:pPr>
+            <w:r>
+              <w:t xml:space="preserve">111</w:t>
+            </w:r>
+          </w:p>
+        </w:tc>
+        <w:tc>
+          <w:tcPr/>
+          <w:p>
+            <w:pPr>
+              <w:pStyle w:val="Compact"/>
+            </w:pPr>
+            <w:r>
+              <w:t xml:space="preserve">Actuele, expliciete geometrieleemten; deze namen worden niet ruimtelijk afgeleid.</w:t>
+            </w:r>
+          </w:p>
+        </w:tc>
+      </w:tr>
+      <w:tr>
+        <w:tc>
+          <w:tcPr/>
+          <w:p>
+            <w:pPr>
+              <w:pStyle w:val="Compact"/>
+            </w:pPr>
+            <w:r>
+              <w:rPr>
+                <w:rStyle w:val="VerbatimChar"/>
+              </w:rPr>
+              <w:t xml:space="preserve">plot_geometrie_import</w:t>
+            </w:r>
+          </w:p>
+        </w:tc>
+        <w:tc>
+          <w:tcPr/>
+          <w:p>
+            <w:pPr>
+              <w:pStyle w:val="Compact"/>
+              <w:jc w:val="right"/>
+            </w:pPr>
+            <w:r>
+              <w:t xml:space="preserve">1</w:t>
+            </w:r>
+          </w:p>
+        </w:tc>
+        <w:tc>
+          <w:tcPr/>
+          <w:p>
+            <w:pPr>
+              <w:pStyle w:val="Compact"/>
+            </w:pPr>
+            <w:r>
+              <w:t xml:space="preserve">Actuele SOVON-kavelgeometrie van 55 plots, versie</w:t>
+            </w:r>
+            <w:r>
+              <w:t xml:space="preserve"> </w:t>
+            </w:r>
+            <w:r>
+              <w:rPr>
+                <w:rStyle w:val="VerbatimChar"/>
+              </w:rPr>
+              <w:t xml:space="preserve">sovon-avimap-2025-download-2026-10-02</w:t>
+            </w:r>
+            <w:r>
+              <w:t xml:space="preserve">.</w:t>
+            </w:r>
+          </w:p>
+        </w:tc>
+      </w:tr>
+      <w:tr>
+        <w:tc>
+          <w:tcPr/>
+          <w:p>
+            <w:pPr>
+              <w:pStyle w:val="Compact"/>
+            </w:pPr>
+            <w:r>
+              <w:rPr>
+                <w:rStyle w:val="VerbatimChar"/>
+              </w:rPr>
+              <w:t xml:space="preserve">nameninventaris_plot_koppeling</w:t>
+            </w:r>
+          </w:p>
+        </w:tc>
+        <w:tc>
+          <w:tcPr/>
+          <w:p>
+            <w:pPr>
+              <w:pStyle w:val="Compact"/>
+              <w:jc w:val="right"/>
+            </w:pPr>
+            <w:r>
+              <w:t xml:space="preserve">377</w:t>
+            </w:r>
+          </w:p>
+        </w:tc>
+        <w:tc>
+          <w:tcPr/>
+          <w:p>
+            <w:pPr>
+              <w:pStyle w:val="Compact"/>
+            </w:pPr>
+            <w:r>
+              <w:t xml:space="preserve">Alle geometrische doorsnijdingen tussen 66 naamobjecten en 55 actuele kavels.</w:t>
+            </w:r>
+          </w:p>
+        </w:tc>
+      </w:tr>
+      <w:tr>
+        <w:tc>
+          <w:tcPr/>
+          <w:p>
+            <w:pPr>
+              <w:pStyle w:val="Compact"/>
+            </w:pPr>
+            <w:r>
+              <w:rPr>
+                <w:rStyle w:val="VerbatimChar"/>
+              </w:rPr>
+              <w:t xml:space="preserve">v_nameninventaris_plot_actueel</w:t>
+            </w:r>
+          </w:p>
+        </w:tc>
+        <w:tc>
+          <w:tcPr/>
+          <w:p>
+            <w:pPr>
+              <w:pStyle w:val="Compact"/>
+              <w:jc w:val="right"/>
+            </w:pPr>
+            <w:r>
+              <w:t xml:space="preserve">365</w:t>
+            </w:r>
+          </w:p>
+        </w:tc>
+        <w:tc>
+          <w:tcPr/>
+          <w:p>
+            <w:pPr>
+              <w:pStyle w:val="Compact"/>
+            </w:pPr>
+            <w:r>
+              <w:t xml:space="preserve">Actuele leeslaag voor 53 kavels binnen</w:t>
+            </w:r>
+            <w:r>
+              <w:t xml:space="preserve"> </w:t>
+            </w:r>
+            <w:r>
+              <w:rPr>
+                <w:rStyle w:val="VerbatimChar"/>
+              </w:rPr>
+              <w:t xml:space="preserve">meijendel_natura2000</w:t>
+            </w:r>
+            <w:r>
+              <w:t xml:space="preserve">; M66 en M91 zijn uitgesloten.</w:t>
+            </w:r>
+          </w:p>
+        </w:tc>
+      </w:tr>
+    </w:tbl>
+    <w:p>
+      <w:pPr>
+        <w:pStyle w:val="FirstParagraph"/>
+      </w:pPr>
+      <w:r>
+        <w:t xml:space="preserve">De maatregelactualisering gebruikt deze laag alleen wanneer de maatregellocatie volledig en letterlijk overeenkomt met één of meer geometriseerde naamobjecten. Daarmee zijn 32 relaties voor zes uitvoeringen toegevoegd. Uitvoeringen met een brede locatie, een niet-geometriseerde naam, een gedeeltelijk geometriseerde samengestelde locatie of een afwijkende naam blijven buiten de automatische koppeling.</w:t>
+      </w:r>
+    </w:p>
+    <w:p>
+      <w:pPr>
+        <w:pStyle w:val="Heading2"/>
+      </w:pPr>
+      <w:bookmarkStart w:id="24" w:name="_c4d8e63f8d951db14c31b0e8e0c5017e65b09fe"/>
+      <w:r>
+        <w:t xml:space="preserve">Website dashboard en Shiny beschermen</w:t>
+      </w:r>
+      <w:bookmarkEnd w:id="24"/>
+    </w:p>
+    <w:p>
+      <w:pPr>
+        <w:pStyle w:val="FirstParagraph"/>
+      </w:pPr>
+      <w:r>
+        <w:t xml:space="preserve">De eerdere inventarisatie vond geen rechtstreeks gebruik van de 146</w:t>
+      </w:r>
+      <w:r>
+        <w:t xml:space="preserve"> </w:t>
+      </w:r>
+      <w:r>
+        <w:rPr>
+          <w:rStyle w:val="VerbatimChar"/>
+        </w:rPr>
+        <w:t xml:space="preserve">ndff_*</w:t>
+      </w:r>
+      <w:r>
+        <w:t xml:space="preserve">-, vier</w:t>
+      </w:r>
+      <w:r>
+        <w:t xml:space="preserve"> </w:t>
+      </w:r>
+      <w:r>
+        <w:rPr>
+          <w:rStyle w:val="VerbatimChar"/>
+        </w:rPr>
+        <w:t xml:space="preserve">externe_ecologie_*</w:t>
+      </w:r>
+      <w:r>
+        <w:t xml:space="preserve">- en zes</w:t>
+      </w:r>
+      <w:r>
+        <w:t xml:space="preserve"> </w:t>
+      </w:r>
+      <w:r>
+        <w:rPr>
+          <w:rStyle w:val="VerbatimChar"/>
+        </w:rPr>
+        <w:t xml:space="preserve">vangblik*</w:t>
+      </w:r>
+      <w:r>
+        <w:t xml:space="preserve">-tabellen in de publieke website, reguliere Shiny-cache of openbare dashboardketen. Dat geeft ruimte, maar betekent niet dat die 156 tabellen losstaan. Imports, audits, ruimtelijke verwerking, bestaande views en exportvalidatie gebruiken ze wel. Voor deze herschrijving zijn de relevante cache- en exportcontracten opnieuw gecontroleerd; er is geen productieproef uitgevoerd.</w:t>
+      </w:r>
+    </w:p>
+    <w:p>
+      <w:pPr>
+        <w:pStyle w:val="BodyText"/>
+      </w:pPr>
+      <w:r>
+        <w:t xml:space="preserve">PQ is wel aangesloten. Shiny leest</w:t>
+      </w:r>
+      <w:r>
+        <w:t xml:space="preserve"> </w:t>
+      </w:r>
+      <w:r>
+        <w:rPr>
+          <w:rStyle w:val="VerbatimChar"/>
+        </w:rPr>
+        <w:t xml:space="preserve">pq_plot_jaar_vegetatie</w:t>
+      </w:r>
+      <w:r>
+        <w:t xml:space="preserve"> </w:t>
+      </w:r>
+      <w:r>
+        <w:t xml:space="preserve">en gebruikt soortenrijkdom, bedekkingssom en Shannon in model- en omgevingsgegevens. De website leest de bestaande</w:t>
+      </w:r>
+      <w:r>
+        <w:t xml:space="preserve"> </w:t>
+      </w:r>
+      <w:r>
+        <w:rPr>
+          <w:rStyle w:val="VerbatimChar"/>
+        </w:rPr>
+        <w:t xml:space="preserve">website_plot_vegetatie_jaar</w:t>
+      </w:r>
+      <w:r>
+        <w:t xml:space="preserve">, die naar dezelfde PQ-afleiding verwijst. Foutafhandeling kan een leeg vegetatieonderdeel opleveren terwijl de pagina gewoon opent. Vergelijk daarom de 513 plot-jaarregels uit 1981–2025, waarden, ontbrekende waarden en bronvermelding vóór en na de structurele migratie.</w:t>
+      </w:r>
+    </w:p>
+    <w:p>
+      <w:pPr>
+        <w:pStyle w:val="BodyText"/>
+      </w:pPr>
+      <w:r>
+        <w:t xml:space="preserve">Nieuwe PQ-opnamen mogen bij een afzonderlijk inhoudelijk besluit later doorwerken in de toepassingen. Het toevoegen van bronnen mag echter niet ongemerkt de provinciale controlebasis of bestaande vogelmodellen veranderen. Scheid structureel verplaatsen met gelijke uitkomsten van inhoudelijk verrijken met expliciet beoordeelde nieuwe uitkomsten.</w:t>
+      </w:r>
+    </w:p>
+    <w:p>
+      <w:pPr>
+        <w:pStyle w:val="BodyText"/>
+      </w:pPr>
+      <w:r>
+        <w:t xml:space="preserve">Verder moeten deze afhankelijkheden mee:</w:t>
+      </w:r>
+    </w:p>
+    <w:p>
+      <w:pPr>
+        <w:pStyle w:val="Compact"/>
+        <w:numPr>
+          <w:ilvl w:val="0"/>
+          <w:numId w:val="1002"/>
+        </w:numPr>
+      </w:pPr>
+      <w:r>
+        <w:t xml:space="preserve">foreign keys, indexes, rechten en eventuele routines of triggers;</w:t>
+      </w:r>
+    </w:p>
+    <w:p>
+      <w:pPr>
+        <w:pStyle w:val="Compact"/>
+        <w:numPr>
+          <w:ilvl w:val="0"/>
+          <w:numId w:val="1002"/>
+        </w:numPr>
+      </w:pPr>
+      <w:r>
+        <w:t xml:space="preserve">bestaande views en beveiligde onderzoeksviews die naar openbare NDFF-tabellen verwijzen, met behoud van de beveiligingsgrens;</w:t>
+      </w:r>
+    </w:p>
+    <w:p>
+      <w:pPr>
+        <w:pStyle w:val="Compact"/>
+        <w:numPr>
+          <w:ilvl w:val="0"/>
+          <w:numId w:val="1002"/>
+        </w:numPr>
+      </w:pPr>
+      <w:r>
+        <w:t xml:space="preserve">dynamische tabelnamen in imports en audits, naast letterlijk geschreven namen;</w:t>
+      </w:r>
+    </w:p>
+    <w:p>
+      <w:pPr>
+        <w:pStyle w:val="Compact"/>
+        <w:numPr>
+          <w:ilvl w:val="0"/>
+          <w:numId w:val="1002"/>
+        </w:numPr>
+      </w:pPr>
+      <w:r>
+        <w:t xml:space="preserve">tabelnamen die als gegevens zijn opgeslagen, waaronder</w:t>
+      </w:r>
+      <w:r>
+        <w:t xml:space="preserve"> </w:t>
+      </w:r>
+      <w:r>
+        <w:rPr>
+          <w:rStyle w:val="VerbatimChar"/>
+        </w:rPr>
+        <w:t xml:space="preserve">analyse_datareeks.bron_object</w:t>
+      </w:r>
+      <w:r>
+        <w:t xml:space="preserve"> </w:t>
+      </w:r>
+      <w:r>
+        <w:t xml:space="preserve">en ruimtelijke bronverwijzingen;</w:t>
+      </w:r>
+    </w:p>
+    <w:p>
+      <w:pPr>
+        <w:pStyle w:val="Compact"/>
+        <w:numPr>
+          <w:ilvl w:val="0"/>
+          <w:numId w:val="1002"/>
+        </w:numPr>
+      </w:pPr>
+      <w:r>
+        <w:t xml:space="preserve">de exportcontrole die nu expliciet</w:t>
+      </w:r>
+      <w:r>
+        <w:t xml:space="preserve"> </w:t>
+      </w:r>
+      <w:r>
+        <w:rPr>
+          <w:rStyle w:val="VerbatimChar"/>
+        </w:rPr>
+        <w:t xml:space="preserve">ndff_open_waarneming</w:t>
+      </w:r>
+      <w:r>
+        <w:t xml:space="preserve"> </w:t>
+      </w:r>
+      <w:r>
+        <w:t xml:space="preserve">verlangt, plus de dump- en Shiny-cachecontracten.</w:t>
+      </w:r>
+    </w:p>
+    <w:p>
+      <w:pPr>
+        <w:pStyle w:val="FirstParagraph"/>
+      </w:pPr>
+      <w:r>
+        <w:t xml:space="preserve">Bronbestanden, bron-ID’s, hashes en historische regelversies worden niet cosmetisch herschreven. Er komen geen nieuwe overzichts- of compatibiliteitsviews. Bestaande noodzakelijke views moeten bij een daadwerkelijke migratie correct blijven verwijzen.</w:t>
+      </w:r>
+    </w:p>
+    <w:p>
+      <w:pPr>
+        <w:pStyle w:val="Heading2"/>
+      </w:pPr>
+      <w:bookmarkStart w:id="25" w:name="_ea82a111b7c3651db8ff74dc66ba0e01efd62c3"/>
+      <w:r>
+        <w:t xml:space="preserve">Veilige uitvoervolgorde</w:t>
+      </w:r>
+      <w:bookmarkEnd w:id="25"/>
+    </w:p>
+    <w:p>
+      <w:pPr>
+        <w:pStyle w:val="FirstParagraph"/>
+      </w:pPr>
+      <w:r>
+        <w:t xml:space="preserve">Eerst werken we één volledige familie uit op een geïsoleerde databasekopie. Libellen is daarvoor geschikt: 32.325 bronwaarnemingen uit 1950–2025, plus de bestaande route-, geometrie-, bezoek- en taxonbereikstructuur. De proef omvat meer dan vier namen veranderen. Zij moet bewijzen dat de groepsfamilie ook een tweede bron kan ontvangen zonder dubbele metingen, verlies van herkomst of wijziging van nulbetekenis. Een technische testlevering wordt als test gemarkeerd en wordt geen nieuwe ecologische bron.</w:t>
+      </w:r>
+    </w:p>
+    <w:p>
+      <w:pPr>
+        <w:pStyle w:val="BodyText"/>
+      </w:pPr>
+      <w:r>
+        <w:t xml:space="preserve">Daarna volgt de PQ-uitwerking: brongebonden locatie- en opname-identiteit toevoegen en een afgebakende, reeds gekoppelde LVD-selectie vergelijken met de provinciale reeks. Begin met bevestigde overeenkomsten; behandel waarschijnlijke koppelingen afzonderlijk. Voor iedere kandidaat staat vast of deze verrijkt, toevoegt, dubbel is of conflicteert. De eerste acceptatie-eis is behoud van de bestaande 513 plot-jaaruitkomsten uit 1981–2025.</w:t>
+      </w:r>
+    </w:p>
+    <w:p>
+      <w:pPr>
+        <w:pStyle w:val="BodyText"/>
+      </w:pPr>
+      <w:r>
+        <w:t xml:space="preserve">Vervolgens volgen de overige soortenfamilies in samenhangende groepen. Kevers zijn een bruikbare tweede soortproef omdat NDFF, Naturalis en Vangblik daar samenkomen. Gemengde monsters en de algemene beslis- en bronlaag gaan pas over wanneer hun volledige verwijzingsketen is uitgewerkt.</w:t>
+      </w:r>
+    </w:p>
+    <w:p>
+      <w:pPr>
+        <w:pStyle w:val="BodyText"/>
+      </w:pPr>
+      <w:r>
+        <w:t xml:space="preserve">Iedere proef levert een concrete oude–nieuwe objectkaart, sleutelvertaling, importaanpassing en herstelprocedure op. Vergelijk volledige sleutelsets, aantallen, inhoudshashes, bronverwijzingen, nulstatussen en toegelaten selecties. Een verschil is verklaard of blokkeert de overgang. Controleer tevens herhaalde import: hetzelfde bestand mag geen extra metingen opleveren.</w:t>
+      </w:r>
+    </w:p>
+    <w:p>
+      <w:pPr>
+        <w:pStyle w:val="BodyText"/>
+      </w:pPr>
+      <w:r>
+        <w:t xml:space="preserve">Pas na goedkeuring volgt uitvoering in de levende lokale database, met gecontroleerde back-up en zonder gelijktijdige imports. Daarna volgt de normale gevalideerde dump-, cache- en releaseketen. Productie blijft afnemer van de lokale canonieke database. Herstel bestaat uit een geteste schema- en gegevensherstelroute met de bijpassende codeversie; een algemene transactie-rollback is onvoldoende voor DDL-wijzigingen.</w:t>
+      </w:r>
+    </w:p>
+    <w:p>
+      <w:pPr>
+        <w:pStyle w:val="BodyText"/>
+      </w:pPr>
+      <w:r>
+        <w:t xml:space="preserve">De aanbevolen eerstvolgende stap is een concreet libellenproefontwerp, inclusief fysieke tabellen en migratiecontroles. Geen brede live-hernoeming. PQ blijft een eigen, bronoverstijgende familie en wordt expliciet als volgende migratieproef uitgewerkt.</w:t>
+      </w:r>
+    </w:p>
+    <w:p>
+      <w:pPr>
+        <w:pStyle w:val="Heading2"/>
+      </w:pPr>
+      <w:bookmarkStart w:id="26" w:name="_b3cd443c91657a82ff5685c38edcf4074cc84d4"/>
+      <w:r>
+        <w:t xml:space="preserve">Onderbouwing en grenzen</w:t>
+      </w:r>
+      <w:bookmarkEnd w:id="26"/>
+    </w:p>
+    <w:p>
+      <w:pPr>
+        <w:pStyle w:val="FirstParagraph"/>
+      </w:pPr>
+      <w:r>
+        <w:t xml:space="preserve">Groepen, rijtellingen en bronverdelingen zijn read-only gecontroleerd in de levende lokale database op 26 september 2026. Van de 248 fysieke tabellen staan er 163 in de bijlage: 146 NDFF, vier externe ecologie, zes Vangblik en zeven PQ. Ook de niet-vogelgegevens in AVIMAP zijn onderzocht.</w:t>
+      </w:r>
+    </w:p>
+    <w:p>
+      <w:pPr>
+        <w:pStyle w:val="BodyText"/>
+      </w:pPr>
+      <w:r>
+        <w:t xml:space="preserve">De bijlage geeft bestemmingsrichtingen, geen uitvoerbare naamskaart. Rijtellingen stammen uit de nulmeting van dezelfde datum. Niet alle reconstructietabellen hebben een afzonderlijk gecontroleerde meetperiode; hun technische rijaantallen zijn geen zelfstandige meetreeks.</w:t>
+      </w:r>
+    </w:p>
+    <w:p>
+      <w:pPr>
+        <w:pStyle w:val="BodyText"/>
+      </w:pPr>
+      <w:r>
+        <w:t xml:space="preserve">Geraadpleegd zijn de projectinstructies, README, TODO, DECISIONS, architectuur, eerdere inventaris en</w:t>
+      </w:r>
+      <w:r>
+        <w:t xml:space="preserve"> </w:t>
+      </w:r>
+      <w:r>
+        <w:rPr>
+          <w:rStyle w:val="VerbatimChar"/>
+        </w:rPr>
+        <w:t xml:space="preserve">docs/MEIJENDEL_BRONREGISTER.md</w:t>
+      </w:r>
+      <w:r>
+        <w:t xml:space="preserve">; de openbare NDFF-, protocolkwaliteit- en externe-ecologieschema’s; import- en overlapdefinities; Shiny</w:t>
+      </w:r>
+      <w:r>
+        <w:t xml:space="preserve"> </w:t>
+      </w:r>
+      <w:r>
+        <w:rPr>
+          <w:rStyle w:val="VerbatimChar"/>
+        </w:rPr>
+        <w:t xml:space="preserve">helpers.R</w:t>
+      </w:r>
+      <w:r>
+        <w:t xml:space="preserve">, cachecontracttest, exportvalidator en websitequery voor plotvegetatie.</w:t>
+      </w:r>
+    </w:p>
+    <w:p>
+      <w:pPr>
+        <w:pStyle w:val="BodyText"/>
+      </w:pPr>
+      <w:r>
+        <w:t xml:space="preserve">Bronrechten, toelating en bruikbaarheid zijn niet opnieuw vastgesteld; het bronregister blijft leidend. Geen T7- of NAS-bestanden geopend, nieuwe bronnen aangevraagd of database, dump, cache en productie gewijzigd.</w:t>
+      </w:r>
+    </w:p>
+    <w:p>
+      <w:pPr>
+        <w:pStyle w:val="Heading2"/>
+      </w:pPr>
+      <w:bookmarkStart w:id="27" w:name="_3a68ce2518fa2826494f15f4a6805cb1b04675a"/>
+      <w:r>
+        <w:t xml:space="preserve">Bijlage huidige tabellen en bestemmingsrichting</w:t>
+      </w:r>
+      <w:bookmarkEnd w:id="27"/>
+    </w:p>
+    <w:p>
+      <w:pPr>
+        <w:pStyle w:val="FirstParagraph"/>
+      </w:pPr>
+      <w:r>
+        <w:t xml:space="preserve">Alle 163 tabelnamen blijven hier terugvindbaar. De aantallen zijn technische rijtellingen van 26 september 2026, geen optelbare onafhankelijke waarnemingen. Een richting met meerdere bestemmingen vereist gegevensverdeling; zij is geen RENAME-opdracht. Definitieve doelnamen en sleutelvertalingen worden in de migratieproef getoetst.</w:t>
+      </w:r>
+    </w:p>
+    <w:p>
+      <w:pPr>
+        <w:pStyle w:val="Heading3"/>
+      </w:pPr>
+      <w:bookmarkStart w:id="28" w:name="_soortgroepindexen"/>
+      <w:r>
+        <w:t xml:space="preserve">Soortgroepindexen</w:t>
+      </w:r>
+      <w:bookmarkEnd w:id="28"/>
+    </w:p>
+    <w:p>
+      <w:pPr>
+        <w:pStyle w:val="FirstParagraph"/>
+      </w:pPr>
+      <w:r>
+        <w:t xml:space="preserve">Voor elk van deze 26 indexen geldt: de bestemming wordt een volwaardige bronoverstijgende familie. Alleen de huidige enkelkolomsindex hernoemen is niet het eindbeeld.</w:t>
       </w:r>
     </w:p>
     <w:tbl>
@@ -3115,2074 +5188,6 @@
               <w:pStyle w:val="Compact"/>
             </w:pPr>
             <w:r>
-              <w:t xml:space="preserve">Onderdeel</w:t>
-            </w:r>
-          </w:p>
-        </w:tc>
-        <w:tc>
-          <w:tcPr/>
-          <w:p>
-            <w:pPr>
-              <w:pStyle w:val="Compact"/>
-            </w:pPr>
-            <w:r>
-              <w:t xml:space="preserve">Zwaarte</w:t>
-            </w:r>
-          </w:p>
-        </w:tc>
-        <w:tc>
-          <w:tcPr/>
-          <w:p>
-            <w:pPr>
-              <w:pStyle w:val="Compact"/>
-            </w:pPr>
-            <w:r>
-              <w:t xml:space="preserve">Wat het vergt</w:t>
-            </w:r>
-          </w:p>
-        </w:tc>
-      </w:tr>
-      <w:tr>
-        <w:tc>
-          <w:tcPr/>
-          <w:p>
-            <w:pPr>
-              <w:pStyle w:val="Compact"/>
-            </w:pPr>
-            <w:r>
-              <w:t xml:space="preserve">Een afgebakende meetfamilie hernoemen</w:t>
-            </w:r>
-          </w:p>
-        </w:tc>
-        <w:tc>
-          <w:tcPr/>
-          <w:p>
-            <w:pPr>
-              <w:pStyle w:val="Compact"/>
-            </w:pPr>
-            <w:r>
-              <w:t xml:space="preserve">Beperkt tot middelgroot</w:t>
-            </w:r>
-          </w:p>
-        </w:tc>
-        <w:tc>
-          <w:tcPr/>
-          <w:p>
-            <w:pPr>
-              <w:pStyle w:val="Compact"/>
-            </w:pPr>
-            <w:r>
-              <w:t xml:space="preserve">Schema, verwijzingen, import en tests samen aanpassen. De vier huidige</w:t>
-            </w:r>
-            <w:r>
-              <w:t xml:space="preserve"> </w:t>
-            </w:r>
-            <w:r>
-              <w:rPr>
-                <w:rStyle w:val="VerbatimChar"/>
-              </w:rPr>
-              <w:t xml:space="preserve">ndff_libel_*</w:t>
-            </w:r>
-            <w:r>
-              <w:t xml:space="preserve">-tabellen zijn een afgebakend voorbeeld.</w:t>
-            </w:r>
-          </w:p>
-        </w:tc>
-      </w:tr>
-      <w:tr>
-        <w:tc>
-          <w:tcPr/>
-          <w:p>
-            <w:pPr>
-              <w:pStyle w:val="Compact"/>
-            </w:pPr>
-            <w:r>
-              <w:t xml:space="preserve">NDFF-waarnemingen naar echte groepsfamilies verdelen</w:t>
-            </w:r>
-          </w:p>
-        </w:tc>
-        <w:tc>
-          <w:tcPr/>
-          <w:p>
-            <w:pPr>
-              <w:pStyle w:val="Compact"/>
-            </w:pPr>
-            <w:r>
-              <w:t xml:space="preserve">Groot</w:t>
-            </w:r>
-          </w:p>
-        </w:tc>
-        <w:tc>
-          <w:tcPr/>
-          <w:p>
-            <w:pPr>
-              <w:pStyle w:val="Compact"/>
-            </w:pPr>
-            <w:r>
-              <w:t xml:space="preserve">Stabiele ID's, ruimtelijke beoordeling, protocollen, analysebesluiten en de 233 dubbele lidmaatschappen correct meenemen.</w:t>
-            </w:r>
-          </w:p>
-        </w:tc>
-      </w:tr>
-      <w:tr>
-        <w:tc>
-          <w:tcPr/>
-          <w:p>
-            <w:pPr>
-              <w:pStyle w:val="Compact"/>
-            </w:pPr>
-            <w:r>
-              <w:t xml:space="preserve">De zes externe datasets aansluiten</w:t>
-            </w:r>
-          </w:p>
-        </w:tc>
-        <w:tc>
-          <w:tcPr/>
-          <w:p>
-            <w:pPr>
-              <w:pStyle w:val="Compact"/>
-            </w:pPr>
-            <w:r>
-              <w:t xml:space="preserve">Middelgroot tot groot</w:t>
-            </w:r>
-          </w:p>
-        </w:tc>
-        <w:tc>
-          <w:tcPr/>
-          <w:p>
-            <w:pPr>
-              <w:pStyle w:val="Compact"/>
-            </w:pPr>
-            <w:r>
-              <w:t xml:space="preserve">98.916 resultaten uit 1875–2025 per taxon en meetvorm toewijzen. Coleoptera is eenvoudiger af te bakenen dan STOWA.</w:t>
-            </w:r>
-          </w:p>
-        </w:tc>
-      </w:tr>
-      <w:tr>
-        <w:tc>
-          <w:tcPr/>
-          <w:p>
-            <w:pPr>
-              <w:pStyle w:val="Compact"/>
-            </w:pPr>
-            <w:r>
-              <w:t xml:space="preserve">Vangblik vanuit soortgroepen bereikbaar maken</w:t>
-            </w:r>
-          </w:p>
-        </w:tc>
-        <w:tc>
-          <w:tcPr/>
-          <w:p>
-            <w:pPr>
-              <w:pStyle w:val="Compact"/>
-            </w:pPr>
-            <w:r>
-              <w:t xml:space="preserve">Middelgroot</w:t>
-            </w:r>
-          </w:p>
-        </w:tc>
-        <w:tc>
-          <w:tcPr/>
-          <w:p>
-            <w:pPr>
-              <w:pStyle w:val="Compact"/>
-            </w:pPr>
-            <w:r>
-              <w:t xml:space="preserve">Taxonkoppelingen en gecontroleerde verwijzingen voor 60.560 resultaten uit 1953–1960, zonder dubbele telling.</w:t>
-            </w:r>
-          </w:p>
-        </w:tc>
-      </w:tr>
-      <w:tr>
-        <w:tc>
-          <w:tcPr/>
-          <w:p>
-            <w:pPr>
-              <w:pStyle w:val="Compact"/>
-            </w:pPr>
-            <w:r>
-              <w:t xml:space="preserve">Verspreide PQ-informatie samenbrengen</w:t>
-            </w:r>
-          </w:p>
-        </w:tc>
-        <w:tc>
-          <w:tcPr/>
-          <w:p>
-            <w:pPr>
-              <w:pStyle w:val="Compact"/>
-            </w:pPr>
-            <w:r>
-              <w:t xml:space="preserve">Groot</w:t>
-            </w:r>
-          </w:p>
-        </w:tc>
-        <w:tc>
-          <w:tcPr/>
-          <w:p>
-            <w:pPr>
-              <w:pStyle w:val="Compact"/>
-            </w:pPr>
-            <w:r>
-              <w:t xml:space="preserve">Bronsleutels, opnamen, lagen, bedekkingsschalen en overlap vergelijken. Bovendien leest Shiny de huidige PQ-afleiding al.</w:t>
-            </w:r>
-          </w:p>
-        </w:tc>
-      </w:tr>
-      <w:tr>
-        <w:tc>
-          <w:tcPr/>
-          <w:p>
-            <w:pPr>
-              <w:pStyle w:val="Compact"/>
-            </w:pPr>
-            <w:r>
-              <w:t xml:space="preserve">Vogels en bestaande toepassingen beschermen</w:t>
-            </w:r>
-          </w:p>
-        </w:tc>
-        <w:tc>
-          <w:tcPr/>
-          <w:p>
-            <w:pPr>
-              <w:pStyle w:val="Compact"/>
-            </w:pPr>
-            <w:r>
-              <w:t xml:space="preserve">Harde voorwaarde</w:t>
-            </w:r>
-          </w:p>
-        </w:tc>
-        <w:tc>
-          <w:tcPr/>
-          <w:p>
-            <w:pPr>
-              <w:pStyle w:val="Compact"/>
-            </w:pPr>
-            <w:r>
-              <w:t xml:space="preserve">Vogel-ID's, tabellen, berekeningen en scherminhoud gelijk houden; niet alleen controleren of een pagina opent.</w:t>
-            </w:r>
-          </w:p>
-        </w:tc>
-      </w:tr>
-    </w:tbl>
-    <w:p>
-      <w:pPr>
-        <w:pStyle w:val="FirstParagraph"/>
-      </w:pPr>
-      <w:r>
-        <w:t xml:space="preserve">Een betrouwbare urenraming volgt pas uit een proef op een databasekopie. Het aantal nieuwe tabellen staat evenmin vast: sommige structuren worden hernoemd, andere verdeeld, en gedeelde ondersteuning blijft bijeen. De oude rekensom van 149 hernoemingen en veertien behouden namen geldt dus niet meer.</w:t>
-      </w:r>
-    </w:p>
-    <w:p>
-      <w:pPr>
-        <w:pStyle w:val="BodyText"/>
-      </w:pPr>
-      <w:r>
-        <w:t xml:space="preserve">Taxonvertaling is noodzakelijk.</w:t>
-      </w:r>
-      <w:r>
-        <w:t xml:space="preserve"> </w:t>
-      </w:r>
-      <w:r>
-        <w:rPr>
-          <w:rStyle w:val="VerbatimChar"/>
-        </w:rPr>
-        <w:t xml:space="preserve">ndff_soorten</w:t>
-      </w:r>
-      <w:r>
-        <w:t xml:space="preserve"> </w:t>
-      </w:r>
-      <w:r>
-        <w:t xml:space="preserve">heeft 9.828 bronreferenties, Vangblik 275 bij de reeks 1953–1960, PQ 714 bij 1981–2025 en AVIMAP 35 bij 2009–2026. Externe ecologie heeft 2.894 verschillende opgeslagen wetenschappelijke naamwaarden bij de 98.916 resultaten uit 1875–2025, zonder gemeenschappelijke taxon-foreign-key. Behoud bronnamen, rang en versie en leg gecontroleerde overeenkomsten naast de bronidentiteit vast. De vogelgerichte tabel</w:t>
-      </w:r>
-      <w:r>
-        <w:t xml:space="preserve"> </w:t>
-      </w:r>
-      <w:r>
-        <w:rPr>
-          <w:rStyle w:val="VerbatimChar"/>
-        </w:rPr>
-        <w:t xml:space="preserve">soorten</w:t>
-      </w:r>
-      <w:r>
-        <w:t xml:space="preserve"> </w:t>
-      </w:r>
-      <w:r>
-        <w:t xml:space="preserve">blijft onaangetast.</w:t>
-      </w:r>
-    </w:p>
-    <w:p>
-      <w:pPr>
-        <w:pStyle w:val="Heading2"/>
-      </w:pPr>
-      <w:bookmarkStart w:id="22" w:name="_d275c12976b6db7ca538f1cc96154c39857110d"/>
-      <w:r>
-        <w:t xml:space="preserve">Bronvast werkzaamhedenmodel</w:t>
-      </w:r>
-      <w:bookmarkEnd w:id="22"/>
-    </w:p>
-    <w:p>
-      <w:pPr>
-        <w:pStyle w:val="FirstParagraph"/>
-      </w:pPr>
-      <w:r>
-        <w:t xml:space="preserve">De levende lokale database bevat naast de bestaande classificatie een afzonderlijke laag voor projecten, feitelijke of geplande uitvoeringen, expliciete jaarstatussen en bewijsbronnen. Op 14 oktober 2026 is deze laag aangevuld na controle van alle 807 actieve Zotero-bijlagen. De bestaande tabellen</w:t>
-      </w:r>
-      <w:r>
-        <w:t xml:space="preserve"> </w:t>
-      </w:r>
-      <w:r>
-        <w:rPr>
-          <w:rStyle w:val="VerbatimChar"/>
-        </w:rPr>
-        <w:t xml:space="preserve">maatregelen</w:t>
-      </w:r>
-      <w:r>
-        <w:t xml:space="preserve">,</w:t>
-      </w:r>
-      <w:r>
-        <w:t xml:space="preserve"> </w:t>
-      </w:r>
-      <w:r>
-        <w:rPr>
-          <w:rStyle w:val="VerbatimChar"/>
-        </w:rPr>
-        <w:t xml:space="preserve">maatregelen_kernwoorden</w:t>
-      </w:r>
-      <w:r>
-        <w:t xml:space="preserve"> </w:t>
-      </w:r>
-      <w:r>
-        <w:t xml:space="preserve">en</w:t>
-      </w:r>
-      <w:r>
-        <w:t xml:space="preserve"> </w:t>
-      </w:r>
-      <w:r>
-        <w:rPr>
-          <w:rStyle w:val="VerbatimChar"/>
-        </w:rPr>
-        <w:t xml:space="preserve">plot_jaar_maatregel</w:t>
-      </w:r>
-      <w:r>
-        <w:t xml:space="preserve"> </w:t>
-      </w:r>
-      <w:r>
-        <w:t xml:space="preserve">blijven bestaan. De vier algemene kernwoorden voor recreatiebeheer zijn onder de nieuwe hoofdklasse</w:t>
-      </w:r>
-      <w:r>
-        <w:t xml:space="preserve"> </w:t>
-      </w:r>
-      <w:r>
-        <w:rPr>
-          <w:rStyle w:val="VerbatimChar"/>
-        </w:rPr>
-        <w:t xml:space="preserve">rust_en_recreatiebeheer</w:t>
-      </w:r>
-      <w:r>
-        <w:t xml:space="preserve"> </w:t>
-      </w:r>
-      <w:r>
-        <w:t xml:space="preserve">geplaatst;</w:t>
-      </w:r>
-      <w:r>
-        <w:t xml:space="preserve"> </w:t>
-      </w:r>
-      <w:r>
-        <w:rPr>
-          <w:rStyle w:val="VerbatimChar"/>
-        </w:rPr>
-        <w:t xml:space="preserve">strandreservaat</w:t>
-      </w:r>
-      <w:r>
-        <w:t xml:space="preserve"> </w:t>
-      </w:r>
-      <w:r>
-        <w:t xml:space="preserve">blijft als specifiek kernwoord onder</w:t>
-      </w:r>
-      <w:r>
-        <w:t xml:space="preserve"> </w:t>
-      </w:r>
-      <w:r>
-        <w:rPr>
-          <w:rStyle w:val="VerbatimChar"/>
-        </w:rPr>
-        <w:t xml:space="preserve">strandreservaten</w:t>
-      </w:r>
-      <w:r>
-        <w:t xml:space="preserve"> </w:t>
-      </w:r>
-      <w:r>
-        <w:t xml:space="preserve">herkenbaar.</w:t>
-      </w:r>
-    </w:p>
-    <w:tbl>
-      <w:tblPr>
-        <w:tblStyle w:val="Table"/>
-        <w:tblW w:type="auto" w:w="0"/>
-        <w:tblLook w:firstRow="1" w:lastRow="0" w:firstColumn="0" w:lastColumn="0" w:noHBand="0" w:noVBand="0" w:val="0020"/>
-      </w:tblPr>
-      <w:tblGrid>
-        <w:gridCol w:w="2640"/>
-        <w:gridCol w:w="2640"/>
-        <w:gridCol w:w="2640"/>
-      </w:tblGrid>
-      <w:tr>
-        <w:trPr>
-          <w:tblHeader w:val="on"/>
-        </w:trPr>
-        <w:tc>
-          <w:tcPr/>
-          <w:p>
-            <w:pPr>
-              <w:pStyle w:val="Compact"/>
-            </w:pPr>
-            <w:r>
-              <w:t xml:space="preserve">Tabel of view</w:t>
-            </w:r>
-          </w:p>
-        </w:tc>
-        <w:tc>
-          <w:tcPr/>
-          <w:p>
-            <w:pPr>
-              <w:pStyle w:val="Compact"/>
-              <w:jc w:val="right"/>
-            </w:pPr>
-            <w:r>
-              <w:t xml:space="preserve">Records</w:t>
-            </w:r>
-          </w:p>
-        </w:tc>
-        <w:tc>
-          <w:tcPr/>
-          <w:p>
-            <w:pPr>
-              <w:pStyle w:val="Compact"/>
-            </w:pPr>
-            <w:r>
-              <w:t xml:space="preserve">Betekenis</w:t>
-            </w:r>
-          </w:p>
-        </w:tc>
-      </w:tr>
-      <w:tr>
-        <w:tc>
-          <w:tcPr/>
-          <w:p>
-            <w:pPr>
-              <w:pStyle w:val="Compact"/>
-            </w:pPr>
-            <w:r>
-              <w:rPr>
-                <w:rStyle w:val="VerbatimChar"/>
-              </w:rPr>
-              <w:t xml:space="preserve">maatregel_project</w:t>
-            </w:r>
-          </w:p>
-        </w:tc>
-        <w:tc>
-          <w:tcPr/>
-          <w:p>
-            <w:pPr>
-              <w:pStyle w:val="Compact"/>
-              <w:jc w:val="right"/>
-            </w:pPr>
-            <w:r>
-              <w:t xml:space="preserve">18</w:t>
-            </w:r>
-          </w:p>
-        </w:tc>
-        <w:tc>
-          <w:tcPr/>
-          <w:p>
-            <w:pPr>
-              <w:pStyle w:val="Compact"/>
-            </w:pPr>
-            <w:r>
-              <w:t xml:space="preserve">Samenhangend project of programma; een project kan meerdere uitvoeringen bevatten.</w:t>
-            </w:r>
-          </w:p>
-        </w:tc>
-      </w:tr>
-      <w:tr>
-        <w:tc>
-          <w:tcPr/>
-          <w:p>
-            <w:pPr>
-              <w:pStyle w:val="Compact"/>
-            </w:pPr>
-            <w:r>
-              <w:rPr>
-                <w:rStyle w:val="VerbatimChar"/>
-              </w:rPr>
-              <w:t xml:space="preserve">maatregel_bron</w:t>
-            </w:r>
-          </w:p>
-        </w:tc>
-        <w:tc>
-          <w:tcPr/>
-          <w:p>
-            <w:pPr>
-              <w:pStyle w:val="Compact"/>
-              <w:jc w:val="right"/>
-            </w:pPr>
-            <w:r>
-              <w:t xml:space="preserve">30</w:t>
-            </w:r>
-          </w:p>
-        </w:tc>
-        <w:tc>
-          <w:tcPr/>
-          <w:p>
-            <w:pPr>
-              <w:pStyle w:val="Compact"/>
-            </w:pPr>
-            <w:r>
-              <w:t xml:space="preserve">22 lokaal geraadpleegde Zotero-bronnen en acht officiële webbronnen, ieder met type, datum, status en raadpleegdatum.</w:t>
-            </w:r>
-          </w:p>
-        </w:tc>
-      </w:tr>
-      <w:tr>
-        <w:tc>
-          <w:tcPr/>
-          <w:p>
-            <w:pPr>
-              <w:pStyle w:val="Compact"/>
-            </w:pPr>
-            <w:r>
-              <w:rPr>
-                <w:rStyle w:val="VerbatimChar"/>
-              </w:rPr>
-              <w:t xml:space="preserve">maatregel_uitvoering</w:t>
-            </w:r>
-          </w:p>
-        </w:tc>
-        <w:tc>
-          <w:tcPr/>
-          <w:p>
-            <w:pPr>
-              <w:pStyle w:val="Compact"/>
-              <w:jc w:val="right"/>
-            </w:pPr>
-            <w:r>
-              <w:t xml:space="preserve">61</w:t>
-            </w:r>
-          </w:p>
-        </w:tc>
-        <w:tc>
-          <w:tcPr/>
-          <w:p>
-            <w:pPr>
-              <w:pStyle w:val="Compact"/>
-            </w:pPr>
-            <w:r>
-              <w:t xml:space="preserve">Afzonderlijke werkzaamheden of expliciet niet-uitgevoerde, onbekende of geplande activiteiten.</w:t>
-            </w:r>
-          </w:p>
-        </w:tc>
-      </w:tr>
-      <w:tr>
-        <w:tc>
-          <w:tcPr/>
-          <w:p>
-            <w:pPr>
-              <w:pStyle w:val="Compact"/>
-            </w:pPr>
-            <w:r>
-              <w:rPr>
-                <w:rStyle w:val="VerbatimChar"/>
-              </w:rPr>
-              <w:t xml:space="preserve">maatregel_uitvoering_jaar</w:t>
-            </w:r>
-          </w:p>
-        </w:tc>
-        <w:tc>
-          <w:tcPr/>
-          <w:p>
-            <w:pPr>
-              <w:pStyle w:val="Compact"/>
-              <w:jc w:val="right"/>
-            </w:pPr>
-            <w:r>
-              <w:t xml:space="preserve">100</w:t>
-            </w:r>
-          </w:p>
-        </w:tc>
-        <w:tc>
-          <w:tcPr/>
-          <w:p>
-            <w:pPr>
-              <w:pStyle w:val="Compact"/>
-            </w:pPr>
-            <w:r>
-              <w:t xml:space="preserve">Letterlijk onderbouwde jaarstatussen uit 1967–2025: 84 uitgevoerd, 9 niet uitgevoerd en 7 onbekend.</w:t>
-            </w:r>
-          </w:p>
-        </w:tc>
-      </w:tr>
-      <w:tr>
-        <w:tc>
-          <w:tcPr/>
-          <w:p>
-            <w:pPr>
-              <w:pStyle w:val="Compact"/>
-            </w:pPr>
-            <w:r>
-              <w:rPr>
-                <w:rStyle w:val="VerbatimChar"/>
-              </w:rPr>
-              <w:t xml:space="preserve">maatregel_uitvoering_bron</w:t>
-            </w:r>
-          </w:p>
-        </w:tc>
-        <w:tc>
-          <w:tcPr/>
-          <w:p>
-            <w:pPr>
-              <w:pStyle w:val="Compact"/>
-              <w:jc w:val="right"/>
-            </w:pPr>
-            <w:r>
-              <w:t xml:space="preserve">83</w:t>
-            </w:r>
-          </w:p>
-        </w:tc>
-        <w:tc>
-          <w:tcPr/>
-          <w:p>
-            <w:pPr>
-              <w:pStyle w:val="Compact"/>
-            </w:pPr>
-            <w:r>
-              <w:t xml:space="preserve">Relaties tussen uitvoering en bewijsbron, met bronrol en bewijsnotitie.</w:t>
-            </w:r>
-          </w:p>
-        </w:tc>
-      </w:tr>
-      <w:tr>
-        <w:tc>
-          <w:tcPr/>
-          <w:p>
-            <w:pPr>
-              <w:pStyle w:val="Compact"/>
-            </w:pPr>
-            <w:r>
-              <w:rPr>
-                <w:rStyle w:val="VerbatimChar"/>
-              </w:rPr>
-              <w:t xml:space="preserve">maatregel_geometrie</w:t>
-            </w:r>
-          </w:p>
-        </w:tc>
-        <w:tc>
-          <w:tcPr/>
-          <w:p>
-            <w:pPr>
-              <w:pStyle w:val="Compact"/>
-              <w:jc w:val="right"/>
-            </w:pPr>
-            <w:r>
-              <w:t xml:space="preserve">0</w:t>
-            </w:r>
-          </w:p>
-        </w:tc>
-        <w:tc>
-          <w:tcPr/>
-          <w:p>
-            <w:pPr>
-              <w:pStyle w:val="Compact"/>
-            </w:pPr>
-            <w:r>
-              <w:t xml:space="preserve">Alleen voor later verkregen, bronvaste geometrieën in RD New.</w:t>
-            </w:r>
-          </w:p>
-        </w:tc>
-      </w:tr>
-      <w:tr>
-        <w:tc>
-          <w:tcPr/>
-          <w:p>
-            <w:pPr>
-              <w:pStyle w:val="Compact"/>
-            </w:pPr>
-            <w:r>
-              <w:rPr>
-                <w:rStyle w:val="VerbatimChar"/>
-              </w:rPr>
-              <w:t xml:space="preserve">plot_gebied</w:t>
-            </w:r>
-          </w:p>
-        </w:tc>
-        <w:tc>
-          <w:tcPr/>
-          <w:p>
-            <w:pPr>
-              <w:pStyle w:val="Compact"/>
-              <w:jc w:val="right"/>
-            </w:pPr>
-            <w:r>
-              <w:t xml:space="preserve">8</w:t>
-            </w:r>
-          </w:p>
-        </w:tc>
-        <w:tc>
-          <w:tcPr/>
-          <w:p>
-            <w:pPr>
-              <w:pStyle w:val="Compact"/>
-            </w:pPr>
-            <w:r>
-              <w:t xml:space="preserve">Vijf Meijendel-deelgebieden en drie speciale gebieden.</w:t>
-            </w:r>
-          </w:p>
-        </w:tc>
-      </w:tr>
-      <w:tr>
-        <w:tc>
-          <w:tcPr/>
-          <w:p>
-            <w:pPr>
-              <w:pStyle w:val="Compact"/>
-            </w:pPr>
-            <w:r>
-              <w:rPr>
-                <w:rStyle w:val="VerbatimChar"/>
-              </w:rPr>
-              <w:t xml:space="preserve">plot_gebiedsindeling</w:t>
-            </w:r>
-          </w:p>
-        </w:tc>
-        <w:tc>
-          <w:tcPr/>
-          <w:p>
-            <w:pPr>
-              <w:pStyle w:val="Compact"/>
-              <w:jc w:val="right"/>
-            </w:pPr>
-            <w:r>
-              <w:t xml:space="preserve">1</w:t>
-            </w:r>
-          </w:p>
-        </w:tc>
-        <w:tc>
-          <w:tcPr/>
-          <w:p>
-            <w:pPr>
-              <w:pStyle w:val="Compact"/>
-            </w:pPr>
-            <w:r>
-              <w:t xml:space="preserve">Vastgestelde indeling</w:t>
-            </w:r>
-            <w:r>
-              <w:t xml:space="preserve"> </w:t>
-            </w:r>
-            <w:r>
-              <w:rPr>
-                <w:rStyle w:val="VerbatimChar"/>
-              </w:rPr>
-              <w:t xml:space="preserve">vogelplot-gebiedsindeling-v1</w:t>
-            </w:r>
-            <w:r>
-              <w:t xml:space="preserve">, gekoppeld aan SOVON-plotversie 2025.</w:t>
-            </w:r>
-          </w:p>
-        </w:tc>
-      </w:tr>
-      <w:tr>
-        <w:tc>
-          <w:tcPr/>
-          <w:p>
-            <w:pPr>
-              <w:pStyle w:val="Compact"/>
-            </w:pPr>
-            <w:r>
-              <w:rPr>
-                <w:rStyle w:val="VerbatimChar"/>
-              </w:rPr>
-              <w:t xml:space="preserve">plot_gebied_lidmaatschap</w:t>
-            </w:r>
-          </w:p>
-        </w:tc>
-        <w:tc>
-          <w:tcPr/>
-          <w:p>
-            <w:pPr>
-              <w:pStyle w:val="Compact"/>
-              <w:jc w:val="right"/>
-            </w:pPr>
-            <w:r>
-              <w:t xml:space="preserve">69</w:t>
-            </w:r>
-          </w:p>
-        </w:tc>
-        <w:tc>
-          <w:tcPr/>
-          <w:p>
-            <w:pPr>
-              <w:pStyle w:val="Compact"/>
-            </w:pPr>
-            <w:r>
-              <w:t xml:space="preserve">Alle 55 actuele en 14 historische plots hebben precies één gebied.</w:t>
-            </w:r>
-          </w:p>
-        </w:tc>
-      </w:tr>
-      <w:tr>
-        <w:tc>
-          <w:tcPr/>
-          <w:p>
-            <w:pPr>
-              <w:pStyle w:val="Compact"/>
-            </w:pPr>
-            <w:r>
-              <w:rPr>
-                <w:rStyle w:val="VerbatimChar"/>
-              </w:rPr>
-              <w:t xml:space="preserve">plot_gebied_geometrie</w:t>
-            </w:r>
-          </w:p>
-        </w:tc>
-        <w:tc>
-          <w:tcPr/>
-          <w:p>
-            <w:pPr>
-              <w:pStyle w:val="Compact"/>
-              <w:jc w:val="right"/>
-            </w:pPr>
-            <w:r>
-              <w:t xml:space="preserve">8</w:t>
-            </w:r>
-          </w:p>
-        </w:tc>
-        <w:tc>
-          <w:tcPr/>
-          <w:p>
-            <w:pPr>
-              <w:pStyle w:val="Compact"/>
-            </w:pPr>
-            <w:r>
-              <w:t xml:space="preserve">Topologisch samengevoegde actuele kavelgeometrieën in RD New; samen afgeleid uit 55 plots.</w:t>
-            </w:r>
-          </w:p>
-        </w:tc>
-      </w:tr>
-      <w:tr>
-        <w:tc>
-          <w:tcPr/>
-          <w:p>
-            <w:pPr>
-              <w:pStyle w:val="Compact"/>
-            </w:pPr>
-            <w:r>
-              <w:rPr>
-                <w:rStyle w:val="VerbatimChar"/>
-              </w:rPr>
-              <w:t xml:space="preserve">maatregel_uitvoering_gebied</w:t>
-            </w:r>
-          </w:p>
-        </w:tc>
-        <w:tc>
-          <w:tcPr/>
-          <w:p>
-            <w:pPr>
-              <w:pStyle w:val="Compact"/>
-              <w:jc w:val="right"/>
-            </w:pPr>
-            <w:r>
-              <w:t xml:space="preserve">2</w:t>
-            </w:r>
-          </w:p>
-        </w:tc>
-        <w:tc>
-          <w:tcPr/>
-          <w:p>
-            <w:pPr>
-              <w:pStyle w:val="Compact"/>
-            </w:pPr>
-            <w:r>
-              <w:t xml:space="preserve">Voorlinden als locatie binnen M91 en begrazing vanaf 1990 voor Kijfhoek en Bierlap als volledig benoemd gebied.</w:t>
-            </w:r>
-          </w:p>
-        </w:tc>
-      </w:tr>
-      <w:tr>
-        <w:tc>
-          <w:tcPr/>
-          <w:p>
-            <w:pPr>
-              <w:pStyle w:val="Compact"/>
-            </w:pPr>
-            <w:r>
-              <w:rPr>
-                <w:rStyle w:val="VerbatimChar"/>
-              </w:rPr>
-              <w:t xml:space="preserve">maatregel_plot_koppeling</w:t>
-            </w:r>
-          </w:p>
-        </w:tc>
-        <w:tc>
-          <w:tcPr/>
-          <w:p>
-            <w:pPr>
-              <w:pStyle w:val="Compact"/>
-              <w:jc w:val="right"/>
-            </w:pPr>
-            <w:r>
-              <w:t xml:space="preserve">99</w:t>
-            </w:r>
-          </w:p>
-        </w:tc>
-        <w:tc>
-          <w:tcPr/>
-          <w:p>
-            <w:pPr>
-              <w:pStyle w:val="Compact"/>
-            </w:pPr>
-            <w:r>
-              <w:t xml:space="preserve">36 eerder onderbouwde relaties; 32 relaties via de nameninventaris; 11 voor Pan 13 en Plas 20; telkens 3 voor Helmduinen, Kikkervalleienbegrazing, bodemherstel, infrastructuur en Watercrassula; telkens 1 voor Parnassiapad 1, Parnassiapad 2 en Plas 8.4.2; en 2 voor de konijnenbijplaatsingsproef. De exacte werkoppervlakken per kavel blijven onbekend.</w:t>
-            </w:r>
-          </w:p>
-        </w:tc>
-      </w:tr>
-      <w:tr>
-        <w:tc>
-          <w:tcPr/>
-          <w:p>
-            <w:pPr>
-              <w:pStyle w:val="Compact"/>
-            </w:pPr>
-            <w:r>
-              <w:rPr>
-                <w:rStyle w:val="VerbatimChar"/>
-              </w:rPr>
-              <w:t xml:space="preserve">v_plot_gebied_actueel</w:t>
-            </w:r>
-          </w:p>
-        </w:tc>
-        <w:tc>
-          <w:tcPr/>
-          <w:p>
-            <w:pPr>
-              <w:pStyle w:val="Compact"/>
-              <w:jc w:val="right"/>
-            </w:pPr>
-            <w:r>
-              <w:t xml:space="preserve">69</w:t>
-            </w:r>
-          </w:p>
-        </w:tc>
-        <w:tc>
-          <w:tcPr/>
-          <w:p>
-            <w:pPr>
-              <w:pStyle w:val="Compact"/>
-            </w:pPr>
-            <w:r>
-              <w:t xml:space="preserve">Actuele leeslaag van de volledige vastgestelde gebiedsindeling.</w:t>
-            </w:r>
-          </w:p>
-        </w:tc>
-      </w:tr>
-      <w:tr>
-        <w:tc>
-          <w:tcPr/>
-          <w:p>
-            <w:pPr>
-              <w:pStyle w:val="Compact"/>
-            </w:pPr>
-            <w:r>
-              <w:rPr>
-                <w:rStyle w:val="VerbatimChar"/>
-              </w:rPr>
-              <w:t xml:space="preserve">v_plot_gebied_geometrie_actueel</w:t>
-            </w:r>
-          </w:p>
-        </w:tc>
-        <w:tc>
-          <w:tcPr/>
-          <w:p>
-            <w:pPr>
-              <w:pStyle w:val="Compact"/>
-              <w:jc w:val="right"/>
-            </w:pPr>
-            <w:r>
-              <w:t xml:space="preserve">8</w:t>
-            </w:r>
-          </w:p>
-        </w:tc>
-        <w:tc>
-          <w:tcPr/>
-          <w:p>
-            <w:pPr>
-              <w:pStyle w:val="Compact"/>
-            </w:pPr>
-            <w:r>
-              <w:t xml:space="preserve">Actuele leeslaag van de afgeleide gebiedsgeometrieën.</w:t>
-            </w:r>
-          </w:p>
-        </w:tc>
-      </w:tr>
-      <w:tr>
-        <w:tc>
-          <w:tcPr/>
-          <w:p>
-            <w:pPr>
-              <w:pStyle w:val="Compact"/>
-            </w:pPr>
-            <w:r>
-              <w:rPr>
-                <w:rStyle w:val="VerbatimChar"/>
-              </w:rPr>
-              <w:t xml:space="preserve">v_plot_jaar_maatregel_bronvast</w:t>
-            </w:r>
-          </w:p>
-        </w:tc>
-        <w:tc>
-          <w:tcPr/>
-          <w:p>
-            <w:pPr>
-              <w:pStyle w:val="Compact"/>
-              <w:jc w:val="right"/>
-            </w:pPr>
-            <w:r>
-              <w:t xml:space="preserve">149</w:t>
-            </w:r>
-          </w:p>
-        </w:tc>
-        <w:tc>
-          <w:tcPr/>
-          <w:p>
-            <w:pPr>
-              <w:pStyle w:val="Compact"/>
-            </w:pPr>
-            <w:r>
-              <w:t xml:space="preserve">Bronvaste plot-jaarregels voor 1967–1969, 1972–1975, 1988–1991, 1993, 1997, 2002, 2005–2006 en 2017–2025. Hieronder vallen Parnassiapad 1 in M15 rond 1997, de konijnenbijplaatsingsproef in M8 en M41 in 2024 en de slibverwijdering in Plas 8.4.2 in M32 in 2002.</w:t>
-            </w:r>
-          </w:p>
-        </w:tc>
-      </w:tr>
-    </w:tbl>
-    <w:p>
-      <w:pPr>
-        <w:pStyle w:val="FirstParagraph"/>
-      </w:pPr>
-      <w:r>
-        <w:t xml:space="preserve">De referentietabellen</w:t>
-      </w:r>
-      <w:r>
-        <w:t xml:space="preserve"> </w:t>
-      </w:r>
-      <w:r>
-        <w:rPr>
-          <w:rStyle w:val="VerbatimChar"/>
-        </w:rPr>
-        <w:t xml:space="preserve">maatregel_werkcategorie</w:t>
-      </w:r>
-      <w:r>
-        <w:t xml:space="preserve">,</w:t>
-      </w:r>
-      <w:r>
-        <w:t xml:space="preserve"> </w:t>
-      </w:r>
-      <w:r>
-        <w:rPr>
-          <w:rStyle w:val="VerbatimChar"/>
-        </w:rPr>
-        <w:t xml:space="preserve">maatregel_type</w:t>
-      </w:r>
-      <w:r>
-        <w:t xml:space="preserve">,</w:t>
-      </w:r>
-      <w:r>
-        <w:t xml:space="preserve"> </w:t>
-      </w:r>
-      <w:r>
-        <w:rPr>
-          <w:rStyle w:val="VerbatimChar"/>
-        </w:rPr>
-        <w:t xml:space="preserve">maatregel_activiteit_type</w:t>
-      </w:r>
-      <w:r>
-        <w:t xml:space="preserve">,</w:t>
-      </w:r>
-      <w:r>
-        <w:t xml:space="preserve"> </w:t>
-      </w:r>
-      <w:r>
-        <w:rPr>
-          <w:rStyle w:val="VerbatimChar"/>
-        </w:rPr>
-        <w:t xml:space="preserve">maatregel_uitvoering_status</w:t>
-      </w:r>
-      <w:r>
-        <w:t xml:space="preserve"> </w:t>
-      </w:r>
-      <w:r>
-        <w:t xml:space="preserve">en</w:t>
-      </w:r>
-      <w:r>
-        <w:t xml:space="preserve"> </w:t>
-      </w:r>
-      <w:r>
-        <w:rPr>
-          <w:rStyle w:val="VerbatimChar"/>
-        </w:rPr>
-        <w:t xml:space="preserve">maatregel_brontype</w:t>
-      </w:r>
-      <w:r>
-        <w:t xml:space="preserve"> </w:t>
-      </w:r>
-      <w:r>
-        <w:t xml:space="preserve">scheiden categorie, activiteit, feitelijke status en brontype. Waar passend zijn de Natura 2000-codes MT01–MT07 en activiteitcodes A–G gebruikt; lokale aanvullingen hebben een eigen code. Een subsidie-openstelling, ontwerpplan of actuele werkzaamhedenpagina wordt niet als uitvoering behandeld zolang de feitelijke uitvoering niet is bevestigd.</w:t>
-      </w:r>
-    </w:p>
-    <w:p>
-      <w:pPr>
-        <w:pStyle w:val="BodyText"/>
-      </w:pPr>
-      <w:r>
-        <w:t xml:space="preserve">De 144 bestaande regels in</w:t>
-      </w:r>
-      <w:r>
-        <w:t xml:space="preserve"> </w:t>
-      </w:r>
-      <w:r>
-        <w:rPr>
-          <w:rStyle w:val="VerbatimChar"/>
-        </w:rPr>
-        <w:t xml:space="preserve">plot_jaar_maatregel</w:t>
-      </w:r>
-      <w:r>
-        <w:t xml:space="preserve"> </w:t>
-      </w:r>
-      <w:r>
-        <w:t xml:space="preserve">blijven de historische dashboardlaag voor begrazing in 16 plots uit 1991–1999. Hun aantal en checksum</w:t>
-      </w:r>
-      <w:r>
-        <w:t xml:space="preserve"> </w:t>
-      </w:r>
-      <w:r>
-        <w:rPr>
-          <w:rStyle w:val="VerbatimChar"/>
-        </w:rPr>
-        <w:t xml:space="preserve">306480715648</w:t>
-      </w:r>
-      <w:r>
-        <w:t xml:space="preserve"> </w:t>
-      </w:r>
-      <w:r>
-        <w:t xml:space="preserve">zijn bij de actualisering tot en met 15 oktober 2026 gelijk gebleven. Zij worden niet achteraf als bronvaste projectuitvoering geïnterpreteerd. Nieuwe werkzaamheden gaan pas naar een plot-jaarselectie nadat locatie, jaar en bron voldoende precies zijn vastgesteld.</w:t>
-      </w:r>
-    </w:p>
-    <w:p>
-      <w:pPr>
-        <w:pStyle w:val="BodyText"/>
-      </w:pPr>
-      <w:r>
-        <w:t xml:space="preserve">De gebiedsindeling gebruikt de 55 geldige SOVON-kavelpolygonen uit plotversie 2025, in EPSG:28992. Daaruit zijn vijf geometrieën voor Buitenduin Noord, Buitenduin Zuid, Kijfhoek en Bierlap, Vallei Meijendel en Zuid-oosthoek en drie geometrieën voor Haagsche Golfclub, Voorlinden en Hertenkamp afgeleid. Interne overlap van telplots wordt bij de topologische samenvoeging niet dubbel als gebiedsoppervlak geteld. De 14 historische plots zijn inhoudelijk ingedeeld, maar hebben in plotversie 2025 geen afzonderlijke historische geometrie en worden daarom niet als geometriebron gebruikt.</w:t>
-      </w:r>
-    </w:p>
-    <w:p>
-      <w:pPr>
-        <w:pStyle w:val="BodyText"/>
-      </w:pPr>
-      <w:r>
-        <w:t xml:space="preserve">De actuele aantallen bronplots per geometrie zijn respectievelijk 9, 7, 16, 9 en 11 voor de vijf Meijendel-deelgebieden en 1 voor ieder speciaal gebied. De indeling normaliseert de aangeleverde aanduiding M54q naar het bestaande plot M54a. Historisch M17 volgt M17a en ligt in Buitenduin Noord; M8/11, M8/9, M9 en M11 liggen in Kijfhoek en Bierlap.</w:t>
-      </w:r>
-    </w:p>
-    <w:p>
-      <w:pPr>
-        <w:pStyle w:val="Heading2"/>
-      </w:pPr>
-      <w:bookmarkStart w:id="23" w:name="_1658618e44232e196644eac3525cdf2369e59da"/>
-      <w:r>
-        <w:t xml:space="preserve">Nameninventaris en plotgeometrie</w:t>
-      </w:r>
-      <w:bookmarkEnd w:id="23"/>
-    </w:p>
-    <w:p>
-      <w:pPr>
-        <w:pStyle w:val="FirstParagraph"/>
-      </w:pPr>
-      <w:r>
-        <w:t xml:space="preserve">Versie</w:t>
-      </w:r>
-      <w:r>
-        <w:t xml:space="preserve"> </w:t>
-      </w:r>
-      <w:r>
-        <w:rPr>
-          <w:rStyle w:val="VerbatimChar"/>
-        </w:rPr>
-        <w:t xml:space="preserve">meijendel_nameninventaris_2026-10-14</w:t>
-      </w:r>
-      <w:r>
-        <w:t xml:space="preserve"> </w:t>
-      </w:r>
-      <w:r>
-        <w:t xml:space="preserve">is op 14 oktober 2026 in de levende lokale database opgenomen. De korrel is één naamobject, één bronvermelding of één brongeometrie; naamgeometrie bewijst niet automatisch de exacte grens van een uitgevoerde maatregel.</w:t>
-      </w:r>
-    </w:p>
-    <w:tbl>
-      <w:tblPr>
-        <w:tblStyle w:val="Table"/>
-        <w:tblW w:type="auto" w:w="0"/>
-        <w:tblLook w:firstRow="1" w:lastRow="0" w:firstColumn="0" w:lastColumn="0" w:noHBand="0" w:noVBand="0" w:val="0020"/>
-      </w:tblPr>
-      <w:tblGrid>
-        <w:gridCol w:w="2640"/>
-        <w:gridCol w:w="2640"/>
-        <w:gridCol w:w="2640"/>
-      </w:tblGrid>
-      <w:tr>
-        <w:trPr>
-          <w:tblHeader w:val="on"/>
-        </w:trPr>
-        <w:tc>
-          <w:tcPr/>
-          <w:p>
-            <w:pPr>
-              <w:pStyle w:val="Compact"/>
-            </w:pPr>
-            <w:r>
-              <w:t xml:space="preserve">Tabel of view</w:t>
-            </w:r>
-          </w:p>
-        </w:tc>
-        <w:tc>
-          <w:tcPr/>
-          <w:p>
-            <w:pPr>
-              <w:pStyle w:val="Compact"/>
-              <w:jc w:val="right"/>
-            </w:pPr>
-            <w:r>
-              <w:t xml:space="preserve">Records</w:t>
-            </w:r>
-          </w:p>
-        </w:tc>
-        <w:tc>
-          <w:tcPr/>
-          <w:p>
-            <w:pPr>
-              <w:pStyle w:val="Compact"/>
-            </w:pPr>
-            <w:r>
-              <w:t xml:space="preserve">Betekenis</w:t>
-            </w:r>
-          </w:p>
-        </w:tc>
-      </w:tr>
-      <w:tr>
-        <w:tc>
-          <w:tcPr/>
-          <w:p>
-            <w:pPr>
-              <w:pStyle w:val="Compact"/>
-            </w:pPr>
-            <w:r>
-              <w:rPr>
-                <w:rStyle w:val="VerbatimChar"/>
-              </w:rPr>
-              <w:t xml:space="preserve">nameninventaris_import</w:t>
-            </w:r>
-          </w:p>
-        </w:tc>
-        <w:tc>
-          <w:tcPr/>
-          <w:p>
-            <w:pPr>
-              <w:pStyle w:val="Compact"/>
-              <w:jc w:val="right"/>
-            </w:pPr>
-            <w:r>
-              <w:t xml:space="preserve">1</w:t>
-            </w:r>
-          </w:p>
-        </w:tc>
-        <w:tc>
-          <w:tcPr/>
-          <w:p>
-            <w:pPr>
-              <w:pStyle w:val="Compact"/>
-            </w:pPr>
-            <w:r>
-              <w:t xml:space="preserve">Herkomst, hash, regelversie en verwachte aantallen van de levering.</w:t>
-            </w:r>
-          </w:p>
-        </w:tc>
-      </w:tr>
-      <w:tr>
-        <w:tc>
-          <w:tcPr/>
-          <w:p>
-            <w:pPr>
-              <w:pStyle w:val="Compact"/>
-            </w:pPr>
-            <w:r>
-              <w:rPr>
-                <w:rStyle w:val="VerbatimChar"/>
-              </w:rPr>
-              <w:t xml:space="preserve">nameninventaris_bron</w:t>
-            </w:r>
-          </w:p>
-        </w:tc>
-        <w:tc>
-          <w:tcPr/>
-          <w:p>
-            <w:pPr>
-              <w:pStyle w:val="Compact"/>
-              <w:jc w:val="right"/>
-            </w:pPr>
-            <w:r>
-              <w:t xml:space="preserve">8</w:t>
-            </w:r>
-          </w:p>
-        </w:tc>
-        <w:tc>
-          <w:tcPr/>
-          <w:p>
-            <w:pPr>
-              <w:pStyle w:val="Compact"/>
-            </w:pPr>
-            <w:r>
-              <w:t xml:space="preserve">Beekman 2021, twee historische artikelen, Neefjes 2010, TOP10NL, OSM en twee Dunea-bronnen.</w:t>
-            </w:r>
-          </w:p>
-        </w:tc>
-      </w:tr>
-      <w:tr>
-        <w:tc>
-          <w:tcPr/>
-          <w:p>
-            <w:pPr>
-              <w:pStyle w:val="Compact"/>
-            </w:pPr>
-            <w:r>
-              <w:rPr>
-                <w:rStyle w:val="VerbatimChar"/>
-              </w:rPr>
-              <w:t xml:space="preserve">nameninventaris_object</w:t>
-            </w:r>
-          </w:p>
-        </w:tc>
-        <w:tc>
-          <w:tcPr/>
-          <w:p>
-            <w:pPr>
-              <w:pStyle w:val="Compact"/>
-              <w:jc w:val="right"/>
-            </w:pPr>
-            <w:r>
-              <w:t xml:space="preserve">182</w:t>
-            </w:r>
-          </w:p>
-        </w:tc>
-        <w:tc>
-          <w:tcPr/>
-          <w:p>
-            <w:pPr>
-              <w:pStyle w:val="Compact"/>
-            </w:pPr>
-            <w:r>
-              <w:t xml:space="preserve">Onderscheiden gebieds-, functionele, pad-, weg- en routeobjecten.</w:t>
-            </w:r>
-          </w:p>
-        </w:tc>
-      </w:tr>
-      <w:tr>
-        <w:tc>
-          <w:tcPr/>
-          <w:p>
-            <w:pPr>
-              <w:pStyle w:val="Compact"/>
-            </w:pPr>
-            <w:r>
-              <w:rPr>
-                <w:rStyle w:val="VerbatimChar"/>
-              </w:rPr>
-              <w:t xml:space="preserve">nameninventaris_vermelding</w:t>
-            </w:r>
-          </w:p>
-        </w:tc>
-        <w:tc>
-          <w:tcPr/>
-          <w:p>
-            <w:pPr>
-              <w:pStyle w:val="Compact"/>
-              <w:jc w:val="right"/>
-            </w:pPr>
-            <w:r>
-              <w:t xml:space="preserve">299</w:t>
-            </w:r>
-          </w:p>
-        </w:tc>
-        <w:tc>
-          <w:tcPr/>
-          <w:p>
-            <w:pPr>
-              <w:pStyle w:val="Compact"/>
-            </w:pPr>
-            <w:r>
-              <w:t xml:space="preserve">Gedateerde naamvermeldingen uit 1602–2026.</w:t>
-            </w:r>
-          </w:p>
-        </w:tc>
-      </w:tr>
-      <w:tr>
-        <w:tc>
-          <w:tcPr/>
-          <w:p>
-            <w:pPr>
-              <w:pStyle w:val="Compact"/>
-            </w:pPr>
-            <w:r>
-              <w:rPr>
-                <w:rStyle w:val="VerbatimChar"/>
-              </w:rPr>
-              <w:t xml:space="preserve">nameninventaris_geometrie</w:t>
-            </w:r>
-          </w:p>
-        </w:tc>
-        <w:tc>
-          <w:tcPr/>
-          <w:p>
-            <w:pPr>
-              <w:pStyle w:val="Compact"/>
-              <w:jc w:val="right"/>
-            </w:pPr>
-            <w:r>
-              <w:t xml:space="preserve">71</w:t>
-            </w:r>
-          </w:p>
-        </w:tc>
-        <w:tc>
-          <w:tcPr/>
-          <w:p>
-            <w:pPr>
-              <w:pStyle w:val="Compact"/>
-            </w:pPr>
-            <w:r>
-              <w:t xml:space="preserve">Brongeometrieën in EPSG:28992 voor 71 objecten.</w:t>
-            </w:r>
-          </w:p>
-        </w:tc>
-      </w:tr>
-      <w:tr>
-        <w:tc>
-          <w:tcPr/>
-          <w:p>
-            <w:pPr>
-              <w:pStyle w:val="Compact"/>
-            </w:pPr>
-            <w:r>
-              <w:rPr>
-                <w:rStyle w:val="VerbatimChar"/>
-              </w:rPr>
-              <w:t xml:space="preserve">nameninventaris_geometrie_bronobject</w:t>
-            </w:r>
-          </w:p>
-        </w:tc>
-        <w:tc>
-          <w:tcPr/>
-          <w:p>
-            <w:pPr>
-              <w:pStyle w:val="Compact"/>
-              <w:jc w:val="right"/>
-            </w:pPr>
-            <w:r>
-              <w:t xml:space="preserve">107</w:t>
-            </w:r>
-          </w:p>
-        </w:tc>
-        <w:tc>
-          <w:tcPr/>
-          <w:p>
-            <w:pPr>
-              <w:pStyle w:val="Compact"/>
-            </w:pPr>
-            <w:r>
-              <w:t xml:space="preserve">Herleidbaarheid van samengevoegde geometrieën naar afzonderlijke bronobjecten.</w:t>
-            </w:r>
-          </w:p>
-        </w:tc>
-      </w:tr>
-      <w:tr>
-        <w:tc>
-          <w:tcPr/>
-          <w:p>
-            <w:pPr>
-              <w:pStyle w:val="Compact"/>
-            </w:pPr>
-            <w:r>
-              <w:rPr>
-                <w:rStyle w:val="VerbatimChar"/>
-              </w:rPr>
-              <w:t xml:space="preserve">nameninventaris_beoordeling</w:t>
-            </w:r>
-          </w:p>
-        </w:tc>
-        <w:tc>
-          <w:tcPr/>
-          <w:p>
-            <w:pPr>
-              <w:pStyle w:val="Compact"/>
-              <w:jc w:val="right"/>
-            </w:pPr>
-            <w:r>
-              <w:t xml:space="preserve">111</w:t>
-            </w:r>
-          </w:p>
-        </w:tc>
-        <w:tc>
-          <w:tcPr/>
-          <w:p>
-            <w:pPr>
-              <w:pStyle w:val="Compact"/>
-            </w:pPr>
-            <w:r>
-              <w:t xml:space="preserve">Actuele, expliciete geometrieleemten; deze namen worden niet ruimtelijk afgeleid.</w:t>
-            </w:r>
-          </w:p>
-        </w:tc>
-      </w:tr>
-      <w:tr>
-        <w:tc>
-          <w:tcPr/>
-          <w:p>
-            <w:pPr>
-              <w:pStyle w:val="Compact"/>
-            </w:pPr>
-            <w:r>
-              <w:rPr>
-                <w:rStyle w:val="VerbatimChar"/>
-              </w:rPr>
-              <w:t xml:space="preserve">plot_geometrie_import</w:t>
-            </w:r>
-          </w:p>
-        </w:tc>
-        <w:tc>
-          <w:tcPr/>
-          <w:p>
-            <w:pPr>
-              <w:pStyle w:val="Compact"/>
-              <w:jc w:val="right"/>
-            </w:pPr>
-            <w:r>
-              <w:t xml:space="preserve">1</w:t>
-            </w:r>
-          </w:p>
-        </w:tc>
-        <w:tc>
-          <w:tcPr/>
-          <w:p>
-            <w:pPr>
-              <w:pStyle w:val="Compact"/>
-            </w:pPr>
-            <w:r>
-              <w:t xml:space="preserve">Actuele SOVON-kavelgeometrie van 55 plots, versie</w:t>
-            </w:r>
-            <w:r>
-              <w:t xml:space="preserve"> </w:t>
-            </w:r>
-            <w:r>
-              <w:rPr>
-                <w:rStyle w:val="VerbatimChar"/>
-              </w:rPr>
-              <w:t xml:space="preserve">sovon-avimap-2025-download-2026-10-02</w:t>
-            </w:r>
-            <w:r>
-              <w:t xml:space="preserve">.</w:t>
-            </w:r>
-          </w:p>
-        </w:tc>
-      </w:tr>
-      <w:tr>
-        <w:tc>
-          <w:tcPr/>
-          <w:p>
-            <w:pPr>
-              <w:pStyle w:val="Compact"/>
-            </w:pPr>
-            <w:r>
-              <w:rPr>
-                <w:rStyle w:val="VerbatimChar"/>
-              </w:rPr>
-              <w:t xml:space="preserve">nameninventaris_plot_koppeling</w:t>
-            </w:r>
-          </w:p>
-        </w:tc>
-        <w:tc>
-          <w:tcPr/>
-          <w:p>
-            <w:pPr>
-              <w:pStyle w:val="Compact"/>
-              <w:jc w:val="right"/>
-            </w:pPr>
-            <w:r>
-              <w:t xml:space="preserve">377</w:t>
-            </w:r>
-          </w:p>
-        </w:tc>
-        <w:tc>
-          <w:tcPr/>
-          <w:p>
-            <w:pPr>
-              <w:pStyle w:val="Compact"/>
-            </w:pPr>
-            <w:r>
-              <w:t xml:space="preserve">Alle geometrische doorsnijdingen tussen 66 naamobjecten en 55 actuele kavels.</w:t>
-            </w:r>
-          </w:p>
-        </w:tc>
-      </w:tr>
-      <w:tr>
-        <w:tc>
-          <w:tcPr/>
-          <w:p>
-            <w:pPr>
-              <w:pStyle w:val="Compact"/>
-            </w:pPr>
-            <w:r>
-              <w:rPr>
-                <w:rStyle w:val="VerbatimChar"/>
-              </w:rPr>
-              <w:t xml:space="preserve">v_nameninventaris_plot_actueel</w:t>
-            </w:r>
-          </w:p>
-        </w:tc>
-        <w:tc>
-          <w:tcPr/>
-          <w:p>
-            <w:pPr>
-              <w:pStyle w:val="Compact"/>
-              <w:jc w:val="right"/>
-            </w:pPr>
-            <w:r>
-              <w:t xml:space="preserve">365</w:t>
-            </w:r>
-          </w:p>
-        </w:tc>
-        <w:tc>
-          <w:tcPr/>
-          <w:p>
-            <w:pPr>
-              <w:pStyle w:val="Compact"/>
-            </w:pPr>
-            <w:r>
-              <w:t xml:space="preserve">Actuele leeslaag voor 53 kavels binnen</w:t>
-            </w:r>
-            <w:r>
-              <w:t xml:space="preserve"> </w:t>
-            </w:r>
-            <w:r>
-              <w:rPr>
-                <w:rStyle w:val="VerbatimChar"/>
-              </w:rPr>
-              <w:t xml:space="preserve">meijendel_natura2000</w:t>
-            </w:r>
-            <w:r>
-              <w:t xml:space="preserve">; M66 en M91 zijn uitgesloten.</w:t>
-            </w:r>
-          </w:p>
-        </w:tc>
-      </w:tr>
-    </w:tbl>
-    <w:p>
-      <w:pPr>
-        <w:pStyle w:val="FirstParagraph"/>
-      </w:pPr>
-      <w:r>
-        <w:t xml:space="preserve">De maatregelactualisering gebruikt deze laag alleen wanneer de maatregellocatie volledig en letterlijk overeenkomt met één of meer geometriseerde naamobjecten. Daarmee zijn 32 relaties voor zes uitvoeringen toegevoegd. Uitvoeringen met een brede locatie, een niet-geometriseerde naam, een gedeeltelijk geometriseerde samengestelde locatie of een afwijkende naam blijven buiten de automatische koppeling.</w:t>
-      </w:r>
-    </w:p>
-    <w:p>
-      <w:pPr>
-        <w:pStyle w:val="Heading2"/>
-      </w:pPr>
-      <w:bookmarkStart w:id="24" w:name="_c4d8e63f8d951db14c31b0e8e0c5017e65b09fe"/>
-      <w:r>
-        <w:t xml:space="preserve">Website dashboard en Shiny beschermen</w:t>
-      </w:r>
-      <w:bookmarkEnd w:id="24"/>
-    </w:p>
-    <w:p>
-      <w:pPr>
-        <w:pStyle w:val="FirstParagraph"/>
-      </w:pPr>
-      <w:r>
-        <w:t xml:space="preserve">De eerdere inventarisatie vond geen rechtstreeks gebruik van de 146</w:t>
-      </w:r>
-      <w:r>
-        <w:t xml:space="preserve"> </w:t>
-      </w:r>
-      <w:r>
-        <w:rPr>
-          <w:rStyle w:val="VerbatimChar"/>
-        </w:rPr>
-        <w:t xml:space="preserve">ndff_*</w:t>
-      </w:r>
-      <w:r>
-        <w:t xml:space="preserve">-, vier</w:t>
-      </w:r>
-      <w:r>
-        <w:t xml:space="preserve"> </w:t>
-      </w:r>
-      <w:r>
-        <w:rPr>
-          <w:rStyle w:val="VerbatimChar"/>
-        </w:rPr>
-        <w:t xml:space="preserve">externe_ecologie_*</w:t>
-      </w:r>
-      <w:r>
-        <w:t xml:space="preserve">- en zes</w:t>
-      </w:r>
-      <w:r>
-        <w:t xml:space="preserve"> </w:t>
-      </w:r>
-      <w:r>
-        <w:rPr>
-          <w:rStyle w:val="VerbatimChar"/>
-        </w:rPr>
-        <w:t xml:space="preserve">vangblik*</w:t>
-      </w:r>
-      <w:r>
-        <w:t xml:space="preserve">-tabellen in de publieke website, reguliere Shiny-cache of openbare dashboardketen. Dat geeft ruimte, maar betekent niet dat die 156 tabellen losstaan. Imports, audits, ruimtelijke verwerking, bestaande views en exportvalidatie gebruiken ze wel. Voor deze herschrijving zijn de relevante cache- en exportcontracten opnieuw gecontroleerd; er is geen productieproef uitgevoerd.</w:t>
-      </w:r>
-    </w:p>
-    <w:p>
-      <w:pPr>
-        <w:pStyle w:val="BodyText"/>
-      </w:pPr>
-      <w:r>
-        <w:t xml:space="preserve">PQ is wel aangesloten. Shiny leest</w:t>
-      </w:r>
-      <w:r>
-        <w:t xml:space="preserve"> </w:t>
-      </w:r>
-      <w:r>
-        <w:rPr>
-          <w:rStyle w:val="VerbatimChar"/>
-        </w:rPr>
-        <w:t xml:space="preserve">pq_plot_jaar_vegetatie</w:t>
-      </w:r>
-      <w:r>
-        <w:t xml:space="preserve"> </w:t>
-      </w:r>
-      <w:r>
-        <w:t xml:space="preserve">en gebruikt soortenrijkdom, bedekkingssom en Shannon in model- en omgevingsgegevens. De website leest de bestaande</w:t>
-      </w:r>
-      <w:r>
-        <w:t xml:space="preserve"> </w:t>
-      </w:r>
-      <w:r>
-        <w:rPr>
-          <w:rStyle w:val="VerbatimChar"/>
-        </w:rPr>
-        <w:t xml:space="preserve">website_plot_vegetatie_jaar</w:t>
-      </w:r>
-      <w:r>
-        <w:t xml:space="preserve">, die naar dezelfde PQ-afleiding verwijst. Foutafhandeling kan een leeg vegetatieonderdeel opleveren terwijl de pagina gewoon opent. Vergelijk daarom de 513 plot-jaarregels uit 1981–2025, waarden, ontbrekende waarden en bronvermelding vóór en na de structurele migratie.</w:t>
-      </w:r>
-    </w:p>
-    <w:p>
-      <w:pPr>
-        <w:pStyle w:val="BodyText"/>
-      </w:pPr>
-      <w:r>
-        <w:t xml:space="preserve">Nieuwe PQ-opnamen mogen bij een afzonderlijk inhoudelijk besluit later doorwerken in de toepassingen. Het toevoegen van bronnen mag echter niet ongemerkt de provinciale controlebasis of bestaande vogelmodellen veranderen. Scheid structureel verplaatsen met gelijke uitkomsten van inhoudelijk verrijken met expliciet beoordeelde nieuwe uitkomsten.</w:t>
-      </w:r>
-    </w:p>
-    <w:p>
-      <w:pPr>
-        <w:pStyle w:val="BodyText"/>
-      </w:pPr>
-      <w:r>
-        <w:t xml:space="preserve">Verder moeten deze afhankelijkheden mee:</w:t>
-      </w:r>
-    </w:p>
-    <w:p>
-      <w:pPr>
-        <w:pStyle w:val="Compact"/>
-        <w:numPr>
-          <w:ilvl w:val="0"/>
-          <w:numId w:val="1002"/>
-        </w:numPr>
-      </w:pPr>
-      <w:r>
-        <w:t xml:space="preserve">foreign keys, indexes, rechten en eventuele routines of triggers;</w:t>
-      </w:r>
-    </w:p>
-    <w:p>
-      <w:pPr>
-        <w:pStyle w:val="Compact"/>
-        <w:numPr>
-          <w:ilvl w:val="0"/>
-          <w:numId w:val="1002"/>
-        </w:numPr>
-      </w:pPr>
-      <w:r>
-        <w:t xml:space="preserve">bestaande views en beveiligde onderzoeksviews die naar openbare NDFF-tabellen verwijzen, met behoud van de beveiligingsgrens;</w:t>
-      </w:r>
-    </w:p>
-    <w:p>
-      <w:pPr>
-        <w:pStyle w:val="Compact"/>
-        <w:numPr>
-          <w:ilvl w:val="0"/>
-          <w:numId w:val="1002"/>
-        </w:numPr>
-      </w:pPr>
-      <w:r>
-        <w:t xml:space="preserve">dynamische tabelnamen in imports en audits, naast letterlijk geschreven namen;</w:t>
-      </w:r>
-    </w:p>
-    <w:p>
-      <w:pPr>
-        <w:pStyle w:val="Compact"/>
-        <w:numPr>
-          <w:ilvl w:val="0"/>
-          <w:numId w:val="1002"/>
-        </w:numPr>
-      </w:pPr>
-      <w:r>
-        <w:t xml:space="preserve">tabelnamen die als gegevens zijn opgeslagen, waaronder</w:t>
-      </w:r>
-      <w:r>
-        <w:t xml:space="preserve"> </w:t>
-      </w:r>
-      <w:r>
-        <w:rPr>
-          <w:rStyle w:val="VerbatimChar"/>
-        </w:rPr>
-        <w:t xml:space="preserve">analyse_datareeks.bron_object</w:t>
-      </w:r>
-      <w:r>
-        <w:t xml:space="preserve"> </w:t>
-      </w:r>
-      <w:r>
-        <w:t xml:space="preserve">en ruimtelijke bronverwijzingen;</w:t>
-      </w:r>
-    </w:p>
-    <w:p>
-      <w:pPr>
-        <w:pStyle w:val="Compact"/>
-        <w:numPr>
-          <w:ilvl w:val="0"/>
-          <w:numId w:val="1002"/>
-        </w:numPr>
-      </w:pPr>
-      <w:r>
-        <w:t xml:space="preserve">de exportcontrole die nu expliciet</w:t>
-      </w:r>
-      <w:r>
-        <w:t xml:space="preserve"> </w:t>
-      </w:r>
-      <w:r>
-        <w:rPr>
-          <w:rStyle w:val="VerbatimChar"/>
-        </w:rPr>
-        <w:t xml:space="preserve">ndff_open_waarneming</w:t>
-      </w:r>
-      <w:r>
-        <w:t xml:space="preserve"> </w:t>
-      </w:r>
-      <w:r>
-        <w:t xml:space="preserve">verlangt, plus de dump- en Shiny-cachecontracten.</w:t>
-      </w:r>
-    </w:p>
-    <w:p>
-      <w:pPr>
-        <w:pStyle w:val="FirstParagraph"/>
-      </w:pPr>
-      <w:r>
-        <w:t xml:space="preserve">Bronbestanden, bron-ID's, hashes en historische regelversies worden niet cosmetisch herschreven. Er komen geen nieuwe overzichts- of compatibiliteitsviews. Bestaande noodzakelijke views moeten bij een daadwerkelijke migratie correct blijven verwijzen.</w:t>
-      </w:r>
-    </w:p>
-    <w:p>
-      <w:pPr>
-        <w:pStyle w:val="Heading2"/>
-      </w:pPr>
-      <w:bookmarkStart w:id="25" w:name="_ea82a111b7c3651db8ff74dc66ba0e01efd62c3"/>
-      <w:r>
-        <w:t xml:space="preserve">Veilige uitvoervolgorde</w:t>
-      </w:r>
-      <w:bookmarkEnd w:id="25"/>
-    </w:p>
-    <w:p>
-      <w:pPr>
-        <w:pStyle w:val="FirstParagraph"/>
-      </w:pPr>
-      <w:r>
-        <w:t xml:space="preserve">Eerst werken we één volledige familie uit op een geïsoleerde databasekopie. Libellen is daarvoor geschikt: 32.325 bronwaarnemingen uit 1950–2025, plus de bestaande route-, geometrie-, bezoek- en taxonbereikstructuur. De proef omvat meer dan vier namen veranderen. Zij moet bewijzen dat de groepsfamilie ook een tweede bron kan ontvangen zonder dubbele metingen, verlies van herkomst of wijziging van nulbetekenis. Een technische testlevering wordt als test gemarkeerd en wordt geen nieuwe ecologische bron.</w:t>
-      </w:r>
-    </w:p>
-    <w:p>
-      <w:pPr>
-        <w:pStyle w:val="BodyText"/>
-      </w:pPr>
-      <w:r>
-        <w:t xml:space="preserve">Daarna volgt de PQ-uitwerking: brongebonden locatie- en opname-identiteit toevoegen en een afgebakende, reeds gekoppelde LVD-selectie vergelijken met de provinciale reeks. Begin met bevestigde overeenkomsten; behandel waarschijnlijke koppelingen afzonderlijk. Voor iedere kandidaat staat vast of deze verrijkt, toevoegt, dubbel is of conflicteert. De eerste acceptatie-eis is behoud van de bestaande 513 plot-jaaruitkomsten uit 1981–2025.</w:t>
-      </w:r>
-    </w:p>
-    <w:p>
-      <w:pPr>
-        <w:pStyle w:val="BodyText"/>
-      </w:pPr>
-      <w:r>
-        <w:t xml:space="preserve">Vervolgens volgen de overige soortenfamilies in samenhangende groepen. Kevers zijn een bruikbare tweede soortproef omdat NDFF, Naturalis en Vangblik daar samenkomen. Gemengde monsters en de algemene beslis- en bronlaag gaan pas over wanneer hun volledige verwijzingsketen is uitgewerkt.</w:t>
-      </w:r>
-    </w:p>
-    <w:p>
-      <w:pPr>
-        <w:pStyle w:val="BodyText"/>
-      </w:pPr>
-      <w:r>
-        <w:t xml:space="preserve">Iedere proef levert een concrete oude–nieuwe objectkaart, sleutelvertaling, importaanpassing en herstelprocedure op. Vergelijk volledige sleutelsets, aantallen, inhoudshashes, bronverwijzingen, nulstatussen en toegelaten selecties. Een verschil is verklaard of blokkeert de overgang. Controleer tevens herhaalde import: hetzelfde bestand mag geen extra metingen opleveren.</w:t>
-      </w:r>
-    </w:p>
-    <w:p>
-      <w:pPr>
-        <w:pStyle w:val="BodyText"/>
-      </w:pPr>
-      <w:r>
-        <w:t xml:space="preserve">Pas na goedkeuring volgt uitvoering in de levende lokale database, met gecontroleerde back-up en zonder gelijktijdige imports. Daarna volgt de normale gevalideerde dump-, cache- en releaseketen. Productie blijft afnemer van de lokale canonieke database. Herstel bestaat uit een geteste schema- en gegevensherstelroute met de bijpassende codeversie; een algemene transactie-rollback is onvoldoende voor DDL-wijzigingen.</w:t>
-      </w:r>
-    </w:p>
-    <w:p>
-      <w:pPr>
-        <w:pStyle w:val="BodyText"/>
-      </w:pPr>
-      <w:r>
-        <w:t xml:space="preserve">De aanbevolen eerstvolgende stap is een concreet libellenproefontwerp, inclusief fysieke tabellen en migratiecontroles. Geen brede live-hernoeming. PQ blijft een eigen, bronoverstijgende familie en wordt expliciet als volgende migratieproef uitgewerkt.</w:t>
-      </w:r>
-    </w:p>
-    <w:p>
-      <w:pPr>
-        <w:pStyle w:val="Heading2"/>
-      </w:pPr>
-      <w:bookmarkStart w:id="26" w:name="_b3cd443c91657a82ff5685c38edcf4074cc84d4"/>
-      <w:r>
-        <w:t xml:space="preserve">Onderbouwing en grenzen</w:t>
-      </w:r>
-      <w:bookmarkEnd w:id="26"/>
-    </w:p>
-    <w:p>
-      <w:pPr>
-        <w:pStyle w:val="FirstParagraph"/>
-      </w:pPr>
-      <w:r>
-        <w:t xml:space="preserve">Groepen, rijtellingen en bronverdelingen zijn read-only gecontroleerd in de levende lokale database op 26 september 2026. Van de 248 fysieke tabellen staan er 163 in de bijlage: 146 NDFF, vier externe ecologie, zes Vangblik en zeven PQ. Ook de niet-vogelgegevens in AVIMAP zijn onderzocht.</w:t>
-      </w:r>
-    </w:p>
-    <w:p>
-      <w:pPr>
-        <w:pStyle w:val="BodyText"/>
-      </w:pPr>
-      <w:r>
-        <w:t xml:space="preserve">De bijlage geeft bestemmingsrichtingen, geen uitvoerbare naamskaart. Rijtellingen stammen uit de nulmeting van dezelfde datum. Niet alle reconstructietabellen hebben een afzonderlijk gecontroleerde meetperiode; hun technische rijaantallen zijn geen zelfstandige meetreeks.</w:t>
-      </w:r>
-    </w:p>
-    <w:p>
-      <w:pPr>
-        <w:pStyle w:val="BodyText"/>
-      </w:pPr>
-      <w:r>
-        <w:t xml:space="preserve">Geraadpleegd zijn de projectinstructies, README, TODO, DECISIONS, architectuur, eerdere inventaris en</w:t>
-      </w:r>
-      <w:r>
-        <w:t xml:space="preserve"> </w:t>
-      </w:r>
-      <w:r>
-        <w:rPr>
-          <w:rStyle w:val="VerbatimChar"/>
-        </w:rPr>
-        <w:t xml:space="preserve">docs/MEIJENDEL_BRONREGISTER.md</w:t>
-      </w:r>
-      <w:r>
-        <w:t xml:space="preserve">; de openbare NDFF-, protocolkwaliteit- en externe-ecologieschema's; import- en overlapdefinities; Shiny</w:t>
-      </w:r>
-      <w:r>
-        <w:t xml:space="preserve"> </w:t>
-      </w:r>
-      <w:r>
-        <w:rPr>
-          <w:rStyle w:val="VerbatimChar"/>
-        </w:rPr>
-        <w:t xml:space="preserve">helpers.R</w:t>
-      </w:r>
-      <w:r>
-        <w:t xml:space="preserve">, cachecontracttest, exportvalidator en websitequery voor plotvegetatie.</w:t>
-      </w:r>
-    </w:p>
-    <w:p>
-      <w:pPr>
-        <w:pStyle w:val="BodyText"/>
-      </w:pPr>
-      <w:r>
-        <w:t xml:space="preserve">Bronrechten, toelating en bruikbaarheid zijn niet opnieuw vastgesteld; het bronregister blijft leidend. Geen T7- of NAS-bestanden geopend, nieuwe bronnen aangevraagd of database, dump, cache en productie gewijzigd.</w:t>
-      </w:r>
-    </w:p>
-    <w:p>
-      <w:pPr>
-        <w:pStyle w:val="Heading2"/>
-      </w:pPr>
-      <w:bookmarkStart w:id="27" w:name="_3a68ce2518fa2826494f15f4a6805cb1b04675a"/>
-      <w:r>
-        <w:t xml:space="preserve">Bijlage huidige tabellen en bestemmingsrichting</w:t>
-      </w:r>
-      <w:bookmarkEnd w:id="27"/>
-    </w:p>
-    <w:p>
-      <w:pPr>
-        <w:pStyle w:val="FirstParagraph"/>
-      </w:pPr>
-      <w:r>
-        <w:t xml:space="preserve">Alle 163 tabelnamen blijven hier terugvindbaar. De aantallen zijn technische rijtellingen van 26 september 2026, geen optelbare onafhankelijke waarnemingen. Een richting met meerdere bestemmingen vereist gegevensverdeling; zij is geen RENAME-opdracht. Definitieve doelnamen en sleutelvertalingen worden in de migratieproef getoetst.</w:t>
-      </w:r>
-    </w:p>
-    <w:p>
-      <w:pPr>
-        <w:pStyle w:val="Heading3"/>
-      </w:pPr>
-      <w:bookmarkStart w:id="28" w:name="_soortgroepindexen"/>
-      <w:r>
-        <w:t xml:space="preserve">Soortgroepindexen</w:t>
-      </w:r>
-      <w:bookmarkEnd w:id="28"/>
-    </w:p>
-    <w:p>
-      <w:pPr>
-        <w:pStyle w:val="FirstParagraph"/>
-      </w:pPr>
-      <w:r>
-        <w:t xml:space="preserve">Voor elk van deze 26 indexen geldt: de bestemming wordt een volwaardige bronoverstijgende familie. Alleen de huidige enkelkolomsindex hernoemen is niet het eindbeeld.</w:t>
-      </w:r>
-    </w:p>
-    <w:tbl>
-      <w:tblPr>
-        <w:tblStyle w:val="Table"/>
-        <w:tblW w:type="auto" w:w="0"/>
-        <w:tblLook w:firstRow="1" w:lastRow="0" w:firstColumn="0" w:lastColumn="0" w:noHBand="0" w:noVBand="0" w:val="0020"/>
-      </w:tblPr>
-      <w:tblGrid>
-        <w:gridCol w:w="2640"/>
-        <w:gridCol w:w="2640"/>
-        <w:gridCol w:w="2640"/>
-      </w:tblGrid>
-      <w:tr>
-        <w:trPr>
-          <w:tblHeader w:val="on"/>
-        </w:trPr>
-        <w:tc>
-          <w:tcPr/>
-          <w:p>
-            <w:pPr>
-              <w:pStyle w:val="Compact"/>
-            </w:pPr>
-            <w:r>
               <w:t xml:space="preserve">Huidige tabel</w:t>
             </w:r>
           </w:p>
@@ -6317,13 +6322,14 @@
     <w:tbl>
       <w:tblPr>
         <w:tblStyle w:val="Table"/>
-        <w:tblW w:type="auto" w:w="0"/>
+        <w:tblW w:type="pct" w:w="5000"/>
+        <w:tblLayout w:type="fixed"/>
         <w:tblLook w:firstRow="1" w:lastRow="0" w:firstColumn="0" w:lastColumn="0" w:noHBand="0" w:noVBand="0" w:val="0020"/>
       </w:tblPr>
       <w:tblGrid>
-        <w:gridCol w:w="2640"/>
-        <w:gridCol w:w="2640"/>
-        <w:gridCol w:w="2640"/>
+        <w:gridCol w:w="2376"/>
+        <w:gridCol w:w="3168"/>
+        <w:gridCol w:w="2376"/>
       </w:tblGrid>
       <w:tr>
         <w:trPr>
@@ -9864,13 +9870,14 @@
     <w:tbl>
       <w:tblPr>
         <w:tblStyle w:val="Table"/>
-        <w:tblW w:type="auto" w:w="0"/>
+        <w:tblW w:type="pct" w:w="5000"/>
+        <w:tblLayout w:type="fixed"/>
         <w:tblLook w:firstRow="1" w:lastRow="0" w:firstColumn="0" w:lastColumn="0" w:noHBand="0" w:noVBand="0" w:val="0020"/>
       </w:tblPr>
       <w:tblGrid>
-        <w:gridCol w:w="2640"/>
-        <w:gridCol w:w="2640"/>
-        <w:gridCol w:w="2640"/>
+        <w:gridCol w:w="2376"/>
+        <w:gridCol w:w="3168"/>
+        <w:gridCol w:w="2376"/>
       </w:tblGrid>
       <w:tr>
         <w:trPr>
@@ -10705,13 +10712,14 @@
     <w:tbl>
       <w:tblPr>
         <w:tblStyle w:val="Table"/>
-        <w:tblW w:type="auto" w:w="0"/>
+        <w:tblW w:type="pct" w:w="5000"/>
+        <w:tblLayout w:type="fixed"/>
         <w:tblLook w:firstRow="1" w:lastRow="0" w:firstColumn="0" w:lastColumn="0" w:noHBand="0" w:noVBand="0" w:val="0020"/>
       </w:tblPr>
       <w:tblGrid>
-        <w:gridCol w:w="2640"/>
-        <w:gridCol w:w="2640"/>
-        <w:gridCol w:w="2640"/>
+        <w:gridCol w:w="2376"/>
+        <w:gridCol w:w="3168"/>
+        <w:gridCol w:w="2376"/>
       </w:tblGrid>
       <w:tr>
         <w:trPr>
@@ -11429,13 +11437,14 @@
     <w:tbl>
       <w:tblPr>
         <w:tblStyle w:val="Table"/>
-        <w:tblW w:type="auto" w:w="0"/>
+        <w:tblW w:type="pct" w:w="5000"/>
+        <w:tblLayout w:type="fixed"/>
         <w:tblLook w:firstRow="1" w:lastRow="0" w:firstColumn="0" w:lastColumn="0" w:noHBand="0" w:noVBand="0" w:val="0020"/>
       </w:tblPr>
       <w:tblGrid>
-        <w:gridCol w:w="2640"/>
-        <w:gridCol w:w="2640"/>
-        <w:gridCol w:w="2640"/>
+        <w:gridCol w:w="2376"/>
+        <w:gridCol w:w="3168"/>
+        <w:gridCol w:w="2376"/>
       </w:tblGrid>
       <w:tr>
         <w:trPr>
@@ -11646,13 +11655,14 @@
     <w:tbl>
       <w:tblPr>
         <w:tblStyle w:val="Table"/>
-        <w:tblW w:type="auto" w:w="0"/>
+        <w:tblW w:type="pct" w:w="5000"/>
+        <w:tblLayout w:type="fixed"/>
         <w:tblLook w:firstRow="1" w:lastRow="0" w:firstColumn="0" w:lastColumn="0" w:noHBand="0" w:noVBand="0" w:val="0020"/>
       </w:tblPr>
       <w:tblGrid>
-        <w:gridCol w:w="2640"/>
-        <w:gridCol w:w="2640"/>
-        <w:gridCol w:w="2640"/>
+        <w:gridCol w:w="2376"/>
+        <w:gridCol w:w="3168"/>
+        <w:gridCol w:w="2376"/>
       </w:tblGrid>
       <w:tr>
         <w:trPr>
@@ -11941,13 +11951,14 @@
     <w:tbl>
       <w:tblPr>
         <w:tblStyle w:val="Table"/>
-        <w:tblW w:type="auto" w:w="0"/>
+        <w:tblW w:type="pct" w:w="5000"/>
+        <w:tblLayout w:type="fixed"/>
         <w:tblLook w:firstRow="1" w:lastRow="0" w:firstColumn="0" w:lastColumn="0" w:noHBand="0" w:noVBand="0" w:val="0020"/>
       </w:tblPr>
       <w:tblGrid>
-        <w:gridCol w:w="2640"/>
-        <w:gridCol w:w="2640"/>
-        <w:gridCol w:w="2640"/>
+        <w:gridCol w:w="2376"/>
+        <w:gridCol w:w="3168"/>
+        <w:gridCol w:w="2376"/>
       </w:tblGrid>
       <w:tr>
         <w:trPr>

</xml_diff>

<commit_message>
Koppel infiltratieplas 27.2 aan M77
</commit_message>
<xml_diff>
--- a/docs/database/MEIJENDEL_TABELINVENTARIS.docx
+++ b/docs/database/MEIJENDEL_TABELINVENTARIS.docx
@@ -1590,7 +1590,7 @@
         <w:t xml:space="preserve"> </w:t>
       </w:r>
       <w:r>
-        <w:t xml:space="preserve">voor oorspronkelijke bron-ID's en hun relatie met de gemeenschappelijke objecten.</w:t>
+        <w:t xml:space="preserve">voor oorspronkelijke bron-ID’s en hun relatie met de gemeenschappelijke objecten.</w:t>
       </w:r>
     </w:p>
     <w:p>
@@ -1788,7 +1788,8 @@
     <w:tbl>
       <w:tblPr>
         <w:tblStyle w:val="Table"/>
-        <w:tblW w:type="auto" w:w="0"/>
+        <w:tblW w:type="pct" w:w="5000"/>
+        <w:tblLayout w:type="fixed"/>
         <w:tblLook w:firstRow="1" w:lastRow="0" w:firstColumn="0" w:lastColumn="0" w:noHBand="0" w:noVBand="0" w:val="0020"/>
       </w:tblPr>
       <w:tblGrid>
@@ -2485,13 +2486,14 @@
         <w:t xml:space="preserve"> </w:t>
       </w:r>
       <w:r>
-        <w:t xml:space="preserve">is een importverzameling, geen inhoudelijke hoofdcategorie. De zes datasets omvatten 98.916 resultaten uit 1875–2025 in 10.994 events. Verdeel de resultaten naar de juiste groep of naar PQ; behoud dataset, event, bron-ID's, eenheden, rechten en overlapbesluiten.</w:t>
+        <w:t xml:space="preserve">is een importverzameling, geen inhoudelijke hoofdcategorie. De zes datasets omvatten 98.916 resultaten uit 1875–2025 in 10.994 events. Verdeel de resultaten naar de juiste groep of naar PQ; behoud dataset, event, bron-ID’s, eenheden, rechten en overlapbesluiten.</w:t>
       </w:r>
     </w:p>
     <w:tbl>
       <w:tblPr>
         <w:tblStyle w:val="Table"/>
-        <w:tblW w:type="auto" w:w="0"/>
+        <w:tblW w:type="pct" w:w="5000"/>
+        <w:tblLayout w:type="fixed"/>
         <w:tblLook w:firstRow="1" w:lastRow="0" w:firstColumn="0" w:lastColumn="0" w:noHBand="0" w:noVBand="0" w:val="0020"/>
       </w:tblPr>
       <w:tblGrid>
@@ -2544,7 +2546,7 @@
               <w:pStyle w:val="Compact"/>
             </w:pPr>
             <w:r>
-              <w:t xml:space="preserve">Naar passende watergebonden flora- en faunagroepen; gezamenlijk monster behouden. Alle 1.036 resultaat-JSON's missen kingdom, phylum, class en order en hebben geen exacte naamovereenkomst met de huidige NDFF-taxonnamen. Eerst aanwezige bronmetadata en taxoncodes vertalen; niet alles als insecten behandelen.</w:t>
+              <w:t xml:space="preserve">Naar passende watergebonden flora- en faunagroepen; gezamenlijk monster behouden. Alle 1.036 resultaat-JSON’s missen kingdom, phylum, class en order en hebben geen exacte naamovereenkomst met de huidige NDFF-taxonnamen. Eerst aanwezige bronmetadata en taxoncodes vertalen; niet alles als insecten behandelen.</w:t>
             </w:r>
           </w:p>
         </w:tc>
@@ -2764,7 +2766,7 @@
         <w:t xml:space="preserve">zoogdieren_overig_*</w:t>
       </w:r>
       <w:r>
-        <w:t xml:space="preserve">, op taxon- en vangstniveau. Die verwijzen naar de bestaande vangst-ID's en mogen niet als een tweede verzameling vangsten worden opgeteld.</w:t>
+        <w:t xml:space="preserve">, op taxon- en vangstniveau. Die verwijzen naar de bestaande vangst-ID’s en mogen niet als een tweede verzameling vangsten worden opgeteld.</w:t>
       </w:r>
     </w:p>
     <w:p>
@@ -2817,7 +2819,7 @@
         <w:t xml:space="preserve"> </w:t>
       </w:r>
       <w:r>
-        <w:t xml:space="preserve">blijft behouden en wordt bronoverstijgend gemaakt. De provinciale basis bevat 254 PQ-locaties, 2.007 opnamen en 53.122 taxonresultaten uit 1981–2025. De afleiding naar vogelplots bevat 513 plot-jaarregels uit dezelfde periode. Deze bestaande ID's en uitkomsten vormen de controlebasis.</w:t>
+        <w:t xml:space="preserve">blijft behouden en wordt bronoverstijgend gemaakt. De provinciale basis bevat 254 PQ-locaties, 2.007 opnamen en 53.122 taxonresultaten uit 1981–2025. De afleiding naar vogelplots bevat 513 plot-jaarregels uit dezelfde periode. Deze bestaande ID’s en uitkomsten vormen de controlebasis.</w:t>
       </w:r>
     </w:p>
     <w:p>
@@ -2980,7 +2982,7 @@
         <w:t xml:space="preserve"> </w:t>
       </w:r>
       <w:r>
-        <w:t xml:space="preserve">is onvoldoende wanneer verschillende organisaties hetzelfde nummer gebruiken. Behoud bestaande interne ID's en voeg brongebonden identificaties toe, bijvoorbeeld in</w:t>
+        <w:t xml:space="preserve">is onvoldoende wanneer verschillende organisaties hetzelfde nummer gebruiken. Behoud bestaande interne ID’s en voeg brongebonden identificaties toe, bijvoorbeeld in</w:t>
       </w:r>
       <w:r>
         <w:t xml:space="preserve"> </w:t>
@@ -3027,7 +3029,7 @@
         <w:pStyle w:val="BodyText"/>
       </w:pPr>
       <w:r>
-        <w:t xml:space="preserve">Leg bron, versie, oorspronkelijk locatie- of opname-ID, intern ID, koppelmethode en bewijs vast. Meerdere broncodes mogen naar dezelfde PQ verwijzen wanneer die gelijkheid is vastgesteld. Nieuwe PQ's krijgen een eigen interne identiteit. Nieuwe broncodes worden nooit blind als bestaande provinciale nummers geïnterpreteerd.</w:t>
+        <w:t xml:space="preserve">Leg bron, versie, oorspronkelijk locatie- of opname-ID, intern ID, koppelmethode en bewijs vast. Meerdere broncodes mogen naar dezelfde PQ verwijzen wanneer die gelijkheid is vastgesteld. Nieuwe PQ’s krijgen een eigen interne identiteit. Nieuwe broncodes worden nooit blind als bestaande provinciale nummers geïnterpreteerd.</w:t>
       </w:r>
     </w:p>
     <w:p>
@@ -3091,6 +3093,2128 @@
       </w:pPr>
       <w:r>
         <w:t xml:space="preserve">Het volledige voorstel is een gegevensmigratie. De complexiteit zit vooral in identiteit, gemengde meetstructuren en behoud van de bestaande betekenis.</w:t>
+      </w:r>
+    </w:p>
+    <w:tbl>
+      <w:tblPr>
+        <w:tblStyle w:val="Table"/>
+        <w:tblW w:type="pct" w:w="5000"/>
+        <w:tblLayout w:type="fixed"/>
+        <w:tblLook w:firstRow="1" w:lastRow="0" w:firstColumn="0" w:lastColumn="0" w:noHBand="0" w:noVBand="0" w:val="0020"/>
+      </w:tblPr>
+      <w:tblGrid>
+        <w:gridCol w:w="2640"/>
+        <w:gridCol w:w="2640"/>
+        <w:gridCol w:w="2640"/>
+      </w:tblGrid>
+      <w:tr>
+        <w:trPr>
+          <w:tblHeader w:val="on"/>
+        </w:trPr>
+        <w:tc>
+          <w:tcPr/>
+          <w:p>
+            <w:pPr>
+              <w:pStyle w:val="Compact"/>
+            </w:pPr>
+            <w:r>
+              <w:t xml:space="preserve">Onderdeel</w:t>
+            </w:r>
+          </w:p>
+        </w:tc>
+        <w:tc>
+          <w:tcPr/>
+          <w:p>
+            <w:pPr>
+              <w:pStyle w:val="Compact"/>
+            </w:pPr>
+            <w:r>
+              <w:t xml:space="preserve">Zwaarte</w:t>
+            </w:r>
+          </w:p>
+        </w:tc>
+        <w:tc>
+          <w:tcPr/>
+          <w:p>
+            <w:pPr>
+              <w:pStyle w:val="Compact"/>
+            </w:pPr>
+            <w:r>
+              <w:t xml:space="preserve">Wat het vergt</w:t>
+            </w:r>
+          </w:p>
+        </w:tc>
+      </w:tr>
+      <w:tr>
+        <w:tc>
+          <w:tcPr/>
+          <w:p>
+            <w:pPr>
+              <w:pStyle w:val="Compact"/>
+            </w:pPr>
+            <w:r>
+              <w:t xml:space="preserve">Een afgebakende meetfamilie hernoemen</w:t>
+            </w:r>
+          </w:p>
+        </w:tc>
+        <w:tc>
+          <w:tcPr/>
+          <w:p>
+            <w:pPr>
+              <w:pStyle w:val="Compact"/>
+            </w:pPr>
+            <w:r>
+              <w:t xml:space="preserve">Beperkt tot middelgroot</w:t>
+            </w:r>
+          </w:p>
+        </w:tc>
+        <w:tc>
+          <w:tcPr/>
+          <w:p>
+            <w:pPr>
+              <w:pStyle w:val="Compact"/>
+            </w:pPr>
+            <w:r>
+              <w:t xml:space="preserve">Schema, verwijzingen, import en tests samen aanpassen. De vier huidige</w:t>
+            </w:r>
+            <w:r>
+              <w:t xml:space="preserve"> </w:t>
+            </w:r>
+            <w:r>
+              <w:rPr>
+                <w:rStyle w:val="VerbatimChar"/>
+              </w:rPr>
+              <w:t xml:space="preserve">ndff_libel_*</w:t>
+            </w:r>
+            <w:r>
+              <w:t xml:space="preserve">-tabellen zijn een afgebakend voorbeeld.</w:t>
+            </w:r>
+          </w:p>
+        </w:tc>
+      </w:tr>
+      <w:tr>
+        <w:tc>
+          <w:tcPr/>
+          <w:p>
+            <w:pPr>
+              <w:pStyle w:val="Compact"/>
+            </w:pPr>
+            <w:r>
+              <w:t xml:space="preserve">NDFF-waarnemingen naar echte groepsfamilies verdelen</w:t>
+            </w:r>
+          </w:p>
+        </w:tc>
+        <w:tc>
+          <w:tcPr/>
+          <w:p>
+            <w:pPr>
+              <w:pStyle w:val="Compact"/>
+            </w:pPr>
+            <w:r>
+              <w:t xml:space="preserve">Groot</w:t>
+            </w:r>
+          </w:p>
+        </w:tc>
+        <w:tc>
+          <w:tcPr/>
+          <w:p>
+            <w:pPr>
+              <w:pStyle w:val="Compact"/>
+            </w:pPr>
+            <w:r>
+              <w:t xml:space="preserve">Stabiele ID’s, ruimtelijke beoordeling, protocollen, analysebesluiten en de 233 dubbele lidmaatschappen correct meenemen.</w:t>
+            </w:r>
+          </w:p>
+        </w:tc>
+      </w:tr>
+      <w:tr>
+        <w:tc>
+          <w:tcPr/>
+          <w:p>
+            <w:pPr>
+              <w:pStyle w:val="Compact"/>
+            </w:pPr>
+            <w:r>
+              <w:t xml:space="preserve">De zes externe datasets aansluiten</w:t>
+            </w:r>
+          </w:p>
+        </w:tc>
+        <w:tc>
+          <w:tcPr/>
+          <w:p>
+            <w:pPr>
+              <w:pStyle w:val="Compact"/>
+            </w:pPr>
+            <w:r>
+              <w:t xml:space="preserve">Middelgroot tot groot</w:t>
+            </w:r>
+          </w:p>
+        </w:tc>
+        <w:tc>
+          <w:tcPr/>
+          <w:p>
+            <w:pPr>
+              <w:pStyle w:val="Compact"/>
+            </w:pPr>
+            <w:r>
+              <w:t xml:space="preserve">98.916 resultaten uit 1875–2025 per taxon en meetvorm toewijzen. Coleoptera is eenvoudiger af te bakenen dan STOWA.</w:t>
+            </w:r>
+          </w:p>
+        </w:tc>
+      </w:tr>
+      <w:tr>
+        <w:tc>
+          <w:tcPr/>
+          <w:p>
+            <w:pPr>
+              <w:pStyle w:val="Compact"/>
+            </w:pPr>
+            <w:r>
+              <w:t xml:space="preserve">Vangblik vanuit soortgroepen bereikbaar maken</w:t>
+            </w:r>
+          </w:p>
+        </w:tc>
+        <w:tc>
+          <w:tcPr/>
+          <w:p>
+            <w:pPr>
+              <w:pStyle w:val="Compact"/>
+            </w:pPr>
+            <w:r>
+              <w:t xml:space="preserve">Middelgroot</w:t>
+            </w:r>
+          </w:p>
+        </w:tc>
+        <w:tc>
+          <w:tcPr/>
+          <w:p>
+            <w:pPr>
+              <w:pStyle w:val="Compact"/>
+            </w:pPr>
+            <w:r>
+              <w:t xml:space="preserve">Taxonkoppelingen en gecontroleerde verwijzingen voor 60.560 resultaten uit 1953–1960, zonder dubbele telling.</w:t>
+            </w:r>
+          </w:p>
+        </w:tc>
+      </w:tr>
+      <w:tr>
+        <w:tc>
+          <w:tcPr/>
+          <w:p>
+            <w:pPr>
+              <w:pStyle w:val="Compact"/>
+            </w:pPr>
+            <w:r>
+              <w:t xml:space="preserve">Verspreide PQ-informatie samenbrengen</w:t>
+            </w:r>
+          </w:p>
+        </w:tc>
+        <w:tc>
+          <w:tcPr/>
+          <w:p>
+            <w:pPr>
+              <w:pStyle w:val="Compact"/>
+            </w:pPr>
+            <w:r>
+              <w:t xml:space="preserve">Groot</w:t>
+            </w:r>
+          </w:p>
+        </w:tc>
+        <w:tc>
+          <w:tcPr/>
+          <w:p>
+            <w:pPr>
+              <w:pStyle w:val="Compact"/>
+            </w:pPr>
+            <w:r>
+              <w:t xml:space="preserve">Bronsleutels, opnamen, lagen, bedekkingsschalen en overlap vergelijken. Bovendien leest Shiny de huidige PQ-afleiding al.</w:t>
+            </w:r>
+          </w:p>
+        </w:tc>
+      </w:tr>
+      <w:tr>
+        <w:tc>
+          <w:tcPr/>
+          <w:p>
+            <w:pPr>
+              <w:pStyle w:val="Compact"/>
+            </w:pPr>
+            <w:r>
+              <w:t xml:space="preserve">Vogels en bestaande toepassingen beschermen</w:t>
+            </w:r>
+          </w:p>
+        </w:tc>
+        <w:tc>
+          <w:tcPr/>
+          <w:p>
+            <w:pPr>
+              <w:pStyle w:val="Compact"/>
+            </w:pPr>
+            <w:r>
+              <w:t xml:space="preserve">Harde voorwaarde</w:t>
+            </w:r>
+          </w:p>
+        </w:tc>
+        <w:tc>
+          <w:tcPr/>
+          <w:p>
+            <w:pPr>
+              <w:pStyle w:val="Compact"/>
+            </w:pPr>
+            <w:r>
+              <w:t xml:space="preserve">Vogel-ID’s, tabellen, berekeningen en scherminhoud gelijk houden; niet alleen controleren of een pagina opent.</w:t>
+            </w:r>
+          </w:p>
+        </w:tc>
+      </w:tr>
+    </w:tbl>
+    <w:p>
+      <w:pPr>
+        <w:pStyle w:val="FirstParagraph"/>
+      </w:pPr>
+      <w:r>
+        <w:t xml:space="preserve">Een betrouwbare urenraming volgt pas uit een proef op een databasekopie. Het aantal nieuwe tabellen staat evenmin vast: sommige structuren worden hernoemd, andere verdeeld, en gedeelde ondersteuning blijft bijeen. De oude rekensom van 149 hernoemingen en veertien behouden namen geldt dus niet meer.</w:t>
+      </w:r>
+    </w:p>
+    <w:p>
+      <w:pPr>
+        <w:pStyle w:val="BodyText"/>
+      </w:pPr>
+      <w:r>
+        <w:t xml:space="preserve">Taxonvertaling is noodzakelijk.</w:t>
+      </w:r>
+      <w:r>
+        <w:t xml:space="preserve"> </w:t>
+      </w:r>
+      <w:r>
+        <w:rPr>
+          <w:rStyle w:val="VerbatimChar"/>
+        </w:rPr>
+        <w:t xml:space="preserve">ndff_soorten</w:t>
+      </w:r>
+      <w:r>
+        <w:t xml:space="preserve"> </w:t>
+      </w:r>
+      <w:r>
+        <w:t xml:space="preserve">heeft 9.828 bronreferenties, Vangblik 275 bij de reeks 1953–1960, PQ 714 bij 1981–2025 en AVIMAP 35 bij 2009–2026. Externe ecologie heeft 2.894 verschillende opgeslagen wetenschappelijke naamwaarden bij de 98.916 resultaten uit 1875–2025, zonder gemeenschappelijke taxon-foreign-key. Behoud bronnamen, rang en versie en leg gecontroleerde overeenkomsten naast de bronidentiteit vast. De vogelgerichte tabel</w:t>
+      </w:r>
+      <w:r>
+        <w:t xml:space="preserve"> </w:t>
+      </w:r>
+      <w:r>
+        <w:rPr>
+          <w:rStyle w:val="VerbatimChar"/>
+        </w:rPr>
+        <w:t xml:space="preserve">soorten</w:t>
+      </w:r>
+      <w:r>
+        <w:t xml:space="preserve"> </w:t>
+      </w:r>
+      <w:r>
+        <w:t xml:space="preserve">blijft onaangetast.</w:t>
+      </w:r>
+    </w:p>
+    <w:p>
+      <w:pPr>
+        <w:pStyle w:val="Heading2"/>
+      </w:pPr>
+      <w:bookmarkStart w:id="22" w:name="_d275c12976b6db7ca538f1cc96154c39857110d"/>
+      <w:r>
+        <w:t xml:space="preserve">Bronvast werkzaamhedenmodel</w:t>
+      </w:r>
+      <w:bookmarkEnd w:id="22"/>
+    </w:p>
+    <w:p>
+      <w:pPr>
+        <w:pStyle w:val="FirstParagraph"/>
+      </w:pPr>
+      <w:r>
+        <w:t xml:space="preserve">De levende lokale database bevat naast de bestaande classificatie een afzonderlijke laag voor projecten, feitelijke of geplande uitvoeringen, expliciete jaarstatussen en bewijsbronnen. Op 14 oktober 2026 is deze laag aangevuld na controle van alle 807 actieve Zotero-bijlagen. De bestaande tabellen</w:t>
+      </w:r>
+      <w:r>
+        <w:t xml:space="preserve"> </w:t>
+      </w:r>
+      <w:r>
+        <w:rPr>
+          <w:rStyle w:val="VerbatimChar"/>
+        </w:rPr>
+        <w:t xml:space="preserve">maatregelen</w:t>
+      </w:r>
+      <w:r>
+        <w:t xml:space="preserve">,</w:t>
+      </w:r>
+      <w:r>
+        <w:t xml:space="preserve"> </w:t>
+      </w:r>
+      <w:r>
+        <w:rPr>
+          <w:rStyle w:val="VerbatimChar"/>
+        </w:rPr>
+        <w:t xml:space="preserve">maatregelen_kernwoorden</w:t>
+      </w:r>
+      <w:r>
+        <w:t xml:space="preserve"> </w:t>
+      </w:r>
+      <w:r>
+        <w:t xml:space="preserve">en</w:t>
+      </w:r>
+      <w:r>
+        <w:t xml:space="preserve"> </w:t>
+      </w:r>
+      <w:r>
+        <w:rPr>
+          <w:rStyle w:val="VerbatimChar"/>
+        </w:rPr>
+        <w:t xml:space="preserve">plot_jaar_maatregel</w:t>
+      </w:r>
+      <w:r>
+        <w:t xml:space="preserve"> </w:t>
+      </w:r>
+      <w:r>
+        <w:t xml:space="preserve">blijven bestaan. De vier algemene kernwoorden voor recreatiebeheer zijn onder de nieuwe hoofdklasse</w:t>
+      </w:r>
+      <w:r>
+        <w:t xml:space="preserve"> </w:t>
+      </w:r>
+      <w:r>
+        <w:rPr>
+          <w:rStyle w:val="VerbatimChar"/>
+        </w:rPr>
+        <w:t xml:space="preserve">rust_en_recreatiebeheer</w:t>
+      </w:r>
+      <w:r>
+        <w:t xml:space="preserve"> </w:t>
+      </w:r>
+      <w:r>
+        <w:t xml:space="preserve">geplaatst;</w:t>
+      </w:r>
+      <w:r>
+        <w:t xml:space="preserve"> </w:t>
+      </w:r>
+      <w:r>
+        <w:rPr>
+          <w:rStyle w:val="VerbatimChar"/>
+        </w:rPr>
+        <w:t xml:space="preserve">strandreservaat</w:t>
+      </w:r>
+      <w:r>
+        <w:t xml:space="preserve"> </w:t>
+      </w:r>
+      <w:r>
+        <w:t xml:space="preserve">blijft als specifiek kernwoord onder</w:t>
+      </w:r>
+      <w:r>
+        <w:t xml:space="preserve"> </w:t>
+      </w:r>
+      <w:r>
+        <w:rPr>
+          <w:rStyle w:val="VerbatimChar"/>
+        </w:rPr>
+        <w:t xml:space="preserve">strandreservaten</w:t>
+      </w:r>
+      <w:r>
+        <w:t xml:space="preserve"> </w:t>
+      </w:r>
+      <w:r>
+        <w:t xml:space="preserve">herkenbaar.</w:t>
+      </w:r>
+    </w:p>
+    <w:tbl>
+      <w:tblPr>
+        <w:tblStyle w:val="Table"/>
+        <w:tblW w:type="pct" w:w="5000"/>
+        <w:tblLayout w:type="fixed"/>
+        <w:tblLook w:firstRow="1" w:lastRow="0" w:firstColumn="0" w:lastColumn="0" w:noHBand="0" w:noVBand="0" w:val="0020"/>
+      </w:tblPr>
+      <w:tblGrid>
+        <w:gridCol w:w="2376"/>
+        <w:gridCol w:w="3168"/>
+        <w:gridCol w:w="2376"/>
+      </w:tblGrid>
+      <w:tr>
+        <w:trPr>
+          <w:tblHeader w:val="on"/>
+        </w:trPr>
+        <w:tc>
+          <w:tcPr/>
+          <w:p>
+            <w:pPr>
+              <w:pStyle w:val="Compact"/>
+            </w:pPr>
+            <w:r>
+              <w:t xml:space="preserve">Tabel of view</w:t>
+            </w:r>
+          </w:p>
+        </w:tc>
+        <w:tc>
+          <w:tcPr/>
+          <w:p>
+            <w:pPr>
+              <w:pStyle w:val="Compact"/>
+              <w:jc w:val="right"/>
+            </w:pPr>
+            <w:r>
+              <w:t xml:space="preserve">Records</w:t>
+            </w:r>
+          </w:p>
+        </w:tc>
+        <w:tc>
+          <w:tcPr/>
+          <w:p>
+            <w:pPr>
+              <w:pStyle w:val="Compact"/>
+            </w:pPr>
+            <w:r>
+              <w:t xml:space="preserve">Betekenis</w:t>
+            </w:r>
+          </w:p>
+        </w:tc>
+      </w:tr>
+      <w:tr>
+        <w:tc>
+          <w:tcPr/>
+          <w:p>
+            <w:pPr>
+              <w:pStyle w:val="Compact"/>
+            </w:pPr>
+            <w:r>
+              <w:rPr>
+                <w:rStyle w:val="VerbatimChar"/>
+              </w:rPr>
+              <w:t xml:space="preserve">maatregel_project</w:t>
+            </w:r>
+          </w:p>
+        </w:tc>
+        <w:tc>
+          <w:tcPr/>
+          <w:p>
+            <w:pPr>
+              <w:pStyle w:val="Compact"/>
+              <w:jc w:val="right"/>
+            </w:pPr>
+            <w:r>
+              <w:t xml:space="preserve">18</w:t>
+            </w:r>
+          </w:p>
+        </w:tc>
+        <w:tc>
+          <w:tcPr/>
+          <w:p>
+            <w:pPr>
+              <w:pStyle w:val="Compact"/>
+            </w:pPr>
+            <w:r>
+              <w:t xml:space="preserve">Samenhangend project of programma; een project kan meerdere uitvoeringen bevatten.</w:t>
+            </w:r>
+          </w:p>
+        </w:tc>
+      </w:tr>
+      <w:tr>
+        <w:tc>
+          <w:tcPr/>
+          <w:p>
+            <w:pPr>
+              <w:pStyle w:val="Compact"/>
+            </w:pPr>
+            <w:r>
+              <w:rPr>
+                <w:rStyle w:val="VerbatimChar"/>
+              </w:rPr>
+              <w:t xml:space="preserve">maatregel_bron</w:t>
+            </w:r>
+          </w:p>
+        </w:tc>
+        <w:tc>
+          <w:tcPr/>
+          <w:p>
+            <w:pPr>
+              <w:pStyle w:val="Compact"/>
+              <w:jc w:val="right"/>
+            </w:pPr>
+            <w:r>
+              <w:t xml:space="preserve">37</w:t>
+            </w:r>
+          </w:p>
+        </w:tc>
+        <w:tc>
+          <w:tcPr/>
+          <w:p>
+            <w:pPr>
+              <w:pStyle w:val="Compact"/>
+            </w:pPr>
+            <w:r>
+              <w:t xml:space="preserve">25 lokaal geraadpleegde Zotero-bronnen en twaalf officiële of institutionele internetbronnen, ieder met type, datum, status en raadpleegdatum. KIWA Mededeling 114 lokaliseert infiltratieplas 27.2; de officiële PIM-bijlage uit 2013 beschrijft de werkzaamheden en werkperiode.</w:t>
+            </w:r>
+          </w:p>
+        </w:tc>
+      </w:tr>
+      <w:tr>
+        <w:tc>
+          <w:tcPr/>
+          <w:p>
+            <w:pPr>
+              <w:pStyle w:val="Compact"/>
+            </w:pPr>
+            <w:r>
+              <w:rPr>
+                <w:rStyle w:val="VerbatimChar"/>
+              </w:rPr>
+              <w:t xml:space="preserve">maatregel_uitvoering</w:t>
+            </w:r>
+          </w:p>
+        </w:tc>
+        <w:tc>
+          <w:tcPr/>
+          <w:p>
+            <w:pPr>
+              <w:pStyle w:val="Compact"/>
+              <w:jc w:val="right"/>
+            </w:pPr>
+            <w:r>
+              <w:t xml:space="preserve">64</w:t>
+            </w:r>
+          </w:p>
+        </w:tc>
+        <w:tc>
+          <w:tcPr/>
+          <w:p>
+            <w:pPr>
+              <w:pStyle w:val="Compact"/>
+            </w:pPr>
+            <w:r>
+              <w:t xml:space="preserve">Afzonderlijke werkzaamheden of expliciet niet-uitgevoerde, onbekende of geplande activiteiten. Infiltratieplas 27.2 is los van de programmabrede pannenuitvoering geregistreerd, zodat het totale volume van 370.000 m3 niet aan deze plas wordt toegeschreven.</w:t>
+            </w:r>
+          </w:p>
+        </w:tc>
+      </w:tr>
+      <w:tr>
+        <w:tc>
+          <w:tcPr/>
+          <w:p>
+            <w:pPr>
+              <w:pStyle w:val="Compact"/>
+            </w:pPr>
+            <w:r>
+              <w:rPr>
+                <w:rStyle w:val="VerbatimChar"/>
+              </w:rPr>
+              <w:t xml:space="preserve">maatregel_uitvoering_jaar</w:t>
+            </w:r>
+          </w:p>
+        </w:tc>
+        <w:tc>
+          <w:tcPr/>
+          <w:p>
+            <w:pPr>
+              <w:pStyle w:val="Compact"/>
+              <w:jc w:val="right"/>
+            </w:pPr>
+            <w:r>
+              <w:t xml:space="preserve">104</w:t>
+            </w:r>
+          </w:p>
+        </w:tc>
+        <w:tc>
+          <w:tcPr/>
+          <w:p>
+            <w:pPr>
+              <w:pStyle w:val="Compact"/>
+            </w:pPr>
+            <w:r>
+              <w:t xml:space="preserve">Letterlijk onderbouwde jaarstatussen uit 1967–2026: 88 uitgevoerd, 9 niet uitgevoerd en 7 onbekend.</w:t>
+            </w:r>
+          </w:p>
+        </w:tc>
+      </w:tr>
+      <w:tr>
+        <w:tc>
+          <w:tcPr/>
+          <w:p>
+            <w:pPr>
+              <w:pStyle w:val="Compact"/>
+            </w:pPr>
+            <w:r>
+              <w:rPr>
+                <w:rStyle w:val="VerbatimChar"/>
+              </w:rPr>
+              <w:t xml:space="preserve">maatregel_uitvoering_bron</w:t>
+            </w:r>
+          </w:p>
+        </w:tc>
+        <w:tc>
+          <w:tcPr/>
+          <w:p>
+            <w:pPr>
+              <w:pStyle w:val="Compact"/>
+              <w:jc w:val="right"/>
+            </w:pPr>
+            <w:r>
+              <w:t xml:space="preserve">92</w:t>
+            </w:r>
+          </w:p>
+        </w:tc>
+        <w:tc>
+          <w:tcPr/>
+          <w:p>
+            <w:pPr>
+              <w:pStyle w:val="Compact"/>
+            </w:pPr>
+            <w:r>
+              <w:t xml:space="preserve">Relaties tussen uitvoering en bewijsbron, met bronrol en bewijsnotitie. De uitvoering bij infiltratieplas 27.2 verwijst naar de officiële PIM-bijlage, KIWA Mededeling 114 en Dunea’s afrondingsbericht uit 2018.</w:t>
+            </w:r>
+          </w:p>
+        </w:tc>
+      </w:tr>
+      <w:tr>
+        <w:tc>
+          <w:tcPr/>
+          <w:p>
+            <w:pPr>
+              <w:pStyle w:val="Compact"/>
+            </w:pPr>
+            <w:r>
+              <w:rPr>
+                <w:rStyle w:val="VerbatimChar"/>
+              </w:rPr>
+              <w:t xml:space="preserve">maatregel_uitvoering_plotscope</w:t>
+            </w:r>
+          </w:p>
+        </w:tc>
+        <w:tc>
+          <w:tcPr/>
+          <w:p>
+            <w:pPr>
+              <w:pStyle w:val="Compact"/>
+              <w:jc w:val="right"/>
+            </w:pPr>
+            <w:r>
+              <w:t xml:space="preserve">2</w:t>
+            </w:r>
+          </w:p>
+        </w:tc>
+        <w:tc>
+          <w:tcPr/>
+          <w:p>
+            <w:pPr>
+              <w:pStyle w:val="Compact"/>
+            </w:pPr>
+            <w:r>
+              <w:t xml:space="preserve">Expliciete beoordeling of een uitvoering binnen de 55 Meijendel-plots valt. De Bendel-herinrichting en het Bendel-nabeheer zijn beide geverifieerd als</w:t>
+            </w:r>
+            <w:r>
+              <w:t xml:space="preserve"> </w:t>
+            </w:r>
+            <w:r>
+              <w:rPr>
+                <w:rStyle w:val="VerbatimChar"/>
+              </w:rPr>
+              <w:t xml:space="preserve">buiten_meijendel_plotgebied</w:t>
+            </w:r>
+            <w:r>
+              <w:t xml:space="preserve">.</w:t>
+            </w:r>
+          </w:p>
+        </w:tc>
+      </w:tr>
+      <w:tr>
+        <w:tc>
+          <w:tcPr/>
+          <w:p>
+            <w:pPr>
+              <w:pStyle w:val="Compact"/>
+            </w:pPr>
+            <w:r>
+              <w:rPr>
+                <w:rStyle w:val="VerbatimChar"/>
+              </w:rPr>
+              <w:t xml:space="preserve">maatregel_geometrie</w:t>
+            </w:r>
+          </w:p>
+        </w:tc>
+        <w:tc>
+          <w:tcPr/>
+          <w:p>
+            <w:pPr>
+              <w:pStyle w:val="Compact"/>
+              <w:jc w:val="right"/>
+            </w:pPr>
+            <w:r>
+              <w:t xml:space="preserve">0</w:t>
+            </w:r>
+          </w:p>
+        </w:tc>
+        <w:tc>
+          <w:tcPr/>
+          <w:p>
+            <w:pPr>
+              <w:pStyle w:val="Compact"/>
+            </w:pPr>
+            <w:r>
+              <w:t xml:space="preserve">Alleen voor later verkregen, bronvaste geometrieën in RD New.</w:t>
+            </w:r>
+          </w:p>
+        </w:tc>
+      </w:tr>
+      <w:tr>
+        <w:tc>
+          <w:tcPr/>
+          <w:p>
+            <w:pPr>
+              <w:pStyle w:val="Compact"/>
+            </w:pPr>
+            <w:r>
+              <w:rPr>
+                <w:rStyle w:val="VerbatimChar"/>
+              </w:rPr>
+              <w:t xml:space="preserve">plot_gebied</w:t>
+            </w:r>
+          </w:p>
+        </w:tc>
+        <w:tc>
+          <w:tcPr/>
+          <w:p>
+            <w:pPr>
+              <w:pStyle w:val="Compact"/>
+              <w:jc w:val="right"/>
+            </w:pPr>
+            <w:r>
+              <w:t xml:space="preserve">8</w:t>
+            </w:r>
+          </w:p>
+        </w:tc>
+        <w:tc>
+          <w:tcPr/>
+          <w:p>
+            <w:pPr>
+              <w:pStyle w:val="Compact"/>
+            </w:pPr>
+            <w:r>
+              <w:t xml:space="preserve">Vijf Meijendel-deelgebieden en drie speciale gebieden.</w:t>
+            </w:r>
+          </w:p>
+        </w:tc>
+      </w:tr>
+      <w:tr>
+        <w:tc>
+          <w:tcPr/>
+          <w:p>
+            <w:pPr>
+              <w:pStyle w:val="Compact"/>
+            </w:pPr>
+            <w:r>
+              <w:rPr>
+                <w:rStyle w:val="VerbatimChar"/>
+              </w:rPr>
+              <w:t xml:space="preserve">plot_gebiedsindeling</w:t>
+            </w:r>
+          </w:p>
+        </w:tc>
+        <w:tc>
+          <w:tcPr/>
+          <w:p>
+            <w:pPr>
+              <w:pStyle w:val="Compact"/>
+              <w:jc w:val="right"/>
+            </w:pPr>
+            <w:r>
+              <w:t xml:space="preserve">1</w:t>
+            </w:r>
+          </w:p>
+        </w:tc>
+        <w:tc>
+          <w:tcPr/>
+          <w:p>
+            <w:pPr>
+              <w:pStyle w:val="Compact"/>
+            </w:pPr>
+            <w:r>
+              <w:t xml:space="preserve">Vastgestelde indeling</w:t>
+            </w:r>
+            <w:r>
+              <w:t xml:space="preserve"> </w:t>
+            </w:r>
+            <w:r>
+              <w:rPr>
+                <w:rStyle w:val="VerbatimChar"/>
+              </w:rPr>
+              <w:t xml:space="preserve">vogelplot-gebiedsindeling-v1</w:t>
+            </w:r>
+            <w:r>
+              <w:t xml:space="preserve">, gekoppeld aan SOVON-plotversie 2025.</w:t>
+            </w:r>
+          </w:p>
+        </w:tc>
+      </w:tr>
+      <w:tr>
+        <w:tc>
+          <w:tcPr/>
+          <w:p>
+            <w:pPr>
+              <w:pStyle w:val="Compact"/>
+            </w:pPr>
+            <w:r>
+              <w:rPr>
+                <w:rStyle w:val="VerbatimChar"/>
+              </w:rPr>
+              <w:t xml:space="preserve">plot_gebied_lidmaatschap</w:t>
+            </w:r>
+          </w:p>
+        </w:tc>
+        <w:tc>
+          <w:tcPr/>
+          <w:p>
+            <w:pPr>
+              <w:pStyle w:val="Compact"/>
+              <w:jc w:val="right"/>
+            </w:pPr>
+            <w:r>
+              <w:t xml:space="preserve">69</w:t>
+            </w:r>
+          </w:p>
+        </w:tc>
+        <w:tc>
+          <w:tcPr/>
+          <w:p>
+            <w:pPr>
+              <w:pStyle w:val="Compact"/>
+            </w:pPr>
+            <w:r>
+              <w:t xml:space="preserve">Alle 55 actuele en 14 historische plots hebben precies één gebied.</w:t>
+            </w:r>
+          </w:p>
+        </w:tc>
+      </w:tr>
+      <w:tr>
+        <w:tc>
+          <w:tcPr/>
+          <w:p>
+            <w:pPr>
+              <w:pStyle w:val="Compact"/>
+            </w:pPr>
+            <w:r>
+              <w:rPr>
+                <w:rStyle w:val="VerbatimChar"/>
+              </w:rPr>
+              <w:t xml:space="preserve">plot_gebied_geometrie</w:t>
+            </w:r>
+          </w:p>
+        </w:tc>
+        <w:tc>
+          <w:tcPr/>
+          <w:p>
+            <w:pPr>
+              <w:pStyle w:val="Compact"/>
+              <w:jc w:val="right"/>
+            </w:pPr>
+            <w:r>
+              <w:t xml:space="preserve">8</w:t>
+            </w:r>
+          </w:p>
+        </w:tc>
+        <w:tc>
+          <w:tcPr/>
+          <w:p>
+            <w:pPr>
+              <w:pStyle w:val="Compact"/>
+            </w:pPr>
+            <w:r>
+              <w:t xml:space="preserve">Topologisch samengevoegde actuele kavelgeometrieën in RD New; samen afgeleid uit 55 plots.</w:t>
+            </w:r>
+          </w:p>
+        </w:tc>
+      </w:tr>
+      <w:tr>
+        <w:tc>
+          <w:tcPr/>
+          <w:p>
+            <w:pPr>
+              <w:pStyle w:val="Compact"/>
+            </w:pPr>
+            <w:r>
+              <w:rPr>
+                <w:rStyle w:val="VerbatimChar"/>
+              </w:rPr>
+              <w:t xml:space="preserve">maatregel_uitvoering_gebied</w:t>
+            </w:r>
+          </w:p>
+        </w:tc>
+        <w:tc>
+          <w:tcPr/>
+          <w:p>
+            <w:pPr>
+              <w:pStyle w:val="Compact"/>
+              <w:jc w:val="right"/>
+            </w:pPr>
+            <w:r>
+              <w:t xml:space="preserve">2</w:t>
+            </w:r>
+          </w:p>
+        </w:tc>
+        <w:tc>
+          <w:tcPr/>
+          <w:p>
+            <w:pPr>
+              <w:pStyle w:val="Compact"/>
+            </w:pPr>
+            <w:r>
+              <w:t xml:space="preserve">Voorlinden als locatie binnen M91 en begrazing vanaf 1990 voor Kijfhoek en Bierlap als volledig benoemd gebied.</w:t>
+            </w:r>
+          </w:p>
+        </w:tc>
+      </w:tr>
+      <w:tr>
+        <w:tc>
+          <w:tcPr/>
+          <w:p>
+            <w:pPr>
+              <w:pStyle w:val="Compact"/>
+            </w:pPr>
+            <w:r>
+              <w:rPr>
+                <w:rStyle w:val="VerbatimChar"/>
+              </w:rPr>
+              <w:t xml:space="preserve">maatregel_plot_koppeling</w:t>
+            </w:r>
+          </w:p>
+        </w:tc>
+        <w:tc>
+          <w:tcPr/>
+          <w:p>
+            <w:pPr>
+              <w:pStyle w:val="Compact"/>
+              <w:jc w:val="right"/>
+            </w:pPr>
+            <w:r>
+              <w:t xml:space="preserve">133</w:t>
+            </w:r>
+          </w:p>
+        </w:tc>
+        <w:tc>
+          <w:tcPr/>
+          <w:p>
+            <w:pPr>
+              <w:pStyle w:val="Compact"/>
+            </w:pPr>
+            <w:r>
+              <w:t xml:space="preserve">Helmduinen is gekoppeld aan M15 en M16; M17a is retroactief verwijderd. Meeuwenduin en Prinsenduin hebben samen zeven relaties. Het maaibeheer in Ruygenhoek, Lange Strook en De Loopert heeft vijf relaties. Maatregel 22h heeft zes relaties. Het PIM-leidingwerk heeft zeven relaties: M41, M42, M43, M45, M84, M84s en M85. Infiltratieplas 27.2 is gekoppeld aan M77. De precieze werkvoetafdrukken zijn niet gepubliceerd; de doorsnijdingspercentages blijven leeg.</w:t>
+            </w:r>
+          </w:p>
+        </w:tc>
+      </w:tr>
+      <w:tr>
+        <w:tc>
+          <w:tcPr/>
+          <w:p>
+            <w:pPr>
+              <w:pStyle w:val="Compact"/>
+            </w:pPr>
+            <w:r>
+              <w:rPr>
+                <w:rStyle w:val="VerbatimChar"/>
+              </w:rPr>
+              <w:t xml:space="preserve">v_plot_gebied_actueel</w:t>
+            </w:r>
+          </w:p>
+        </w:tc>
+        <w:tc>
+          <w:tcPr/>
+          <w:p>
+            <w:pPr>
+              <w:pStyle w:val="Compact"/>
+              <w:jc w:val="right"/>
+            </w:pPr>
+            <w:r>
+              <w:t xml:space="preserve">69</w:t>
+            </w:r>
+          </w:p>
+        </w:tc>
+        <w:tc>
+          <w:tcPr/>
+          <w:p>
+            <w:pPr>
+              <w:pStyle w:val="Compact"/>
+            </w:pPr>
+            <w:r>
+              <w:t xml:space="preserve">Actuele leeslaag van de volledige vastgestelde gebiedsindeling.</w:t>
+            </w:r>
+          </w:p>
+        </w:tc>
+      </w:tr>
+      <w:tr>
+        <w:tc>
+          <w:tcPr/>
+          <w:p>
+            <w:pPr>
+              <w:pStyle w:val="Compact"/>
+            </w:pPr>
+            <w:r>
+              <w:rPr>
+                <w:rStyle w:val="VerbatimChar"/>
+              </w:rPr>
+              <w:t xml:space="preserve">v_plot_gebied_geometrie_actueel</w:t>
+            </w:r>
+          </w:p>
+        </w:tc>
+        <w:tc>
+          <w:tcPr/>
+          <w:p>
+            <w:pPr>
+              <w:pStyle w:val="Compact"/>
+              <w:jc w:val="right"/>
+            </w:pPr>
+            <w:r>
+              <w:t xml:space="preserve">8</w:t>
+            </w:r>
+          </w:p>
+        </w:tc>
+        <w:tc>
+          <w:tcPr/>
+          <w:p>
+            <w:pPr>
+              <w:pStyle w:val="Compact"/>
+            </w:pPr>
+            <w:r>
+              <w:t xml:space="preserve">Actuele leeslaag van de afgeleide gebiedsgeometrieën.</w:t>
+            </w:r>
+          </w:p>
+        </w:tc>
+      </w:tr>
+      <w:tr>
+        <w:tc>
+          <w:tcPr/>
+          <w:p>
+            <w:pPr>
+              <w:pStyle w:val="Compact"/>
+            </w:pPr>
+            <w:r>
+              <w:rPr>
+                <w:rStyle w:val="VerbatimChar"/>
+              </w:rPr>
+              <w:t xml:space="preserve">v_plot_jaar_maatregel_bronvast</w:t>
+            </w:r>
+          </w:p>
+        </w:tc>
+        <w:tc>
+          <w:tcPr/>
+          <w:p>
+            <w:pPr>
+              <w:pStyle w:val="Compact"/>
+              <w:jc w:val="right"/>
+            </w:pPr>
+            <w:r>
+              <w:t xml:space="preserve">186</w:t>
+            </w:r>
+          </w:p>
+        </w:tc>
+        <w:tc>
+          <w:tcPr/>
+          <w:p>
+            <w:pPr>
+              <w:pStyle w:val="Compact"/>
+            </w:pPr>
+            <w:r>
+              <w:t xml:space="preserve">Bronvaste plot-jaarregels voor 1967–1969, 1972–1975, 1988–1991, 1993, 1997, 2002, 2005–2006, 2013–2014 en 2016–2025. Infiltratieplas 27.2 levert voor M77 één regel in 2013 en één in 2014. Het PIM-leidingwerk levert zeven scoperegels voor 2018; de bron verdeelt de lengte niet per kavel.</w:t>
+            </w:r>
+          </w:p>
+        </w:tc>
+      </w:tr>
+    </w:tbl>
+    <w:p>
+      <w:pPr>
+        <w:pStyle w:val="FirstParagraph"/>
+      </w:pPr>
+      <w:r>
+        <w:t xml:space="preserve">De referentietabellen</w:t>
+      </w:r>
+      <w:r>
+        <w:t xml:space="preserve"> </w:t>
+      </w:r>
+      <w:r>
+        <w:rPr>
+          <w:rStyle w:val="VerbatimChar"/>
+        </w:rPr>
+        <w:t xml:space="preserve">maatregel_werkcategorie</w:t>
+      </w:r>
+      <w:r>
+        <w:t xml:space="preserve">,</w:t>
+      </w:r>
+      <w:r>
+        <w:t xml:space="preserve"> </w:t>
+      </w:r>
+      <w:r>
+        <w:rPr>
+          <w:rStyle w:val="VerbatimChar"/>
+        </w:rPr>
+        <w:t xml:space="preserve">maatregel_type</w:t>
+      </w:r>
+      <w:r>
+        <w:t xml:space="preserve">,</w:t>
+      </w:r>
+      <w:r>
+        <w:t xml:space="preserve"> </w:t>
+      </w:r>
+      <w:r>
+        <w:rPr>
+          <w:rStyle w:val="VerbatimChar"/>
+        </w:rPr>
+        <w:t xml:space="preserve">maatregel_activiteit_type</w:t>
+      </w:r>
+      <w:r>
+        <w:t xml:space="preserve">,</w:t>
+      </w:r>
+      <w:r>
+        <w:t xml:space="preserve"> </w:t>
+      </w:r>
+      <w:r>
+        <w:rPr>
+          <w:rStyle w:val="VerbatimChar"/>
+        </w:rPr>
+        <w:t xml:space="preserve">maatregel_uitvoering_status</w:t>
+      </w:r>
+      <w:r>
+        <w:t xml:space="preserve"> </w:t>
+      </w:r>
+      <w:r>
+        <w:t xml:space="preserve">en</w:t>
+      </w:r>
+      <w:r>
+        <w:t xml:space="preserve"> </w:t>
+      </w:r>
+      <w:r>
+        <w:rPr>
+          <w:rStyle w:val="VerbatimChar"/>
+        </w:rPr>
+        <w:t xml:space="preserve">maatregel_brontype</w:t>
+      </w:r>
+      <w:r>
+        <w:t xml:space="preserve"> </w:t>
+      </w:r>
+      <w:r>
+        <w:t xml:space="preserve">scheiden categorie, activiteit, feitelijke status en brontype. Waar passend zijn de Natura 2000-codes MT01–MT07 en activiteitcodes A–G gebruikt; lokale aanvullingen hebben een eigen code. Een subsidie-openstelling, ontwerpplan of actuele werkzaamhedenpagina wordt niet als uitvoering behandeld zolang de feitelijke uitvoering niet is bevestigd.</w:t>
+      </w:r>
+    </w:p>
+    <w:p>
+      <w:pPr>
+        <w:pStyle w:val="BodyText"/>
+      </w:pPr>
+      <w:r>
+        <w:t xml:space="preserve">De 144 bestaande regels in</w:t>
+      </w:r>
+      <w:r>
+        <w:t xml:space="preserve"> </w:t>
+      </w:r>
+      <w:r>
+        <w:rPr>
+          <w:rStyle w:val="VerbatimChar"/>
+        </w:rPr>
+        <w:t xml:space="preserve">plot_jaar_maatregel</w:t>
+      </w:r>
+      <w:r>
+        <w:t xml:space="preserve"> </w:t>
+      </w:r>
+      <w:r>
+        <w:t xml:space="preserve">blijven de historische dashboardlaag voor begrazing in 16 plots uit 1991–1999. Hun aantal en checksum</w:t>
+      </w:r>
+      <w:r>
+        <w:t xml:space="preserve"> </w:t>
+      </w:r>
+      <w:r>
+        <w:rPr>
+          <w:rStyle w:val="VerbatimChar"/>
+        </w:rPr>
+        <w:t xml:space="preserve">306480715648</w:t>
+      </w:r>
+      <w:r>
+        <w:t xml:space="preserve"> </w:t>
+      </w:r>
+      <w:r>
+        <w:t xml:space="preserve">zijn bij de actualisering tot en met 15 oktober 2026 gelijk gebleven. Zij worden niet achteraf als bronvaste projectuitvoering geïnterpreteerd. Nieuwe werkzaamheden gaan pas naar een plot-jaarselectie nadat locatie, jaar en bron voldoende precies zijn vastgesteld.</w:t>
+      </w:r>
+    </w:p>
+    <w:p>
+      <w:pPr>
+        <w:pStyle w:val="BodyText"/>
+      </w:pPr>
+      <w:r>
+        <w:t xml:space="preserve">De gebiedsindeling gebruikt de 55 geldige SOVON-kavelpolygonen uit plotversie 2025, in EPSG:28992. Daaruit zijn vijf geometrieën voor Buitenduin Noord, Buitenduin Zuid, Kijfhoek en Bierlap, Vallei Meijendel en Zuid-oosthoek en drie geometrieën voor Haagsche Golfclub, Voorlinden en Hertenkamp afgeleid. Interne overlap van telplots wordt bij de topologische samenvoeging niet dubbel als gebiedsoppervlak geteld. De 14 historische plots zijn inhoudelijk ingedeeld, maar hebben in plotversie 2025 geen afzonderlijke historische geometrie en worden daarom niet als geometriebron gebruikt.</w:t>
+      </w:r>
+    </w:p>
+    <w:p>
+      <w:pPr>
+        <w:pStyle w:val="BodyText"/>
+      </w:pPr>
+      <w:r>
+        <w:t xml:space="preserve">De actuele aantallen bronplots per geometrie zijn respectievelijk 9, 7, 16, 9 en 11 voor de vijf Meijendel-deelgebieden en 1 voor ieder speciaal gebied. De indeling normaliseert de aangeleverde aanduiding M54q naar het bestaande plot M54a. Historisch M17 volgt M17a en ligt in Buitenduin Noord; M8/11, M8/9, M9 en M11 liggen in Kijfhoek en Bierlap.</w:t>
+      </w:r>
+    </w:p>
+    <w:p>
+      <w:pPr>
+        <w:pStyle w:val="Heading2"/>
+      </w:pPr>
+      <w:bookmarkStart w:id="23" w:name="_1658618e44232e196644eac3525cdf2369e59da"/>
+      <w:r>
+        <w:t xml:space="preserve">Nameninventaris en plotgeometrie</w:t>
+      </w:r>
+      <w:bookmarkEnd w:id="23"/>
+    </w:p>
+    <w:p>
+      <w:pPr>
+        <w:pStyle w:val="FirstParagraph"/>
+      </w:pPr>
+      <w:r>
+        <w:t xml:space="preserve">Versie</w:t>
+      </w:r>
+      <w:r>
+        <w:t xml:space="preserve"> </w:t>
+      </w:r>
+      <w:r>
+        <w:rPr>
+          <w:rStyle w:val="VerbatimChar"/>
+        </w:rPr>
+        <w:t xml:space="preserve">meijendel_nameninventaris_2026-10-14</w:t>
+      </w:r>
+      <w:r>
+        <w:t xml:space="preserve"> </w:t>
+      </w:r>
+      <w:r>
+        <w:t xml:space="preserve">is op 14 oktober 2026 in de levende lokale database opgenomen. De korrel is één naamobject, één bronvermelding of één brongeometrie; naamgeometrie bewijst niet automatisch de exacte grens van een uitgevoerde maatregel.</w:t>
+      </w:r>
+    </w:p>
+    <w:tbl>
+      <w:tblPr>
+        <w:tblStyle w:val="Table"/>
+        <w:tblW w:type="pct" w:w="5000"/>
+        <w:tblLayout w:type="fixed"/>
+        <w:tblLook w:firstRow="1" w:lastRow="0" w:firstColumn="0" w:lastColumn="0" w:noHBand="0" w:noVBand="0" w:val="0020"/>
+      </w:tblPr>
+      <w:tblGrid>
+        <w:gridCol w:w="2376"/>
+        <w:gridCol w:w="3168"/>
+        <w:gridCol w:w="2376"/>
+      </w:tblGrid>
+      <w:tr>
+        <w:trPr>
+          <w:tblHeader w:val="on"/>
+        </w:trPr>
+        <w:tc>
+          <w:tcPr/>
+          <w:p>
+            <w:pPr>
+              <w:pStyle w:val="Compact"/>
+            </w:pPr>
+            <w:r>
+              <w:t xml:space="preserve">Tabel of view</w:t>
+            </w:r>
+          </w:p>
+        </w:tc>
+        <w:tc>
+          <w:tcPr/>
+          <w:p>
+            <w:pPr>
+              <w:pStyle w:val="Compact"/>
+              <w:jc w:val="right"/>
+            </w:pPr>
+            <w:r>
+              <w:t xml:space="preserve">Records</w:t>
+            </w:r>
+          </w:p>
+        </w:tc>
+        <w:tc>
+          <w:tcPr/>
+          <w:p>
+            <w:pPr>
+              <w:pStyle w:val="Compact"/>
+            </w:pPr>
+            <w:r>
+              <w:t xml:space="preserve">Betekenis</w:t>
+            </w:r>
+          </w:p>
+        </w:tc>
+      </w:tr>
+      <w:tr>
+        <w:tc>
+          <w:tcPr/>
+          <w:p>
+            <w:pPr>
+              <w:pStyle w:val="Compact"/>
+            </w:pPr>
+            <w:r>
+              <w:rPr>
+                <w:rStyle w:val="VerbatimChar"/>
+              </w:rPr>
+              <w:t xml:space="preserve">nameninventaris_import</w:t>
+            </w:r>
+          </w:p>
+        </w:tc>
+        <w:tc>
+          <w:tcPr/>
+          <w:p>
+            <w:pPr>
+              <w:pStyle w:val="Compact"/>
+              <w:jc w:val="right"/>
+            </w:pPr>
+            <w:r>
+              <w:t xml:space="preserve">1</w:t>
+            </w:r>
+          </w:p>
+        </w:tc>
+        <w:tc>
+          <w:tcPr/>
+          <w:p>
+            <w:pPr>
+              <w:pStyle w:val="Compact"/>
+            </w:pPr>
+            <w:r>
+              <w:t xml:space="preserve">Herkomst, hash, regelversie en verwachte aantallen van de levering.</w:t>
+            </w:r>
+          </w:p>
+        </w:tc>
+      </w:tr>
+      <w:tr>
+        <w:tc>
+          <w:tcPr/>
+          <w:p>
+            <w:pPr>
+              <w:pStyle w:val="Compact"/>
+            </w:pPr>
+            <w:r>
+              <w:rPr>
+                <w:rStyle w:val="VerbatimChar"/>
+              </w:rPr>
+              <w:t xml:space="preserve">nameninventaris_bron</w:t>
+            </w:r>
+          </w:p>
+        </w:tc>
+        <w:tc>
+          <w:tcPr/>
+          <w:p>
+            <w:pPr>
+              <w:pStyle w:val="Compact"/>
+              <w:jc w:val="right"/>
+            </w:pPr>
+            <w:r>
+              <w:t xml:space="preserve">8</w:t>
+            </w:r>
+          </w:p>
+        </w:tc>
+        <w:tc>
+          <w:tcPr/>
+          <w:p>
+            <w:pPr>
+              <w:pStyle w:val="Compact"/>
+            </w:pPr>
+            <w:r>
+              <w:t xml:space="preserve">Beekman 2021, twee historische artikelen, Neefjes 2010, TOP10NL, OSM en twee Dunea-bronnen.</w:t>
+            </w:r>
+          </w:p>
+        </w:tc>
+      </w:tr>
+      <w:tr>
+        <w:tc>
+          <w:tcPr/>
+          <w:p>
+            <w:pPr>
+              <w:pStyle w:val="Compact"/>
+            </w:pPr>
+            <w:r>
+              <w:rPr>
+                <w:rStyle w:val="VerbatimChar"/>
+              </w:rPr>
+              <w:t xml:space="preserve">nameninventaris_object</w:t>
+            </w:r>
+          </w:p>
+        </w:tc>
+        <w:tc>
+          <w:tcPr/>
+          <w:p>
+            <w:pPr>
+              <w:pStyle w:val="Compact"/>
+              <w:jc w:val="right"/>
+            </w:pPr>
+            <w:r>
+              <w:t xml:space="preserve">182</w:t>
+            </w:r>
+          </w:p>
+        </w:tc>
+        <w:tc>
+          <w:tcPr/>
+          <w:p>
+            <w:pPr>
+              <w:pStyle w:val="Compact"/>
+            </w:pPr>
+            <w:r>
+              <w:t xml:space="preserve">Onderscheiden gebieds-, functionele, pad-, weg- en routeobjecten.</w:t>
+            </w:r>
+          </w:p>
+        </w:tc>
+      </w:tr>
+      <w:tr>
+        <w:tc>
+          <w:tcPr/>
+          <w:p>
+            <w:pPr>
+              <w:pStyle w:val="Compact"/>
+            </w:pPr>
+            <w:r>
+              <w:rPr>
+                <w:rStyle w:val="VerbatimChar"/>
+              </w:rPr>
+              <w:t xml:space="preserve">nameninventaris_vermelding</w:t>
+            </w:r>
+          </w:p>
+        </w:tc>
+        <w:tc>
+          <w:tcPr/>
+          <w:p>
+            <w:pPr>
+              <w:pStyle w:val="Compact"/>
+              <w:jc w:val="right"/>
+            </w:pPr>
+            <w:r>
+              <w:t xml:space="preserve">299</w:t>
+            </w:r>
+          </w:p>
+        </w:tc>
+        <w:tc>
+          <w:tcPr/>
+          <w:p>
+            <w:pPr>
+              <w:pStyle w:val="Compact"/>
+            </w:pPr>
+            <w:r>
+              <w:t xml:space="preserve">Gedateerde naamvermeldingen uit 1602–2026.</w:t>
+            </w:r>
+          </w:p>
+        </w:tc>
+      </w:tr>
+      <w:tr>
+        <w:tc>
+          <w:tcPr/>
+          <w:p>
+            <w:pPr>
+              <w:pStyle w:val="Compact"/>
+            </w:pPr>
+            <w:r>
+              <w:rPr>
+                <w:rStyle w:val="VerbatimChar"/>
+              </w:rPr>
+              <w:t xml:space="preserve">nameninventaris_geometrie</w:t>
+            </w:r>
+          </w:p>
+        </w:tc>
+        <w:tc>
+          <w:tcPr/>
+          <w:p>
+            <w:pPr>
+              <w:pStyle w:val="Compact"/>
+              <w:jc w:val="right"/>
+            </w:pPr>
+            <w:r>
+              <w:t xml:space="preserve">71</w:t>
+            </w:r>
+          </w:p>
+        </w:tc>
+        <w:tc>
+          <w:tcPr/>
+          <w:p>
+            <w:pPr>
+              <w:pStyle w:val="Compact"/>
+            </w:pPr>
+            <w:r>
+              <w:t xml:space="preserve">Brongeometrieën in EPSG:28992 voor 71 objecten.</w:t>
+            </w:r>
+          </w:p>
+        </w:tc>
+      </w:tr>
+      <w:tr>
+        <w:tc>
+          <w:tcPr/>
+          <w:p>
+            <w:pPr>
+              <w:pStyle w:val="Compact"/>
+            </w:pPr>
+            <w:r>
+              <w:rPr>
+                <w:rStyle w:val="VerbatimChar"/>
+              </w:rPr>
+              <w:t xml:space="preserve">nameninventaris_geometrie_bronobject</w:t>
+            </w:r>
+          </w:p>
+        </w:tc>
+        <w:tc>
+          <w:tcPr/>
+          <w:p>
+            <w:pPr>
+              <w:pStyle w:val="Compact"/>
+              <w:jc w:val="right"/>
+            </w:pPr>
+            <w:r>
+              <w:t xml:space="preserve">107</w:t>
+            </w:r>
+          </w:p>
+        </w:tc>
+        <w:tc>
+          <w:tcPr/>
+          <w:p>
+            <w:pPr>
+              <w:pStyle w:val="Compact"/>
+            </w:pPr>
+            <w:r>
+              <w:t xml:space="preserve">Herleidbaarheid van samengevoegde geometrieën naar afzonderlijke bronobjecten.</w:t>
+            </w:r>
+          </w:p>
+        </w:tc>
+      </w:tr>
+      <w:tr>
+        <w:tc>
+          <w:tcPr/>
+          <w:p>
+            <w:pPr>
+              <w:pStyle w:val="Compact"/>
+            </w:pPr>
+            <w:r>
+              <w:rPr>
+                <w:rStyle w:val="VerbatimChar"/>
+              </w:rPr>
+              <w:t xml:space="preserve">nameninventaris_beoordeling</w:t>
+            </w:r>
+          </w:p>
+        </w:tc>
+        <w:tc>
+          <w:tcPr/>
+          <w:p>
+            <w:pPr>
+              <w:pStyle w:val="Compact"/>
+              <w:jc w:val="right"/>
+            </w:pPr>
+            <w:r>
+              <w:t xml:space="preserve">111</w:t>
+            </w:r>
+          </w:p>
+        </w:tc>
+        <w:tc>
+          <w:tcPr/>
+          <w:p>
+            <w:pPr>
+              <w:pStyle w:val="Compact"/>
+            </w:pPr>
+            <w:r>
+              <w:t xml:space="preserve">Actuele, expliciete geometrieleemten; deze namen worden niet ruimtelijk afgeleid.</w:t>
+            </w:r>
+          </w:p>
+        </w:tc>
+      </w:tr>
+      <w:tr>
+        <w:tc>
+          <w:tcPr/>
+          <w:p>
+            <w:pPr>
+              <w:pStyle w:val="Compact"/>
+            </w:pPr>
+            <w:r>
+              <w:rPr>
+                <w:rStyle w:val="VerbatimChar"/>
+              </w:rPr>
+              <w:t xml:space="preserve">plot_geometrie_import</w:t>
+            </w:r>
+          </w:p>
+        </w:tc>
+        <w:tc>
+          <w:tcPr/>
+          <w:p>
+            <w:pPr>
+              <w:pStyle w:val="Compact"/>
+              <w:jc w:val="right"/>
+            </w:pPr>
+            <w:r>
+              <w:t xml:space="preserve">1</w:t>
+            </w:r>
+          </w:p>
+        </w:tc>
+        <w:tc>
+          <w:tcPr/>
+          <w:p>
+            <w:pPr>
+              <w:pStyle w:val="Compact"/>
+            </w:pPr>
+            <w:r>
+              <w:t xml:space="preserve">Actuele SOVON-kavelgeometrie van 55 plots, versie</w:t>
+            </w:r>
+            <w:r>
+              <w:t xml:space="preserve"> </w:t>
+            </w:r>
+            <w:r>
+              <w:rPr>
+                <w:rStyle w:val="VerbatimChar"/>
+              </w:rPr>
+              <w:t xml:space="preserve">sovon-avimap-2025-download-2026-10-02</w:t>
+            </w:r>
+            <w:r>
+              <w:t xml:space="preserve">.</w:t>
+            </w:r>
+          </w:p>
+        </w:tc>
+      </w:tr>
+      <w:tr>
+        <w:tc>
+          <w:tcPr/>
+          <w:p>
+            <w:pPr>
+              <w:pStyle w:val="Compact"/>
+            </w:pPr>
+            <w:r>
+              <w:rPr>
+                <w:rStyle w:val="VerbatimChar"/>
+              </w:rPr>
+              <w:t xml:space="preserve">nameninventaris_plot_koppeling</w:t>
+            </w:r>
+          </w:p>
+        </w:tc>
+        <w:tc>
+          <w:tcPr/>
+          <w:p>
+            <w:pPr>
+              <w:pStyle w:val="Compact"/>
+              <w:jc w:val="right"/>
+            </w:pPr>
+            <w:r>
+              <w:t xml:space="preserve">377</w:t>
+            </w:r>
+          </w:p>
+        </w:tc>
+        <w:tc>
+          <w:tcPr/>
+          <w:p>
+            <w:pPr>
+              <w:pStyle w:val="Compact"/>
+            </w:pPr>
+            <w:r>
+              <w:t xml:space="preserve">Alle geometrische doorsnijdingen tussen 66 naamobjecten en 55 actuele kavels.</w:t>
+            </w:r>
+          </w:p>
+        </w:tc>
+      </w:tr>
+      <w:tr>
+        <w:tc>
+          <w:tcPr/>
+          <w:p>
+            <w:pPr>
+              <w:pStyle w:val="Compact"/>
+            </w:pPr>
+            <w:r>
+              <w:rPr>
+                <w:rStyle w:val="VerbatimChar"/>
+              </w:rPr>
+              <w:t xml:space="preserve">v_nameninventaris_plot_actueel</w:t>
+            </w:r>
+          </w:p>
+        </w:tc>
+        <w:tc>
+          <w:tcPr/>
+          <w:p>
+            <w:pPr>
+              <w:pStyle w:val="Compact"/>
+              <w:jc w:val="right"/>
+            </w:pPr>
+            <w:r>
+              <w:t xml:space="preserve">365</w:t>
+            </w:r>
+          </w:p>
+        </w:tc>
+        <w:tc>
+          <w:tcPr/>
+          <w:p>
+            <w:pPr>
+              <w:pStyle w:val="Compact"/>
+            </w:pPr>
+            <w:r>
+              <w:t xml:space="preserve">Actuele leeslaag voor 53 kavels binnen</w:t>
+            </w:r>
+            <w:r>
+              <w:t xml:space="preserve"> </w:t>
+            </w:r>
+            <w:r>
+              <w:rPr>
+                <w:rStyle w:val="VerbatimChar"/>
+              </w:rPr>
+              <w:t xml:space="preserve">meijendel_natura2000</w:t>
+            </w:r>
+            <w:r>
+              <w:t xml:space="preserve">; M66 en M91 zijn uitgesloten.</w:t>
+            </w:r>
+          </w:p>
+        </w:tc>
+      </w:tr>
+    </w:tbl>
+    <w:p>
+      <w:pPr>
+        <w:pStyle w:val="FirstParagraph"/>
+      </w:pPr>
+      <w:r>
+        <w:t xml:space="preserve">De maatregelactualisering gebruikt deze laag alleen wanneer de maatregellocatie volledig en letterlijk overeenkomt met één of meer geometriseerde naamobjecten. Daarmee zijn 32 relaties voor zes uitvoeringen toegevoegd. Uitvoeringen met een brede locatie, een niet-geometriseerde naam, een gedeeltelijk geometriseerde samengestelde locatie of een afwijkende naam blijven buiten de automatische koppeling.</w:t>
+      </w:r>
+    </w:p>
+    <w:p>
+      <w:pPr>
+        <w:pStyle w:val="Heading2"/>
+      </w:pPr>
+      <w:bookmarkStart w:id="24" w:name="_c4d8e63f8d951db14c31b0e8e0c5017e65b09fe"/>
+      <w:r>
+        <w:t xml:space="preserve">Website dashboard en Shiny beschermen</w:t>
+      </w:r>
+      <w:bookmarkEnd w:id="24"/>
+    </w:p>
+    <w:p>
+      <w:pPr>
+        <w:pStyle w:val="FirstParagraph"/>
+      </w:pPr>
+      <w:r>
+        <w:t xml:space="preserve">De eerdere inventarisatie vond geen rechtstreeks gebruik van de 146</w:t>
+      </w:r>
+      <w:r>
+        <w:t xml:space="preserve"> </w:t>
+      </w:r>
+      <w:r>
+        <w:rPr>
+          <w:rStyle w:val="VerbatimChar"/>
+        </w:rPr>
+        <w:t xml:space="preserve">ndff_*</w:t>
+      </w:r>
+      <w:r>
+        <w:t xml:space="preserve">-, vier</w:t>
+      </w:r>
+      <w:r>
+        <w:t xml:space="preserve"> </w:t>
+      </w:r>
+      <w:r>
+        <w:rPr>
+          <w:rStyle w:val="VerbatimChar"/>
+        </w:rPr>
+        <w:t xml:space="preserve">externe_ecologie_*</w:t>
+      </w:r>
+      <w:r>
+        <w:t xml:space="preserve">- en zes</w:t>
+      </w:r>
+      <w:r>
+        <w:t xml:space="preserve"> </w:t>
+      </w:r>
+      <w:r>
+        <w:rPr>
+          <w:rStyle w:val="VerbatimChar"/>
+        </w:rPr>
+        <w:t xml:space="preserve">vangblik*</w:t>
+      </w:r>
+      <w:r>
+        <w:t xml:space="preserve">-tabellen in de publieke website, reguliere Shiny-cache of openbare dashboardketen. Dat geeft ruimte, maar betekent niet dat die 156 tabellen losstaan. Imports, audits, ruimtelijke verwerking, bestaande views en exportvalidatie gebruiken ze wel. Voor deze herschrijving zijn de relevante cache- en exportcontracten opnieuw gecontroleerd; er is geen productieproef uitgevoerd.</w:t>
+      </w:r>
+    </w:p>
+    <w:p>
+      <w:pPr>
+        <w:pStyle w:val="BodyText"/>
+      </w:pPr>
+      <w:r>
+        <w:t xml:space="preserve">PQ is wel aangesloten. Shiny leest</w:t>
+      </w:r>
+      <w:r>
+        <w:t xml:space="preserve"> </w:t>
+      </w:r>
+      <w:r>
+        <w:rPr>
+          <w:rStyle w:val="VerbatimChar"/>
+        </w:rPr>
+        <w:t xml:space="preserve">pq_plot_jaar_vegetatie</w:t>
+      </w:r>
+      <w:r>
+        <w:t xml:space="preserve"> </w:t>
+      </w:r>
+      <w:r>
+        <w:t xml:space="preserve">en gebruikt soortenrijkdom, bedekkingssom en Shannon in model- en omgevingsgegevens. De website leest de bestaande</w:t>
+      </w:r>
+      <w:r>
+        <w:t xml:space="preserve"> </w:t>
+      </w:r>
+      <w:r>
+        <w:rPr>
+          <w:rStyle w:val="VerbatimChar"/>
+        </w:rPr>
+        <w:t xml:space="preserve">website_plot_vegetatie_jaar</w:t>
+      </w:r>
+      <w:r>
+        <w:t xml:space="preserve">, die naar dezelfde PQ-afleiding verwijst. Foutafhandeling kan een leeg vegetatieonderdeel opleveren terwijl de pagina gewoon opent. Vergelijk daarom de 513 plot-jaarregels uit 1981–2025, waarden, ontbrekende waarden en bronvermelding vóór en na de structurele migratie.</w:t>
+      </w:r>
+    </w:p>
+    <w:p>
+      <w:pPr>
+        <w:pStyle w:val="BodyText"/>
+      </w:pPr>
+      <w:r>
+        <w:t xml:space="preserve">Nieuwe PQ-opnamen mogen bij een afzonderlijk inhoudelijk besluit later doorwerken in de toepassingen. Het toevoegen van bronnen mag echter niet ongemerkt de provinciale controlebasis of bestaande vogelmodellen veranderen. Scheid structureel verplaatsen met gelijke uitkomsten van inhoudelijk verrijken met expliciet beoordeelde nieuwe uitkomsten.</w:t>
+      </w:r>
+    </w:p>
+    <w:p>
+      <w:pPr>
+        <w:pStyle w:val="BodyText"/>
+      </w:pPr>
+      <w:r>
+        <w:t xml:space="preserve">Verder moeten deze afhankelijkheden mee:</w:t>
+      </w:r>
+    </w:p>
+    <w:p>
+      <w:pPr>
+        <w:pStyle w:val="Compact"/>
+        <w:numPr>
+          <w:ilvl w:val="0"/>
+          <w:numId w:val="1002"/>
+        </w:numPr>
+      </w:pPr>
+      <w:r>
+        <w:t xml:space="preserve">foreign keys, indexes, rechten en eventuele routines of triggers;</w:t>
+      </w:r>
+    </w:p>
+    <w:p>
+      <w:pPr>
+        <w:pStyle w:val="Compact"/>
+        <w:numPr>
+          <w:ilvl w:val="0"/>
+          <w:numId w:val="1002"/>
+        </w:numPr>
+      </w:pPr>
+      <w:r>
+        <w:t xml:space="preserve">bestaande views en beveiligde onderzoeksviews die naar openbare NDFF-tabellen verwijzen, met behoud van de beveiligingsgrens;</w:t>
+      </w:r>
+    </w:p>
+    <w:p>
+      <w:pPr>
+        <w:pStyle w:val="Compact"/>
+        <w:numPr>
+          <w:ilvl w:val="0"/>
+          <w:numId w:val="1002"/>
+        </w:numPr>
+      </w:pPr>
+      <w:r>
+        <w:t xml:space="preserve">dynamische tabelnamen in imports en audits, naast letterlijk geschreven namen;</w:t>
+      </w:r>
+    </w:p>
+    <w:p>
+      <w:pPr>
+        <w:pStyle w:val="Compact"/>
+        <w:numPr>
+          <w:ilvl w:val="0"/>
+          <w:numId w:val="1002"/>
+        </w:numPr>
+      </w:pPr>
+      <w:r>
+        <w:t xml:space="preserve">tabelnamen die als gegevens zijn opgeslagen, waaronder</w:t>
+      </w:r>
+      <w:r>
+        <w:t xml:space="preserve"> </w:t>
+      </w:r>
+      <w:r>
+        <w:rPr>
+          <w:rStyle w:val="VerbatimChar"/>
+        </w:rPr>
+        <w:t xml:space="preserve">analyse_datareeks.bron_object</w:t>
+      </w:r>
+      <w:r>
+        <w:t xml:space="preserve"> </w:t>
+      </w:r>
+      <w:r>
+        <w:t xml:space="preserve">en ruimtelijke bronverwijzingen;</w:t>
+      </w:r>
+    </w:p>
+    <w:p>
+      <w:pPr>
+        <w:pStyle w:val="Compact"/>
+        <w:numPr>
+          <w:ilvl w:val="0"/>
+          <w:numId w:val="1002"/>
+        </w:numPr>
+      </w:pPr>
+      <w:r>
+        <w:t xml:space="preserve">de exportcontrole die nu expliciet</w:t>
+      </w:r>
+      <w:r>
+        <w:t xml:space="preserve"> </w:t>
+      </w:r>
+      <w:r>
+        <w:rPr>
+          <w:rStyle w:val="VerbatimChar"/>
+        </w:rPr>
+        <w:t xml:space="preserve">ndff_open_waarneming</w:t>
+      </w:r>
+      <w:r>
+        <w:t xml:space="preserve"> </w:t>
+      </w:r>
+      <w:r>
+        <w:t xml:space="preserve">verlangt, plus de dump- en Shiny-cachecontracten.</w:t>
+      </w:r>
+    </w:p>
+    <w:p>
+      <w:pPr>
+        <w:pStyle w:val="FirstParagraph"/>
+      </w:pPr>
+      <w:r>
+        <w:t xml:space="preserve">Bronbestanden, bron-ID’s, hashes en historische regelversies worden niet cosmetisch herschreven. Er komen geen nieuwe overzichts- of compatibiliteitsviews. Bestaande noodzakelijke views moeten bij een daadwerkelijke migratie correct blijven verwijzen.</w:t>
+      </w:r>
+    </w:p>
+    <w:p>
+      <w:pPr>
+        <w:pStyle w:val="Heading2"/>
+      </w:pPr>
+      <w:bookmarkStart w:id="25" w:name="_ea82a111b7c3651db8ff74dc66ba0e01efd62c3"/>
+      <w:r>
+        <w:t xml:space="preserve">Veilige uitvoervolgorde</w:t>
+      </w:r>
+      <w:bookmarkEnd w:id="25"/>
+    </w:p>
+    <w:p>
+      <w:pPr>
+        <w:pStyle w:val="FirstParagraph"/>
+      </w:pPr>
+      <w:r>
+        <w:t xml:space="preserve">Eerst werken we één volledige familie uit op een geïsoleerde databasekopie. Libellen is daarvoor geschikt: 32.325 bronwaarnemingen uit 1950–2025, plus de bestaande route-, geometrie-, bezoek- en taxonbereikstructuur. De proef omvat meer dan vier namen veranderen. Zij moet bewijzen dat de groepsfamilie ook een tweede bron kan ontvangen zonder dubbele metingen, verlies van herkomst of wijziging van nulbetekenis. Een technische testlevering wordt als test gemarkeerd en wordt geen nieuwe ecologische bron.</w:t>
+      </w:r>
+    </w:p>
+    <w:p>
+      <w:pPr>
+        <w:pStyle w:val="BodyText"/>
+      </w:pPr>
+      <w:r>
+        <w:t xml:space="preserve">Daarna volgt de PQ-uitwerking: brongebonden locatie- en opname-identiteit toevoegen en een afgebakende, reeds gekoppelde LVD-selectie vergelijken met de provinciale reeks. Begin met bevestigde overeenkomsten; behandel waarschijnlijke koppelingen afzonderlijk. Voor iedere kandidaat staat vast of deze verrijkt, toevoegt, dubbel is of conflicteert. De eerste acceptatie-eis is behoud van de bestaande 513 plot-jaaruitkomsten uit 1981–2025.</w:t>
+      </w:r>
+    </w:p>
+    <w:p>
+      <w:pPr>
+        <w:pStyle w:val="BodyText"/>
+      </w:pPr>
+      <w:r>
+        <w:t xml:space="preserve">Vervolgens volgen de overige soortenfamilies in samenhangende groepen. Kevers zijn een bruikbare tweede soortproef omdat NDFF, Naturalis en Vangblik daar samenkomen. Gemengde monsters en de algemene beslis- en bronlaag gaan pas over wanneer hun volledige verwijzingsketen is uitgewerkt.</w:t>
+      </w:r>
+    </w:p>
+    <w:p>
+      <w:pPr>
+        <w:pStyle w:val="BodyText"/>
+      </w:pPr>
+      <w:r>
+        <w:t xml:space="preserve">Iedere proef levert een concrete oude–nieuwe objectkaart, sleutelvertaling, importaanpassing en herstelprocedure op. Vergelijk volledige sleutelsets, aantallen, inhoudshashes, bronverwijzingen, nulstatussen en toegelaten selecties. Een verschil is verklaard of blokkeert de overgang. Controleer tevens herhaalde import: hetzelfde bestand mag geen extra metingen opleveren.</w:t>
+      </w:r>
+    </w:p>
+    <w:p>
+      <w:pPr>
+        <w:pStyle w:val="BodyText"/>
+      </w:pPr>
+      <w:r>
+        <w:t xml:space="preserve">Pas na goedkeuring volgt uitvoering in de levende lokale database, met gecontroleerde back-up en zonder gelijktijdige imports. Daarna volgt de normale gevalideerde dump-, cache- en releaseketen. Productie blijft afnemer van de lokale canonieke database. Herstel bestaat uit een geteste schema- en gegevensherstelroute met de bijpassende codeversie; een algemene transactie-rollback is onvoldoende voor DDL-wijzigingen.</w:t>
+      </w:r>
+    </w:p>
+    <w:p>
+      <w:pPr>
+        <w:pStyle w:val="BodyText"/>
+      </w:pPr>
+      <w:r>
+        <w:t xml:space="preserve">De aanbevolen eerstvolgende stap is een concreet libellenproefontwerp, inclusief fysieke tabellen en migratiecontroles. Geen brede live-hernoeming. PQ blijft een eigen, bronoverstijgende familie en wordt expliciet als volgende migratieproef uitgewerkt.</w:t>
+      </w:r>
+    </w:p>
+    <w:p>
+      <w:pPr>
+        <w:pStyle w:val="Heading2"/>
+      </w:pPr>
+      <w:bookmarkStart w:id="26" w:name="_b3cd443c91657a82ff5685c38edcf4074cc84d4"/>
+      <w:r>
+        <w:t xml:space="preserve">Onderbouwing en grenzen</w:t>
+      </w:r>
+      <w:bookmarkEnd w:id="26"/>
+    </w:p>
+    <w:p>
+      <w:pPr>
+        <w:pStyle w:val="FirstParagraph"/>
+      </w:pPr>
+      <w:r>
+        <w:t xml:space="preserve">Groepen, rijtellingen en bronverdelingen zijn read-only gecontroleerd in de levende lokale database op 26 september 2026. Van de 248 fysieke tabellen staan er 163 in de bijlage: 146 NDFF, vier externe ecologie, zes Vangblik en zeven PQ. Ook de niet-vogelgegevens in AVIMAP zijn onderzocht.</w:t>
+      </w:r>
+    </w:p>
+    <w:p>
+      <w:pPr>
+        <w:pStyle w:val="BodyText"/>
+      </w:pPr>
+      <w:r>
+        <w:t xml:space="preserve">De bijlage geeft bestemmingsrichtingen, geen uitvoerbare naamskaart. Rijtellingen stammen uit de nulmeting van dezelfde datum. Niet alle reconstructietabellen hebben een afzonderlijk gecontroleerde meetperiode; hun technische rijaantallen zijn geen zelfstandige meetreeks.</w:t>
+      </w:r>
+    </w:p>
+    <w:p>
+      <w:pPr>
+        <w:pStyle w:val="BodyText"/>
+      </w:pPr>
+      <w:r>
+        <w:t xml:space="preserve">Geraadpleegd zijn de projectinstructies, README, TODO, DECISIONS, architectuur, eerdere inventaris en</w:t>
+      </w:r>
+      <w:r>
+        <w:t xml:space="preserve"> </w:t>
+      </w:r>
+      <w:r>
+        <w:rPr>
+          <w:rStyle w:val="VerbatimChar"/>
+        </w:rPr>
+        <w:t xml:space="preserve">docs/MEIJENDEL_BRONREGISTER.md</w:t>
+      </w:r>
+      <w:r>
+        <w:t xml:space="preserve">; de openbare NDFF-, protocolkwaliteit- en externe-ecologieschema’s; import- en overlapdefinities; Shiny</w:t>
+      </w:r>
+      <w:r>
+        <w:t xml:space="preserve"> </w:t>
+      </w:r>
+      <w:r>
+        <w:rPr>
+          <w:rStyle w:val="VerbatimChar"/>
+        </w:rPr>
+        <w:t xml:space="preserve">helpers.R</w:t>
+      </w:r>
+      <w:r>
+        <w:t xml:space="preserve">, cachecontracttest, exportvalidator en websitequery voor plotvegetatie.</w:t>
+      </w:r>
+    </w:p>
+    <w:p>
+      <w:pPr>
+        <w:pStyle w:val="BodyText"/>
+      </w:pPr>
+      <w:r>
+        <w:t xml:space="preserve">Bronrechten, toelating en bruikbaarheid zijn niet opnieuw vastgesteld; het bronregister blijft leidend. Geen T7- of NAS-bestanden geopend, nieuwe bronnen aangevraagd of database, dump, cache en productie gewijzigd.</w:t>
+      </w:r>
+    </w:p>
+    <w:p>
+      <w:pPr>
+        <w:pStyle w:val="Heading2"/>
+      </w:pPr>
+      <w:bookmarkStart w:id="27" w:name="_3a68ce2518fa2826494f15f4a6805cb1b04675a"/>
+      <w:r>
+        <w:t xml:space="preserve">Bijlage huidige tabellen en bestemmingsrichting</w:t>
+      </w:r>
+      <w:bookmarkEnd w:id="27"/>
+    </w:p>
+    <w:p>
+      <w:pPr>
+        <w:pStyle w:val="FirstParagraph"/>
+      </w:pPr>
+      <w:r>
+        <w:t xml:space="preserve">Alle 163 tabelnamen blijven hier terugvindbaar. De aantallen zijn technische rijtellingen van 26 september 2026, geen optelbare onafhankelijke waarnemingen. Een richting met meerdere bestemmingen vereist gegevensverdeling; zij is geen RENAME-opdracht. Definitieve doelnamen en sleutelvertalingen worden in de migratieproef getoetst.</w:t>
+      </w:r>
+    </w:p>
+    <w:p>
+      <w:pPr>
+        <w:pStyle w:val="Heading3"/>
+      </w:pPr>
+      <w:bookmarkStart w:id="28" w:name="_soortgroepindexen"/>
+      <w:r>
+        <w:t xml:space="preserve">Soortgroepindexen</w:t>
+      </w:r>
+      <w:bookmarkEnd w:id="28"/>
+    </w:p>
+    <w:p>
+      <w:pPr>
+        <w:pStyle w:val="FirstParagraph"/>
+      </w:pPr>
+      <w:r>
+        <w:t xml:space="preserve">Voor elk van deze 26 indexen geldt: de bestemming wordt een volwaardige bronoverstijgende familie. Alleen de huidige enkelkolomsindex hernoemen is niet het eindbeeld.</w:t>
       </w:r>
     </w:p>
     <w:tbl>
@@ -3115,2125 +5239,6 @@
               <w:pStyle w:val="Compact"/>
             </w:pPr>
             <w:r>
-              <w:t xml:space="preserve">Onderdeel</w:t>
-            </w:r>
-          </w:p>
-        </w:tc>
-        <w:tc>
-          <w:tcPr/>
-          <w:p>
-            <w:pPr>
-              <w:pStyle w:val="Compact"/>
-            </w:pPr>
-            <w:r>
-              <w:t xml:space="preserve">Zwaarte</w:t>
-            </w:r>
-          </w:p>
-        </w:tc>
-        <w:tc>
-          <w:tcPr/>
-          <w:p>
-            <w:pPr>
-              <w:pStyle w:val="Compact"/>
-            </w:pPr>
-            <w:r>
-              <w:t xml:space="preserve">Wat het vergt</w:t>
-            </w:r>
-          </w:p>
-        </w:tc>
-      </w:tr>
-      <w:tr>
-        <w:tc>
-          <w:tcPr/>
-          <w:p>
-            <w:pPr>
-              <w:pStyle w:val="Compact"/>
-            </w:pPr>
-            <w:r>
-              <w:t xml:space="preserve">Een afgebakende meetfamilie hernoemen</w:t>
-            </w:r>
-          </w:p>
-        </w:tc>
-        <w:tc>
-          <w:tcPr/>
-          <w:p>
-            <w:pPr>
-              <w:pStyle w:val="Compact"/>
-            </w:pPr>
-            <w:r>
-              <w:t xml:space="preserve">Beperkt tot middelgroot</w:t>
-            </w:r>
-          </w:p>
-        </w:tc>
-        <w:tc>
-          <w:tcPr/>
-          <w:p>
-            <w:pPr>
-              <w:pStyle w:val="Compact"/>
-            </w:pPr>
-            <w:r>
-              <w:t xml:space="preserve">Schema, verwijzingen, import en tests samen aanpassen. De vier huidige</w:t>
-            </w:r>
-            <w:r>
-              <w:t xml:space="preserve"> </w:t>
-            </w:r>
-            <w:r>
-              <w:rPr>
-                <w:rStyle w:val="VerbatimChar"/>
-              </w:rPr>
-              <w:t xml:space="preserve">ndff_libel_*</w:t>
-            </w:r>
-            <w:r>
-              <w:t xml:space="preserve">-tabellen zijn een afgebakend voorbeeld.</w:t>
-            </w:r>
-          </w:p>
-        </w:tc>
-      </w:tr>
-      <w:tr>
-        <w:tc>
-          <w:tcPr/>
-          <w:p>
-            <w:pPr>
-              <w:pStyle w:val="Compact"/>
-            </w:pPr>
-            <w:r>
-              <w:t xml:space="preserve">NDFF-waarnemingen naar echte groepsfamilies verdelen</w:t>
-            </w:r>
-          </w:p>
-        </w:tc>
-        <w:tc>
-          <w:tcPr/>
-          <w:p>
-            <w:pPr>
-              <w:pStyle w:val="Compact"/>
-            </w:pPr>
-            <w:r>
-              <w:t xml:space="preserve">Groot</w:t>
-            </w:r>
-          </w:p>
-        </w:tc>
-        <w:tc>
-          <w:tcPr/>
-          <w:p>
-            <w:pPr>
-              <w:pStyle w:val="Compact"/>
-            </w:pPr>
-            <w:r>
-              <w:t xml:space="preserve">Stabiele ID's, ruimtelijke beoordeling, protocollen, analysebesluiten en de 233 dubbele lidmaatschappen correct meenemen.</w:t>
-            </w:r>
-          </w:p>
-        </w:tc>
-      </w:tr>
-      <w:tr>
-        <w:tc>
-          <w:tcPr/>
-          <w:p>
-            <w:pPr>
-              <w:pStyle w:val="Compact"/>
-            </w:pPr>
-            <w:r>
-              <w:t xml:space="preserve">De zes externe datasets aansluiten</w:t>
-            </w:r>
-          </w:p>
-        </w:tc>
-        <w:tc>
-          <w:tcPr/>
-          <w:p>
-            <w:pPr>
-              <w:pStyle w:val="Compact"/>
-            </w:pPr>
-            <w:r>
-              <w:t xml:space="preserve">Middelgroot tot groot</w:t>
-            </w:r>
-          </w:p>
-        </w:tc>
-        <w:tc>
-          <w:tcPr/>
-          <w:p>
-            <w:pPr>
-              <w:pStyle w:val="Compact"/>
-            </w:pPr>
-            <w:r>
-              <w:t xml:space="preserve">98.916 resultaten uit 1875–2025 per taxon en meetvorm toewijzen. Coleoptera is eenvoudiger af te bakenen dan STOWA.</w:t>
-            </w:r>
-          </w:p>
-        </w:tc>
-      </w:tr>
-      <w:tr>
-        <w:tc>
-          <w:tcPr/>
-          <w:p>
-            <w:pPr>
-              <w:pStyle w:val="Compact"/>
-            </w:pPr>
-            <w:r>
-              <w:t xml:space="preserve">Vangblik vanuit soortgroepen bereikbaar maken</w:t>
-            </w:r>
-          </w:p>
-        </w:tc>
-        <w:tc>
-          <w:tcPr/>
-          <w:p>
-            <w:pPr>
-              <w:pStyle w:val="Compact"/>
-            </w:pPr>
-            <w:r>
-              <w:t xml:space="preserve">Middelgroot</w:t>
-            </w:r>
-          </w:p>
-        </w:tc>
-        <w:tc>
-          <w:tcPr/>
-          <w:p>
-            <w:pPr>
-              <w:pStyle w:val="Compact"/>
-            </w:pPr>
-            <w:r>
-              <w:t xml:space="preserve">Taxonkoppelingen en gecontroleerde verwijzingen voor 60.560 resultaten uit 1953–1960, zonder dubbele telling.</w:t>
-            </w:r>
-          </w:p>
-        </w:tc>
-      </w:tr>
-      <w:tr>
-        <w:tc>
-          <w:tcPr/>
-          <w:p>
-            <w:pPr>
-              <w:pStyle w:val="Compact"/>
-            </w:pPr>
-            <w:r>
-              <w:t xml:space="preserve">Verspreide PQ-informatie samenbrengen</w:t>
-            </w:r>
-          </w:p>
-        </w:tc>
-        <w:tc>
-          <w:tcPr/>
-          <w:p>
-            <w:pPr>
-              <w:pStyle w:val="Compact"/>
-            </w:pPr>
-            <w:r>
-              <w:t xml:space="preserve">Groot</w:t>
-            </w:r>
-          </w:p>
-        </w:tc>
-        <w:tc>
-          <w:tcPr/>
-          <w:p>
-            <w:pPr>
-              <w:pStyle w:val="Compact"/>
-            </w:pPr>
-            <w:r>
-              <w:t xml:space="preserve">Bronsleutels, opnamen, lagen, bedekkingsschalen en overlap vergelijken. Bovendien leest Shiny de huidige PQ-afleiding al.</w:t>
-            </w:r>
-          </w:p>
-        </w:tc>
-      </w:tr>
-      <w:tr>
-        <w:tc>
-          <w:tcPr/>
-          <w:p>
-            <w:pPr>
-              <w:pStyle w:val="Compact"/>
-            </w:pPr>
-            <w:r>
-              <w:t xml:space="preserve">Vogels en bestaande toepassingen beschermen</w:t>
-            </w:r>
-          </w:p>
-        </w:tc>
-        <w:tc>
-          <w:tcPr/>
-          <w:p>
-            <w:pPr>
-              <w:pStyle w:val="Compact"/>
-            </w:pPr>
-            <w:r>
-              <w:t xml:space="preserve">Harde voorwaarde</w:t>
-            </w:r>
-          </w:p>
-        </w:tc>
-        <w:tc>
-          <w:tcPr/>
-          <w:p>
-            <w:pPr>
-              <w:pStyle w:val="Compact"/>
-            </w:pPr>
-            <w:r>
-              <w:t xml:space="preserve">Vogel-ID's, tabellen, berekeningen en scherminhoud gelijk houden; niet alleen controleren of een pagina opent.</w:t>
-            </w:r>
-          </w:p>
-        </w:tc>
-      </w:tr>
-    </w:tbl>
-    <w:p>
-      <w:pPr>
-        <w:pStyle w:val="FirstParagraph"/>
-      </w:pPr>
-      <w:r>
-        <w:t xml:space="preserve">Een betrouwbare urenraming volgt pas uit een proef op een databasekopie. Het aantal nieuwe tabellen staat evenmin vast: sommige structuren worden hernoemd, andere verdeeld, en gedeelde ondersteuning blijft bijeen. De oude rekensom van 149 hernoemingen en veertien behouden namen geldt dus niet meer.</w:t>
-      </w:r>
-    </w:p>
-    <w:p>
-      <w:pPr>
-        <w:pStyle w:val="BodyText"/>
-      </w:pPr>
-      <w:r>
-        <w:t xml:space="preserve">Taxonvertaling is noodzakelijk.</w:t>
-      </w:r>
-      <w:r>
-        <w:t xml:space="preserve"> </w:t>
-      </w:r>
-      <w:r>
-        <w:rPr>
-          <w:rStyle w:val="VerbatimChar"/>
-        </w:rPr>
-        <w:t xml:space="preserve">ndff_soorten</w:t>
-      </w:r>
-      <w:r>
-        <w:t xml:space="preserve"> </w:t>
-      </w:r>
-      <w:r>
-        <w:t xml:space="preserve">heeft 9.828 bronreferenties, Vangblik 275 bij de reeks 1953–1960, PQ 714 bij 1981–2025 en AVIMAP 35 bij 2009–2026. Externe ecologie heeft 2.894 verschillende opgeslagen wetenschappelijke naamwaarden bij de 98.916 resultaten uit 1875–2025, zonder gemeenschappelijke taxon-foreign-key. Behoud bronnamen, rang en versie en leg gecontroleerde overeenkomsten naast de bronidentiteit vast. De vogelgerichte tabel</w:t>
-      </w:r>
-      <w:r>
-        <w:t xml:space="preserve"> </w:t>
-      </w:r>
-      <w:r>
-        <w:rPr>
-          <w:rStyle w:val="VerbatimChar"/>
-        </w:rPr>
-        <w:t xml:space="preserve">soorten</w:t>
-      </w:r>
-      <w:r>
-        <w:t xml:space="preserve"> </w:t>
-      </w:r>
-      <w:r>
-        <w:t xml:space="preserve">blijft onaangetast.</w:t>
-      </w:r>
-    </w:p>
-    <w:p>
-      <w:pPr>
-        <w:pStyle w:val="Heading2"/>
-      </w:pPr>
-      <w:bookmarkStart w:id="22" w:name="_d275c12976b6db7ca538f1cc96154c39857110d"/>
-      <w:r>
-        <w:t xml:space="preserve">Bronvast werkzaamhedenmodel</w:t>
-      </w:r>
-      <w:bookmarkEnd w:id="22"/>
-    </w:p>
-    <w:p>
-      <w:pPr>
-        <w:pStyle w:val="FirstParagraph"/>
-      </w:pPr>
-      <w:r>
-        <w:t xml:space="preserve">De levende lokale database bevat naast de bestaande classificatie een afzonderlijke laag voor projecten, feitelijke of geplande uitvoeringen, expliciete jaarstatussen en bewijsbronnen. Op 14 oktober 2026 is deze laag aangevuld na controle van alle 807 actieve Zotero-bijlagen. De bestaande tabellen</w:t>
-      </w:r>
-      <w:r>
-        <w:t xml:space="preserve"> </w:t>
-      </w:r>
-      <w:r>
-        <w:rPr>
-          <w:rStyle w:val="VerbatimChar"/>
-        </w:rPr>
-        <w:t xml:space="preserve">maatregelen</w:t>
-      </w:r>
-      <w:r>
-        <w:t xml:space="preserve">,</w:t>
-      </w:r>
-      <w:r>
-        <w:t xml:space="preserve"> </w:t>
-      </w:r>
-      <w:r>
-        <w:rPr>
-          <w:rStyle w:val="VerbatimChar"/>
-        </w:rPr>
-        <w:t xml:space="preserve">maatregelen_kernwoorden</w:t>
-      </w:r>
-      <w:r>
-        <w:t xml:space="preserve"> </w:t>
-      </w:r>
-      <w:r>
-        <w:t xml:space="preserve">en</w:t>
-      </w:r>
-      <w:r>
-        <w:t xml:space="preserve"> </w:t>
-      </w:r>
-      <w:r>
-        <w:rPr>
-          <w:rStyle w:val="VerbatimChar"/>
-        </w:rPr>
-        <w:t xml:space="preserve">plot_jaar_maatregel</w:t>
-      </w:r>
-      <w:r>
-        <w:t xml:space="preserve"> </w:t>
-      </w:r>
-      <w:r>
-        <w:t xml:space="preserve">blijven bestaan. De vier algemene kernwoorden voor recreatiebeheer zijn onder de nieuwe hoofdklasse</w:t>
-      </w:r>
-      <w:r>
-        <w:t xml:space="preserve"> </w:t>
-      </w:r>
-      <w:r>
-        <w:rPr>
-          <w:rStyle w:val="VerbatimChar"/>
-        </w:rPr>
-        <w:t xml:space="preserve">rust_en_recreatiebeheer</w:t>
-      </w:r>
-      <w:r>
-        <w:t xml:space="preserve"> </w:t>
-      </w:r>
-      <w:r>
-        <w:t xml:space="preserve">geplaatst;</w:t>
-      </w:r>
-      <w:r>
-        <w:t xml:space="preserve"> </w:t>
-      </w:r>
-      <w:r>
-        <w:rPr>
-          <w:rStyle w:val="VerbatimChar"/>
-        </w:rPr>
-        <w:t xml:space="preserve">strandreservaat</w:t>
-      </w:r>
-      <w:r>
-        <w:t xml:space="preserve"> </w:t>
-      </w:r>
-      <w:r>
-        <w:t xml:space="preserve">blijft als specifiek kernwoord onder</w:t>
-      </w:r>
-      <w:r>
-        <w:t xml:space="preserve"> </w:t>
-      </w:r>
-      <w:r>
-        <w:rPr>
-          <w:rStyle w:val="VerbatimChar"/>
-        </w:rPr>
-        <w:t xml:space="preserve">strandreservaten</w:t>
-      </w:r>
-      <w:r>
-        <w:t xml:space="preserve"> </w:t>
-      </w:r>
-      <w:r>
-        <w:t xml:space="preserve">herkenbaar.</w:t>
-      </w:r>
-    </w:p>
-    <w:tbl>
-      <w:tblPr>
-        <w:tblStyle w:val="Table"/>
-        <w:tblW w:type="auto" w:w="0"/>
-        <w:tblLook w:firstRow="1" w:lastRow="0" w:firstColumn="0" w:lastColumn="0" w:noHBand="0" w:noVBand="0" w:val="0020"/>
-      </w:tblPr>
-      <w:tblGrid>
-        <w:gridCol w:w="2640"/>
-        <w:gridCol w:w="2640"/>
-        <w:gridCol w:w="2640"/>
-      </w:tblGrid>
-      <w:tr>
-        <w:trPr>
-          <w:tblHeader w:val="on"/>
-        </w:trPr>
-        <w:tc>
-          <w:tcPr/>
-          <w:p>
-            <w:pPr>
-              <w:pStyle w:val="Compact"/>
-            </w:pPr>
-            <w:r>
-              <w:t xml:space="preserve">Tabel of view</w:t>
-            </w:r>
-          </w:p>
-        </w:tc>
-        <w:tc>
-          <w:tcPr/>
-          <w:p>
-            <w:pPr>
-              <w:pStyle w:val="Compact"/>
-              <w:jc w:val="right"/>
-            </w:pPr>
-            <w:r>
-              <w:t xml:space="preserve">Records</w:t>
-            </w:r>
-          </w:p>
-        </w:tc>
-        <w:tc>
-          <w:tcPr/>
-          <w:p>
-            <w:pPr>
-              <w:pStyle w:val="Compact"/>
-            </w:pPr>
-            <w:r>
-              <w:t xml:space="preserve">Betekenis</w:t>
-            </w:r>
-          </w:p>
-        </w:tc>
-      </w:tr>
-      <w:tr>
-        <w:tc>
-          <w:tcPr/>
-          <w:p>
-            <w:pPr>
-              <w:pStyle w:val="Compact"/>
-            </w:pPr>
-            <w:r>
-              <w:rPr>
-                <w:rStyle w:val="VerbatimChar"/>
-              </w:rPr>
-              <w:t xml:space="preserve">maatregel_project</w:t>
-            </w:r>
-          </w:p>
-        </w:tc>
-        <w:tc>
-          <w:tcPr/>
-          <w:p>
-            <w:pPr>
-              <w:pStyle w:val="Compact"/>
-              <w:jc w:val="right"/>
-            </w:pPr>
-            <w:r>
-              <w:t xml:space="preserve">18</w:t>
-            </w:r>
-          </w:p>
-        </w:tc>
-        <w:tc>
-          <w:tcPr/>
-          <w:p>
-            <w:pPr>
-              <w:pStyle w:val="Compact"/>
-            </w:pPr>
-            <w:r>
-              <w:t xml:space="preserve">Samenhangend project of programma; een project kan meerdere uitvoeringen bevatten.</w:t>
-            </w:r>
-          </w:p>
-        </w:tc>
-      </w:tr>
-      <w:tr>
-        <w:tc>
-          <w:tcPr/>
-          <w:p>
-            <w:pPr>
-              <w:pStyle w:val="Compact"/>
-            </w:pPr>
-            <w:r>
-              <w:rPr>
-                <w:rStyle w:val="VerbatimChar"/>
-              </w:rPr>
-              <w:t xml:space="preserve">maatregel_bron</w:t>
-            </w:r>
-          </w:p>
-        </w:tc>
-        <w:tc>
-          <w:tcPr/>
-          <w:p>
-            <w:pPr>
-              <w:pStyle w:val="Compact"/>
-              <w:jc w:val="right"/>
-            </w:pPr>
-            <w:r>
-              <w:t xml:space="preserve">35</w:t>
-            </w:r>
-          </w:p>
-        </w:tc>
-        <w:tc>
-          <w:tcPr/>
-          <w:p>
-            <w:pPr>
-              <w:pStyle w:val="Compact"/>
-            </w:pPr>
-            <w:r>
-              <w:t xml:space="preserve">24 lokaal geraadpleegde Zotero-bronnen en elf officiële of institutionele internetbronnen, ieder met type, datum, status en raadpleegdatum. Van der Hagen et al. (2020) is als ruimtelijke plancontext voor Prinsenduin toegevoegd; Haagse Archeologische Rapportage 1306 onderbouwt het PIM-leidingwerk.</w:t>
-            </w:r>
-          </w:p>
-        </w:tc>
-      </w:tr>
-      <w:tr>
-        <w:tc>
-          <w:tcPr/>
-          <w:p>
-            <w:pPr>
-              <w:pStyle w:val="Compact"/>
-            </w:pPr>
-            <w:r>
-              <w:rPr>
-                <w:rStyle w:val="VerbatimChar"/>
-              </w:rPr>
-              <w:t xml:space="preserve">maatregel_uitvoering</w:t>
-            </w:r>
-          </w:p>
-        </w:tc>
-        <w:tc>
-          <w:tcPr/>
-          <w:p>
-            <w:pPr>
-              <w:pStyle w:val="Compact"/>
-              <w:jc w:val="right"/>
-            </w:pPr>
-            <w:r>
-              <w:t xml:space="preserve">63</w:t>
-            </w:r>
-          </w:p>
-        </w:tc>
-        <w:tc>
-          <w:tcPr/>
-          <w:p>
-            <w:pPr>
-              <w:pStyle w:val="Compact"/>
-            </w:pPr>
-            <w:r>
-              <w:t xml:space="preserve">Afzonderlijke werkzaamheden of expliciet niet-uitgevoerde, onbekende of geplande activiteiten. Het werk in Meeuwenduin en Prinsenduin is voor 2023 en 2024 ruimtelijk gesplitst; de afgeronde Bendel-herinrichting en het geplande nabeheer zijn afzonderlijke uitvoeringen.</w:t>
-            </w:r>
-          </w:p>
-        </w:tc>
-      </w:tr>
-      <w:tr>
-        <w:tc>
-          <w:tcPr/>
-          <w:p>
-            <w:pPr>
-              <w:pStyle w:val="Compact"/>
-            </w:pPr>
-            <w:r>
-              <w:rPr>
-                <w:rStyle w:val="VerbatimChar"/>
-              </w:rPr>
-              <w:t xml:space="preserve">maatregel_uitvoering_jaar</w:t>
-            </w:r>
-          </w:p>
-        </w:tc>
-        <w:tc>
-          <w:tcPr/>
-          <w:p>
-            <w:pPr>
-              <w:pStyle w:val="Compact"/>
-              <w:jc w:val="right"/>
-            </w:pPr>
-            <w:r>
-              <w:t xml:space="preserve">102</w:t>
-            </w:r>
-          </w:p>
-        </w:tc>
-        <w:tc>
-          <w:tcPr/>
-          <w:p>
-            <w:pPr>
-              <w:pStyle w:val="Compact"/>
-            </w:pPr>
-            <w:r>
-              <w:t xml:space="preserve">Letterlijk onderbouwde jaarstatussen uit 1967–2026: 86 uitgevoerd, 9 niet uitgevoerd en 7 onbekend.</w:t>
-            </w:r>
-          </w:p>
-        </w:tc>
-      </w:tr>
-      <w:tr>
-        <w:tc>
-          <w:tcPr/>
-          <w:p>
-            <w:pPr>
-              <w:pStyle w:val="Compact"/>
-            </w:pPr>
-            <w:r>
-              <w:rPr>
-                <w:rStyle w:val="VerbatimChar"/>
-              </w:rPr>
-              <w:t xml:space="preserve">maatregel_uitvoering_bron</w:t>
-            </w:r>
-          </w:p>
-        </w:tc>
-        <w:tc>
-          <w:tcPr/>
-          <w:p>
-            <w:pPr>
-              <w:pStyle w:val="Compact"/>
-              <w:jc w:val="right"/>
-            </w:pPr>
-            <w:r>
-              <w:t xml:space="preserve">89</w:t>
-            </w:r>
-          </w:p>
-        </w:tc>
-        <w:tc>
-          <w:tcPr/>
-          <w:p>
-            <w:pPr>
-              <w:pStyle w:val="Compact"/>
-            </w:pPr>
-            <w:r>
-              <w:t xml:space="preserve">Relaties tussen uitvoering en bewijsbron, met bronrol en bewijsnotitie. De twee Prinsenduin-uitvoeringen verwijzen aanvullend naar figuur 1 van Van der Hagen et al. (2020); het PIM-leidingwerk verwijst aanvullend naar afbeelding 1 en bijlage 2 van Haagse Archeologische Rapportage 1306.</w:t>
-            </w:r>
-          </w:p>
-        </w:tc>
-      </w:tr>
-      <w:tr>
-        <w:tc>
-          <w:tcPr/>
-          <w:p>
-            <w:pPr>
-              <w:pStyle w:val="Compact"/>
-            </w:pPr>
-            <w:r>
-              <w:rPr>
-                <w:rStyle w:val="VerbatimChar"/>
-              </w:rPr>
-              <w:t xml:space="preserve">maatregel_uitvoering_plotscope</w:t>
-            </w:r>
-          </w:p>
-        </w:tc>
-        <w:tc>
-          <w:tcPr/>
-          <w:p>
-            <w:pPr>
-              <w:pStyle w:val="Compact"/>
-              <w:jc w:val="right"/>
-            </w:pPr>
-            <w:r>
-              <w:t xml:space="preserve">2</w:t>
-            </w:r>
-          </w:p>
-        </w:tc>
-        <w:tc>
-          <w:tcPr/>
-          <w:p>
-            <w:pPr>
-              <w:pStyle w:val="Compact"/>
-            </w:pPr>
-            <w:r>
-              <w:t xml:space="preserve">Expliciete beoordeling of een uitvoering binnen de 55 Meijendel-plots valt. De Bendel-herinrichting en het Bendel-nabeheer zijn beide geverifieerd als</w:t>
-            </w:r>
-            <w:r>
-              <w:t xml:space="preserve"> </w:t>
-            </w:r>
-            <w:r>
-              <w:rPr>
-                <w:rStyle w:val="VerbatimChar"/>
-              </w:rPr>
-              <w:t xml:space="preserve">buiten_meijendel_plotgebied</w:t>
-            </w:r>
-            <w:r>
-              <w:t xml:space="preserve">.</w:t>
-            </w:r>
-          </w:p>
-        </w:tc>
-      </w:tr>
-      <w:tr>
-        <w:tc>
-          <w:tcPr/>
-          <w:p>
-            <w:pPr>
-              <w:pStyle w:val="Compact"/>
-            </w:pPr>
-            <w:r>
-              <w:rPr>
-                <w:rStyle w:val="VerbatimChar"/>
-              </w:rPr>
-              <w:t xml:space="preserve">maatregel_geometrie</w:t>
-            </w:r>
-          </w:p>
-        </w:tc>
-        <w:tc>
-          <w:tcPr/>
-          <w:p>
-            <w:pPr>
-              <w:pStyle w:val="Compact"/>
-              <w:jc w:val="right"/>
-            </w:pPr>
-            <w:r>
-              <w:t xml:space="preserve">0</w:t>
-            </w:r>
-          </w:p>
-        </w:tc>
-        <w:tc>
-          <w:tcPr/>
-          <w:p>
-            <w:pPr>
-              <w:pStyle w:val="Compact"/>
-            </w:pPr>
-            <w:r>
-              <w:t xml:space="preserve">Alleen voor later verkregen, bronvaste geometrieën in RD New.</w:t>
-            </w:r>
-          </w:p>
-        </w:tc>
-      </w:tr>
-      <w:tr>
-        <w:tc>
-          <w:tcPr/>
-          <w:p>
-            <w:pPr>
-              <w:pStyle w:val="Compact"/>
-            </w:pPr>
-            <w:r>
-              <w:rPr>
-                <w:rStyle w:val="VerbatimChar"/>
-              </w:rPr>
-              <w:t xml:space="preserve">plot_gebied</w:t>
-            </w:r>
-          </w:p>
-        </w:tc>
-        <w:tc>
-          <w:tcPr/>
-          <w:p>
-            <w:pPr>
-              <w:pStyle w:val="Compact"/>
-              <w:jc w:val="right"/>
-            </w:pPr>
-            <w:r>
-              <w:t xml:space="preserve">8</w:t>
-            </w:r>
-          </w:p>
-        </w:tc>
-        <w:tc>
-          <w:tcPr/>
-          <w:p>
-            <w:pPr>
-              <w:pStyle w:val="Compact"/>
-            </w:pPr>
-            <w:r>
-              <w:t xml:space="preserve">Vijf Meijendel-deelgebieden en drie speciale gebieden.</w:t>
-            </w:r>
-          </w:p>
-        </w:tc>
-      </w:tr>
-      <w:tr>
-        <w:tc>
-          <w:tcPr/>
-          <w:p>
-            <w:pPr>
-              <w:pStyle w:val="Compact"/>
-            </w:pPr>
-            <w:r>
-              <w:rPr>
-                <w:rStyle w:val="VerbatimChar"/>
-              </w:rPr>
-              <w:t xml:space="preserve">plot_gebiedsindeling</w:t>
-            </w:r>
-          </w:p>
-        </w:tc>
-        <w:tc>
-          <w:tcPr/>
-          <w:p>
-            <w:pPr>
-              <w:pStyle w:val="Compact"/>
-              <w:jc w:val="right"/>
-            </w:pPr>
-            <w:r>
-              <w:t xml:space="preserve">1</w:t>
-            </w:r>
-          </w:p>
-        </w:tc>
-        <w:tc>
-          <w:tcPr/>
-          <w:p>
-            <w:pPr>
-              <w:pStyle w:val="Compact"/>
-            </w:pPr>
-            <w:r>
-              <w:t xml:space="preserve">Vastgestelde indeling</w:t>
-            </w:r>
-            <w:r>
-              <w:t xml:space="preserve"> </w:t>
-            </w:r>
-            <w:r>
-              <w:rPr>
-                <w:rStyle w:val="VerbatimChar"/>
-              </w:rPr>
-              <w:t xml:space="preserve">vogelplot-gebiedsindeling-v1</w:t>
-            </w:r>
-            <w:r>
-              <w:t xml:space="preserve">, gekoppeld aan SOVON-plotversie 2025.</w:t>
-            </w:r>
-          </w:p>
-        </w:tc>
-      </w:tr>
-      <w:tr>
-        <w:tc>
-          <w:tcPr/>
-          <w:p>
-            <w:pPr>
-              <w:pStyle w:val="Compact"/>
-            </w:pPr>
-            <w:r>
-              <w:rPr>
-                <w:rStyle w:val="VerbatimChar"/>
-              </w:rPr>
-              <w:t xml:space="preserve">plot_gebied_lidmaatschap</w:t>
-            </w:r>
-          </w:p>
-        </w:tc>
-        <w:tc>
-          <w:tcPr/>
-          <w:p>
-            <w:pPr>
-              <w:pStyle w:val="Compact"/>
-              <w:jc w:val="right"/>
-            </w:pPr>
-            <w:r>
-              <w:t xml:space="preserve">69</w:t>
-            </w:r>
-          </w:p>
-        </w:tc>
-        <w:tc>
-          <w:tcPr/>
-          <w:p>
-            <w:pPr>
-              <w:pStyle w:val="Compact"/>
-            </w:pPr>
-            <w:r>
-              <w:t xml:space="preserve">Alle 55 actuele en 14 historische plots hebben precies één gebied.</w:t>
-            </w:r>
-          </w:p>
-        </w:tc>
-      </w:tr>
-      <w:tr>
-        <w:tc>
-          <w:tcPr/>
-          <w:p>
-            <w:pPr>
-              <w:pStyle w:val="Compact"/>
-            </w:pPr>
-            <w:r>
-              <w:rPr>
-                <w:rStyle w:val="VerbatimChar"/>
-              </w:rPr>
-              <w:t xml:space="preserve">plot_gebied_geometrie</w:t>
-            </w:r>
-          </w:p>
-        </w:tc>
-        <w:tc>
-          <w:tcPr/>
-          <w:p>
-            <w:pPr>
-              <w:pStyle w:val="Compact"/>
-              <w:jc w:val="right"/>
-            </w:pPr>
-            <w:r>
-              <w:t xml:space="preserve">8</w:t>
-            </w:r>
-          </w:p>
-        </w:tc>
-        <w:tc>
-          <w:tcPr/>
-          <w:p>
-            <w:pPr>
-              <w:pStyle w:val="Compact"/>
-            </w:pPr>
-            <w:r>
-              <w:t xml:space="preserve">Topologisch samengevoegde actuele kavelgeometrieën in RD New; samen afgeleid uit 55 plots.</w:t>
-            </w:r>
-          </w:p>
-        </w:tc>
-      </w:tr>
-      <w:tr>
-        <w:tc>
-          <w:tcPr/>
-          <w:p>
-            <w:pPr>
-              <w:pStyle w:val="Compact"/>
-            </w:pPr>
-            <w:r>
-              <w:rPr>
-                <w:rStyle w:val="VerbatimChar"/>
-              </w:rPr>
-              <w:t xml:space="preserve">maatregel_uitvoering_gebied</w:t>
-            </w:r>
-          </w:p>
-        </w:tc>
-        <w:tc>
-          <w:tcPr/>
-          <w:p>
-            <w:pPr>
-              <w:pStyle w:val="Compact"/>
-              <w:jc w:val="right"/>
-            </w:pPr>
-            <w:r>
-              <w:t xml:space="preserve">2</w:t>
-            </w:r>
-          </w:p>
-        </w:tc>
-        <w:tc>
-          <w:tcPr/>
-          <w:p>
-            <w:pPr>
-              <w:pStyle w:val="Compact"/>
-            </w:pPr>
-            <w:r>
-              <w:t xml:space="preserve">Voorlinden als locatie binnen M91 en begrazing vanaf 1990 voor Kijfhoek en Bierlap als volledig benoemd gebied.</w:t>
-            </w:r>
-          </w:p>
-        </w:tc>
-      </w:tr>
-      <w:tr>
-        <w:tc>
-          <w:tcPr/>
-          <w:p>
-            <w:pPr>
-              <w:pStyle w:val="Compact"/>
-            </w:pPr>
-            <w:r>
-              <w:rPr>
-                <w:rStyle w:val="VerbatimChar"/>
-              </w:rPr>
-              <w:t xml:space="preserve">maatregel_plot_koppeling</w:t>
-            </w:r>
-          </w:p>
-        </w:tc>
-        <w:tc>
-          <w:tcPr/>
-          <w:p>
-            <w:pPr>
-              <w:pStyle w:val="Compact"/>
-              <w:jc w:val="right"/>
-            </w:pPr>
-            <w:r>
-              <w:t xml:space="preserve">132</w:t>
-            </w:r>
-          </w:p>
-        </w:tc>
-        <w:tc>
-          <w:tcPr/>
-          <w:p>
-            <w:pPr>
-              <w:pStyle w:val="Compact"/>
-            </w:pPr>
-            <w:r>
-              <w:t xml:space="preserve">Helmduinen is gekoppeld aan M15 en M16; M17a is retroactief verwijderd. Meeuwenduin en Prinsenduin hebben samen zeven relaties. Het maaibeheer in Ruygenhoek, Lange Strook en De Loopert heeft vijf relaties. Maatregel 22h heeft zes relaties. Het PIM-leidingwerk heeft zeven relaties: M41, M42, M43, M45, M84, M84s en M85. De gepubliceerde 6,5 kilometer is niet per kavel verdeeld; alle doorsnijdingspercentages blijven leeg.</w:t>
-            </w:r>
-          </w:p>
-        </w:tc>
-      </w:tr>
-      <w:tr>
-        <w:tc>
-          <w:tcPr/>
-          <w:p>
-            <w:pPr>
-              <w:pStyle w:val="Compact"/>
-            </w:pPr>
-            <w:r>
-              <w:rPr>
-                <w:rStyle w:val="VerbatimChar"/>
-              </w:rPr>
-              <w:t xml:space="preserve">v_plot_gebied_actueel</w:t>
-            </w:r>
-          </w:p>
-        </w:tc>
-        <w:tc>
-          <w:tcPr/>
-          <w:p>
-            <w:pPr>
-              <w:pStyle w:val="Compact"/>
-              <w:jc w:val="right"/>
-            </w:pPr>
-            <w:r>
-              <w:t xml:space="preserve">69</w:t>
-            </w:r>
-          </w:p>
-        </w:tc>
-        <w:tc>
-          <w:tcPr/>
-          <w:p>
-            <w:pPr>
-              <w:pStyle w:val="Compact"/>
-            </w:pPr>
-            <w:r>
-              <w:t xml:space="preserve">Actuele leeslaag van de volledige vastgestelde gebiedsindeling.</w:t>
-            </w:r>
-          </w:p>
-        </w:tc>
-      </w:tr>
-      <w:tr>
-        <w:tc>
-          <w:tcPr/>
-          <w:p>
-            <w:pPr>
-              <w:pStyle w:val="Compact"/>
-            </w:pPr>
-            <w:r>
-              <w:rPr>
-                <w:rStyle w:val="VerbatimChar"/>
-              </w:rPr>
-              <w:t xml:space="preserve">v_plot_gebied_geometrie_actueel</w:t>
-            </w:r>
-          </w:p>
-        </w:tc>
-        <w:tc>
-          <w:tcPr/>
-          <w:p>
-            <w:pPr>
-              <w:pStyle w:val="Compact"/>
-              <w:jc w:val="right"/>
-            </w:pPr>
-            <w:r>
-              <w:t xml:space="preserve">8</w:t>
-            </w:r>
-          </w:p>
-        </w:tc>
-        <w:tc>
-          <w:tcPr/>
-          <w:p>
-            <w:pPr>
-              <w:pStyle w:val="Compact"/>
-            </w:pPr>
-            <w:r>
-              <w:t xml:space="preserve">Actuele leeslaag van de afgeleide gebiedsgeometrieën.</w:t>
-            </w:r>
-          </w:p>
-        </w:tc>
-      </w:tr>
-      <w:tr>
-        <w:tc>
-          <w:tcPr/>
-          <w:p>
-            <w:pPr>
-              <w:pStyle w:val="Compact"/>
-            </w:pPr>
-            <w:r>
-              <w:rPr>
-                <w:rStyle w:val="VerbatimChar"/>
-              </w:rPr>
-              <w:t xml:space="preserve">v_plot_jaar_maatregel_bronvast</w:t>
-            </w:r>
-          </w:p>
-        </w:tc>
-        <w:tc>
-          <w:tcPr/>
-          <w:p>
-            <w:pPr>
-              <w:pStyle w:val="Compact"/>
-              <w:jc w:val="right"/>
-            </w:pPr>
-            <w:r>
-              <w:t xml:space="preserve">184</w:t>
-            </w:r>
-          </w:p>
-        </w:tc>
-        <w:tc>
-          <w:tcPr/>
-          <w:p>
-            <w:pPr>
-              <w:pStyle w:val="Compact"/>
-            </w:pPr>
-            <w:r>
-              <w:t xml:space="preserve">Bronvaste plot-jaarregels voor 1967–1969, 1972–1975, 1988–1991, 1993, 1997, 2002, 2005–2006 en 2016–2025. Meeuwenduin en Prinsenduin leveren zes regels in 2023 en één voor M17a in 2024. Maatregel 22h levert twaalf scoperegels in 2016 en 2017. Het PIM-leidingwerk levert zeven scoperegels voor 2018; de bron verdeelt de lengte niet per kavel.</w:t>
-            </w:r>
-          </w:p>
-        </w:tc>
-      </w:tr>
-    </w:tbl>
-    <w:p>
-      <w:pPr>
-        <w:pStyle w:val="FirstParagraph"/>
-      </w:pPr>
-      <w:r>
-        <w:t xml:space="preserve">De referentietabellen</w:t>
-      </w:r>
-      <w:r>
-        <w:t xml:space="preserve"> </w:t>
-      </w:r>
-      <w:r>
-        <w:rPr>
-          <w:rStyle w:val="VerbatimChar"/>
-        </w:rPr>
-        <w:t xml:space="preserve">maatregel_werkcategorie</w:t>
-      </w:r>
-      <w:r>
-        <w:t xml:space="preserve">,</w:t>
-      </w:r>
-      <w:r>
-        <w:t xml:space="preserve"> </w:t>
-      </w:r>
-      <w:r>
-        <w:rPr>
-          <w:rStyle w:val="VerbatimChar"/>
-        </w:rPr>
-        <w:t xml:space="preserve">maatregel_type</w:t>
-      </w:r>
-      <w:r>
-        <w:t xml:space="preserve">,</w:t>
-      </w:r>
-      <w:r>
-        <w:t xml:space="preserve"> </w:t>
-      </w:r>
-      <w:r>
-        <w:rPr>
-          <w:rStyle w:val="VerbatimChar"/>
-        </w:rPr>
-        <w:t xml:space="preserve">maatregel_activiteit_type</w:t>
-      </w:r>
-      <w:r>
-        <w:t xml:space="preserve">,</w:t>
-      </w:r>
-      <w:r>
-        <w:t xml:space="preserve"> </w:t>
-      </w:r>
-      <w:r>
-        <w:rPr>
-          <w:rStyle w:val="VerbatimChar"/>
-        </w:rPr>
-        <w:t xml:space="preserve">maatregel_uitvoering_status</w:t>
-      </w:r>
-      <w:r>
-        <w:t xml:space="preserve"> </w:t>
-      </w:r>
-      <w:r>
-        <w:t xml:space="preserve">en</w:t>
-      </w:r>
-      <w:r>
-        <w:t xml:space="preserve"> </w:t>
-      </w:r>
-      <w:r>
-        <w:rPr>
-          <w:rStyle w:val="VerbatimChar"/>
-        </w:rPr>
-        <w:t xml:space="preserve">maatregel_brontype</w:t>
-      </w:r>
-      <w:r>
-        <w:t xml:space="preserve"> </w:t>
-      </w:r>
-      <w:r>
-        <w:t xml:space="preserve">scheiden categorie, activiteit, feitelijke status en brontype. Waar passend zijn de Natura 2000-codes MT01–MT07 en activiteitcodes A–G gebruikt; lokale aanvullingen hebben een eigen code. Een subsidie-openstelling, ontwerpplan of actuele werkzaamhedenpagina wordt niet als uitvoering behandeld zolang de feitelijke uitvoering niet is bevestigd.</w:t>
-      </w:r>
-    </w:p>
-    <w:p>
-      <w:pPr>
-        <w:pStyle w:val="BodyText"/>
-      </w:pPr>
-      <w:r>
-        <w:t xml:space="preserve">De 144 bestaande regels in</w:t>
-      </w:r>
-      <w:r>
-        <w:t xml:space="preserve"> </w:t>
-      </w:r>
-      <w:r>
-        <w:rPr>
-          <w:rStyle w:val="VerbatimChar"/>
-        </w:rPr>
-        <w:t xml:space="preserve">plot_jaar_maatregel</w:t>
-      </w:r>
-      <w:r>
-        <w:t xml:space="preserve"> </w:t>
-      </w:r>
-      <w:r>
-        <w:t xml:space="preserve">blijven de historische dashboardlaag voor begrazing in 16 plots uit 1991–1999. Hun aantal en checksum</w:t>
-      </w:r>
-      <w:r>
-        <w:t xml:space="preserve"> </w:t>
-      </w:r>
-      <w:r>
-        <w:rPr>
-          <w:rStyle w:val="VerbatimChar"/>
-        </w:rPr>
-        <w:t xml:space="preserve">306480715648</w:t>
-      </w:r>
-      <w:r>
-        <w:t xml:space="preserve"> </w:t>
-      </w:r>
-      <w:r>
-        <w:t xml:space="preserve">zijn bij de actualisering tot en met 15 oktober 2026 gelijk gebleven. Zij worden niet achteraf als bronvaste projectuitvoering geïnterpreteerd. Nieuwe werkzaamheden gaan pas naar een plot-jaarselectie nadat locatie, jaar en bron voldoende precies zijn vastgesteld.</w:t>
-      </w:r>
-    </w:p>
-    <w:p>
-      <w:pPr>
-        <w:pStyle w:val="BodyText"/>
-      </w:pPr>
-      <w:r>
-        <w:t xml:space="preserve">De gebiedsindeling gebruikt de 55 geldige SOVON-kavelpolygonen uit plotversie 2025, in EPSG:28992. Daaruit zijn vijf geometrieën voor Buitenduin Noord, Buitenduin Zuid, Kijfhoek en Bierlap, Vallei Meijendel en Zuid-oosthoek en drie geometrieën voor Haagsche Golfclub, Voorlinden en Hertenkamp afgeleid. Interne overlap van telplots wordt bij de topologische samenvoeging niet dubbel als gebiedsoppervlak geteld. De 14 historische plots zijn inhoudelijk ingedeeld, maar hebben in plotversie 2025 geen afzonderlijke historische geometrie en worden daarom niet als geometriebron gebruikt.</w:t>
-      </w:r>
-    </w:p>
-    <w:p>
-      <w:pPr>
-        <w:pStyle w:val="BodyText"/>
-      </w:pPr>
-      <w:r>
-        <w:t xml:space="preserve">De actuele aantallen bronplots per geometrie zijn respectievelijk 9, 7, 16, 9 en 11 voor de vijf Meijendel-deelgebieden en 1 voor ieder speciaal gebied. De indeling normaliseert de aangeleverde aanduiding M54q naar het bestaande plot M54a. Historisch M17 volgt M17a en ligt in Buitenduin Noord; M8/11, M8/9, M9 en M11 liggen in Kijfhoek en Bierlap.</w:t>
-      </w:r>
-    </w:p>
-    <w:p>
-      <w:pPr>
-        <w:pStyle w:val="Heading2"/>
-      </w:pPr>
-      <w:bookmarkStart w:id="23" w:name="_1658618e44232e196644eac3525cdf2369e59da"/>
-      <w:r>
-        <w:t xml:space="preserve">Nameninventaris en plotgeometrie</w:t>
-      </w:r>
-      <w:bookmarkEnd w:id="23"/>
-    </w:p>
-    <w:p>
-      <w:pPr>
-        <w:pStyle w:val="FirstParagraph"/>
-      </w:pPr>
-      <w:r>
-        <w:t xml:space="preserve">Versie</w:t>
-      </w:r>
-      <w:r>
-        <w:t xml:space="preserve"> </w:t>
-      </w:r>
-      <w:r>
-        <w:rPr>
-          <w:rStyle w:val="VerbatimChar"/>
-        </w:rPr>
-        <w:t xml:space="preserve">meijendel_nameninventaris_2026-10-14</w:t>
-      </w:r>
-      <w:r>
-        <w:t xml:space="preserve"> </w:t>
-      </w:r>
-      <w:r>
-        <w:t xml:space="preserve">is op 14 oktober 2026 in de levende lokale database opgenomen. De korrel is één naamobject, één bronvermelding of één brongeometrie; naamgeometrie bewijst niet automatisch de exacte grens van een uitgevoerde maatregel.</w:t>
-      </w:r>
-    </w:p>
-    <w:tbl>
-      <w:tblPr>
-        <w:tblStyle w:val="Table"/>
-        <w:tblW w:type="auto" w:w="0"/>
-        <w:tblLook w:firstRow="1" w:lastRow="0" w:firstColumn="0" w:lastColumn="0" w:noHBand="0" w:noVBand="0" w:val="0020"/>
-      </w:tblPr>
-      <w:tblGrid>
-        <w:gridCol w:w="2640"/>
-        <w:gridCol w:w="2640"/>
-        <w:gridCol w:w="2640"/>
-      </w:tblGrid>
-      <w:tr>
-        <w:trPr>
-          <w:tblHeader w:val="on"/>
-        </w:trPr>
-        <w:tc>
-          <w:tcPr/>
-          <w:p>
-            <w:pPr>
-              <w:pStyle w:val="Compact"/>
-            </w:pPr>
-            <w:r>
-              <w:t xml:space="preserve">Tabel of view</w:t>
-            </w:r>
-          </w:p>
-        </w:tc>
-        <w:tc>
-          <w:tcPr/>
-          <w:p>
-            <w:pPr>
-              <w:pStyle w:val="Compact"/>
-              <w:jc w:val="right"/>
-            </w:pPr>
-            <w:r>
-              <w:t xml:space="preserve">Records</w:t>
-            </w:r>
-          </w:p>
-        </w:tc>
-        <w:tc>
-          <w:tcPr/>
-          <w:p>
-            <w:pPr>
-              <w:pStyle w:val="Compact"/>
-            </w:pPr>
-            <w:r>
-              <w:t xml:space="preserve">Betekenis</w:t>
-            </w:r>
-          </w:p>
-        </w:tc>
-      </w:tr>
-      <w:tr>
-        <w:tc>
-          <w:tcPr/>
-          <w:p>
-            <w:pPr>
-              <w:pStyle w:val="Compact"/>
-            </w:pPr>
-            <w:r>
-              <w:rPr>
-                <w:rStyle w:val="VerbatimChar"/>
-              </w:rPr>
-              <w:t xml:space="preserve">nameninventaris_import</w:t>
-            </w:r>
-          </w:p>
-        </w:tc>
-        <w:tc>
-          <w:tcPr/>
-          <w:p>
-            <w:pPr>
-              <w:pStyle w:val="Compact"/>
-              <w:jc w:val="right"/>
-            </w:pPr>
-            <w:r>
-              <w:t xml:space="preserve">1</w:t>
-            </w:r>
-          </w:p>
-        </w:tc>
-        <w:tc>
-          <w:tcPr/>
-          <w:p>
-            <w:pPr>
-              <w:pStyle w:val="Compact"/>
-            </w:pPr>
-            <w:r>
-              <w:t xml:space="preserve">Herkomst, hash, regelversie en verwachte aantallen van de levering.</w:t>
-            </w:r>
-          </w:p>
-        </w:tc>
-      </w:tr>
-      <w:tr>
-        <w:tc>
-          <w:tcPr/>
-          <w:p>
-            <w:pPr>
-              <w:pStyle w:val="Compact"/>
-            </w:pPr>
-            <w:r>
-              <w:rPr>
-                <w:rStyle w:val="VerbatimChar"/>
-              </w:rPr>
-              <w:t xml:space="preserve">nameninventaris_bron</w:t>
-            </w:r>
-          </w:p>
-        </w:tc>
-        <w:tc>
-          <w:tcPr/>
-          <w:p>
-            <w:pPr>
-              <w:pStyle w:val="Compact"/>
-              <w:jc w:val="right"/>
-            </w:pPr>
-            <w:r>
-              <w:t xml:space="preserve">8</w:t>
-            </w:r>
-          </w:p>
-        </w:tc>
-        <w:tc>
-          <w:tcPr/>
-          <w:p>
-            <w:pPr>
-              <w:pStyle w:val="Compact"/>
-            </w:pPr>
-            <w:r>
-              <w:t xml:space="preserve">Beekman 2021, twee historische artikelen, Neefjes 2010, TOP10NL, OSM en twee Dunea-bronnen.</w:t>
-            </w:r>
-          </w:p>
-        </w:tc>
-      </w:tr>
-      <w:tr>
-        <w:tc>
-          <w:tcPr/>
-          <w:p>
-            <w:pPr>
-              <w:pStyle w:val="Compact"/>
-            </w:pPr>
-            <w:r>
-              <w:rPr>
-                <w:rStyle w:val="VerbatimChar"/>
-              </w:rPr>
-              <w:t xml:space="preserve">nameninventaris_object</w:t>
-            </w:r>
-          </w:p>
-        </w:tc>
-        <w:tc>
-          <w:tcPr/>
-          <w:p>
-            <w:pPr>
-              <w:pStyle w:val="Compact"/>
-              <w:jc w:val="right"/>
-            </w:pPr>
-            <w:r>
-              <w:t xml:space="preserve">182</w:t>
-            </w:r>
-          </w:p>
-        </w:tc>
-        <w:tc>
-          <w:tcPr/>
-          <w:p>
-            <w:pPr>
-              <w:pStyle w:val="Compact"/>
-            </w:pPr>
-            <w:r>
-              <w:t xml:space="preserve">Onderscheiden gebieds-, functionele, pad-, weg- en routeobjecten.</w:t>
-            </w:r>
-          </w:p>
-        </w:tc>
-      </w:tr>
-      <w:tr>
-        <w:tc>
-          <w:tcPr/>
-          <w:p>
-            <w:pPr>
-              <w:pStyle w:val="Compact"/>
-            </w:pPr>
-            <w:r>
-              <w:rPr>
-                <w:rStyle w:val="VerbatimChar"/>
-              </w:rPr>
-              <w:t xml:space="preserve">nameninventaris_vermelding</w:t>
-            </w:r>
-          </w:p>
-        </w:tc>
-        <w:tc>
-          <w:tcPr/>
-          <w:p>
-            <w:pPr>
-              <w:pStyle w:val="Compact"/>
-              <w:jc w:val="right"/>
-            </w:pPr>
-            <w:r>
-              <w:t xml:space="preserve">299</w:t>
-            </w:r>
-          </w:p>
-        </w:tc>
-        <w:tc>
-          <w:tcPr/>
-          <w:p>
-            <w:pPr>
-              <w:pStyle w:val="Compact"/>
-            </w:pPr>
-            <w:r>
-              <w:t xml:space="preserve">Gedateerde naamvermeldingen uit 1602–2026.</w:t>
-            </w:r>
-          </w:p>
-        </w:tc>
-      </w:tr>
-      <w:tr>
-        <w:tc>
-          <w:tcPr/>
-          <w:p>
-            <w:pPr>
-              <w:pStyle w:val="Compact"/>
-            </w:pPr>
-            <w:r>
-              <w:rPr>
-                <w:rStyle w:val="VerbatimChar"/>
-              </w:rPr>
-              <w:t xml:space="preserve">nameninventaris_geometrie</w:t>
-            </w:r>
-          </w:p>
-        </w:tc>
-        <w:tc>
-          <w:tcPr/>
-          <w:p>
-            <w:pPr>
-              <w:pStyle w:val="Compact"/>
-              <w:jc w:val="right"/>
-            </w:pPr>
-            <w:r>
-              <w:t xml:space="preserve">71</w:t>
-            </w:r>
-          </w:p>
-        </w:tc>
-        <w:tc>
-          <w:tcPr/>
-          <w:p>
-            <w:pPr>
-              <w:pStyle w:val="Compact"/>
-            </w:pPr>
-            <w:r>
-              <w:t xml:space="preserve">Brongeometrieën in EPSG:28992 voor 71 objecten.</w:t>
-            </w:r>
-          </w:p>
-        </w:tc>
-      </w:tr>
-      <w:tr>
-        <w:tc>
-          <w:tcPr/>
-          <w:p>
-            <w:pPr>
-              <w:pStyle w:val="Compact"/>
-            </w:pPr>
-            <w:r>
-              <w:rPr>
-                <w:rStyle w:val="VerbatimChar"/>
-              </w:rPr>
-              <w:t xml:space="preserve">nameninventaris_geometrie_bronobject</w:t>
-            </w:r>
-          </w:p>
-        </w:tc>
-        <w:tc>
-          <w:tcPr/>
-          <w:p>
-            <w:pPr>
-              <w:pStyle w:val="Compact"/>
-              <w:jc w:val="right"/>
-            </w:pPr>
-            <w:r>
-              <w:t xml:space="preserve">107</w:t>
-            </w:r>
-          </w:p>
-        </w:tc>
-        <w:tc>
-          <w:tcPr/>
-          <w:p>
-            <w:pPr>
-              <w:pStyle w:val="Compact"/>
-            </w:pPr>
-            <w:r>
-              <w:t xml:space="preserve">Herleidbaarheid van samengevoegde geometrieën naar afzonderlijke bronobjecten.</w:t>
-            </w:r>
-          </w:p>
-        </w:tc>
-      </w:tr>
-      <w:tr>
-        <w:tc>
-          <w:tcPr/>
-          <w:p>
-            <w:pPr>
-              <w:pStyle w:val="Compact"/>
-            </w:pPr>
-            <w:r>
-              <w:rPr>
-                <w:rStyle w:val="VerbatimChar"/>
-              </w:rPr>
-              <w:t xml:space="preserve">nameninventaris_beoordeling</w:t>
-            </w:r>
-          </w:p>
-        </w:tc>
-        <w:tc>
-          <w:tcPr/>
-          <w:p>
-            <w:pPr>
-              <w:pStyle w:val="Compact"/>
-              <w:jc w:val="right"/>
-            </w:pPr>
-            <w:r>
-              <w:t xml:space="preserve">111</w:t>
-            </w:r>
-          </w:p>
-        </w:tc>
-        <w:tc>
-          <w:tcPr/>
-          <w:p>
-            <w:pPr>
-              <w:pStyle w:val="Compact"/>
-            </w:pPr>
-            <w:r>
-              <w:t xml:space="preserve">Actuele, expliciete geometrieleemten; deze namen worden niet ruimtelijk afgeleid.</w:t>
-            </w:r>
-          </w:p>
-        </w:tc>
-      </w:tr>
-      <w:tr>
-        <w:tc>
-          <w:tcPr/>
-          <w:p>
-            <w:pPr>
-              <w:pStyle w:val="Compact"/>
-            </w:pPr>
-            <w:r>
-              <w:rPr>
-                <w:rStyle w:val="VerbatimChar"/>
-              </w:rPr>
-              <w:t xml:space="preserve">plot_geometrie_import</w:t>
-            </w:r>
-          </w:p>
-        </w:tc>
-        <w:tc>
-          <w:tcPr/>
-          <w:p>
-            <w:pPr>
-              <w:pStyle w:val="Compact"/>
-              <w:jc w:val="right"/>
-            </w:pPr>
-            <w:r>
-              <w:t xml:space="preserve">1</w:t>
-            </w:r>
-          </w:p>
-        </w:tc>
-        <w:tc>
-          <w:tcPr/>
-          <w:p>
-            <w:pPr>
-              <w:pStyle w:val="Compact"/>
-            </w:pPr>
-            <w:r>
-              <w:t xml:space="preserve">Actuele SOVON-kavelgeometrie van 55 plots, versie</w:t>
-            </w:r>
-            <w:r>
-              <w:t xml:space="preserve"> </w:t>
-            </w:r>
-            <w:r>
-              <w:rPr>
-                <w:rStyle w:val="VerbatimChar"/>
-              </w:rPr>
-              <w:t xml:space="preserve">sovon-avimap-2025-download-2026-10-02</w:t>
-            </w:r>
-            <w:r>
-              <w:t xml:space="preserve">.</w:t>
-            </w:r>
-          </w:p>
-        </w:tc>
-      </w:tr>
-      <w:tr>
-        <w:tc>
-          <w:tcPr/>
-          <w:p>
-            <w:pPr>
-              <w:pStyle w:val="Compact"/>
-            </w:pPr>
-            <w:r>
-              <w:rPr>
-                <w:rStyle w:val="VerbatimChar"/>
-              </w:rPr>
-              <w:t xml:space="preserve">nameninventaris_plot_koppeling</w:t>
-            </w:r>
-          </w:p>
-        </w:tc>
-        <w:tc>
-          <w:tcPr/>
-          <w:p>
-            <w:pPr>
-              <w:pStyle w:val="Compact"/>
-              <w:jc w:val="right"/>
-            </w:pPr>
-            <w:r>
-              <w:t xml:space="preserve">377</w:t>
-            </w:r>
-          </w:p>
-        </w:tc>
-        <w:tc>
-          <w:tcPr/>
-          <w:p>
-            <w:pPr>
-              <w:pStyle w:val="Compact"/>
-            </w:pPr>
-            <w:r>
-              <w:t xml:space="preserve">Alle geometrische doorsnijdingen tussen 66 naamobjecten en 55 actuele kavels.</w:t>
-            </w:r>
-          </w:p>
-        </w:tc>
-      </w:tr>
-      <w:tr>
-        <w:tc>
-          <w:tcPr/>
-          <w:p>
-            <w:pPr>
-              <w:pStyle w:val="Compact"/>
-            </w:pPr>
-            <w:r>
-              <w:rPr>
-                <w:rStyle w:val="VerbatimChar"/>
-              </w:rPr>
-              <w:t xml:space="preserve">v_nameninventaris_plot_actueel</w:t>
-            </w:r>
-          </w:p>
-        </w:tc>
-        <w:tc>
-          <w:tcPr/>
-          <w:p>
-            <w:pPr>
-              <w:pStyle w:val="Compact"/>
-              <w:jc w:val="right"/>
-            </w:pPr>
-            <w:r>
-              <w:t xml:space="preserve">365</w:t>
-            </w:r>
-          </w:p>
-        </w:tc>
-        <w:tc>
-          <w:tcPr/>
-          <w:p>
-            <w:pPr>
-              <w:pStyle w:val="Compact"/>
-            </w:pPr>
-            <w:r>
-              <w:t xml:space="preserve">Actuele leeslaag voor 53 kavels binnen</w:t>
-            </w:r>
-            <w:r>
-              <w:t xml:space="preserve"> </w:t>
-            </w:r>
-            <w:r>
-              <w:rPr>
-                <w:rStyle w:val="VerbatimChar"/>
-              </w:rPr>
-              <w:t xml:space="preserve">meijendel_natura2000</w:t>
-            </w:r>
-            <w:r>
-              <w:t xml:space="preserve">; M66 en M91 zijn uitgesloten.</w:t>
-            </w:r>
-          </w:p>
-        </w:tc>
-      </w:tr>
-    </w:tbl>
-    <w:p>
-      <w:pPr>
-        <w:pStyle w:val="FirstParagraph"/>
-      </w:pPr>
-      <w:r>
-        <w:t xml:space="preserve">De maatregelactualisering gebruikt deze laag alleen wanneer de maatregellocatie volledig en letterlijk overeenkomt met één of meer geometriseerde naamobjecten. Daarmee zijn 32 relaties voor zes uitvoeringen toegevoegd. Uitvoeringen met een brede locatie, een niet-geometriseerde naam, een gedeeltelijk geometriseerde samengestelde locatie of een afwijkende naam blijven buiten de automatische koppeling.</w:t>
-      </w:r>
-    </w:p>
-    <w:p>
-      <w:pPr>
-        <w:pStyle w:val="Heading2"/>
-      </w:pPr>
-      <w:bookmarkStart w:id="24" w:name="_c4d8e63f8d951db14c31b0e8e0c5017e65b09fe"/>
-      <w:r>
-        <w:t xml:space="preserve">Website dashboard en Shiny beschermen</w:t>
-      </w:r>
-      <w:bookmarkEnd w:id="24"/>
-    </w:p>
-    <w:p>
-      <w:pPr>
-        <w:pStyle w:val="FirstParagraph"/>
-      </w:pPr>
-      <w:r>
-        <w:t xml:space="preserve">De eerdere inventarisatie vond geen rechtstreeks gebruik van de 146</w:t>
-      </w:r>
-      <w:r>
-        <w:t xml:space="preserve"> </w:t>
-      </w:r>
-      <w:r>
-        <w:rPr>
-          <w:rStyle w:val="VerbatimChar"/>
-        </w:rPr>
-        <w:t xml:space="preserve">ndff_*</w:t>
-      </w:r>
-      <w:r>
-        <w:t xml:space="preserve">-, vier</w:t>
-      </w:r>
-      <w:r>
-        <w:t xml:space="preserve"> </w:t>
-      </w:r>
-      <w:r>
-        <w:rPr>
-          <w:rStyle w:val="VerbatimChar"/>
-        </w:rPr>
-        <w:t xml:space="preserve">externe_ecologie_*</w:t>
-      </w:r>
-      <w:r>
-        <w:t xml:space="preserve">- en zes</w:t>
-      </w:r>
-      <w:r>
-        <w:t xml:space="preserve"> </w:t>
-      </w:r>
-      <w:r>
-        <w:rPr>
-          <w:rStyle w:val="VerbatimChar"/>
-        </w:rPr>
-        <w:t xml:space="preserve">vangblik*</w:t>
-      </w:r>
-      <w:r>
-        <w:t xml:space="preserve">-tabellen in de publieke website, reguliere Shiny-cache of openbare dashboardketen. Dat geeft ruimte, maar betekent niet dat die 156 tabellen losstaan. Imports, audits, ruimtelijke verwerking, bestaande views en exportvalidatie gebruiken ze wel. Voor deze herschrijving zijn de relevante cache- en exportcontracten opnieuw gecontroleerd; er is geen productieproef uitgevoerd.</w:t>
-      </w:r>
-    </w:p>
-    <w:p>
-      <w:pPr>
-        <w:pStyle w:val="BodyText"/>
-      </w:pPr>
-      <w:r>
-        <w:t xml:space="preserve">PQ is wel aangesloten. Shiny leest</w:t>
-      </w:r>
-      <w:r>
-        <w:t xml:space="preserve"> </w:t>
-      </w:r>
-      <w:r>
-        <w:rPr>
-          <w:rStyle w:val="VerbatimChar"/>
-        </w:rPr>
-        <w:t xml:space="preserve">pq_plot_jaar_vegetatie</w:t>
-      </w:r>
-      <w:r>
-        <w:t xml:space="preserve"> </w:t>
-      </w:r>
-      <w:r>
-        <w:t xml:space="preserve">en gebruikt soortenrijkdom, bedekkingssom en Shannon in model- en omgevingsgegevens. De website leest de bestaande</w:t>
-      </w:r>
-      <w:r>
-        <w:t xml:space="preserve"> </w:t>
-      </w:r>
-      <w:r>
-        <w:rPr>
-          <w:rStyle w:val="VerbatimChar"/>
-        </w:rPr>
-        <w:t xml:space="preserve">website_plot_vegetatie_jaar</w:t>
-      </w:r>
-      <w:r>
-        <w:t xml:space="preserve">, die naar dezelfde PQ-afleiding verwijst. Foutafhandeling kan een leeg vegetatieonderdeel opleveren terwijl de pagina gewoon opent. Vergelijk daarom de 513 plot-jaarregels uit 1981–2025, waarden, ontbrekende waarden en bronvermelding vóór en na de structurele migratie.</w:t>
-      </w:r>
-    </w:p>
-    <w:p>
-      <w:pPr>
-        <w:pStyle w:val="BodyText"/>
-      </w:pPr>
-      <w:r>
-        <w:t xml:space="preserve">Nieuwe PQ-opnamen mogen bij een afzonderlijk inhoudelijk besluit later doorwerken in de toepassingen. Het toevoegen van bronnen mag echter niet ongemerkt de provinciale controlebasis of bestaande vogelmodellen veranderen. Scheid structureel verplaatsen met gelijke uitkomsten van inhoudelijk verrijken met expliciet beoordeelde nieuwe uitkomsten.</w:t>
-      </w:r>
-    </w:p>
-    <w:p>
-      <w:pPr>
-        <w:pStyle w:val="BodyText"/>
-      </w:pPr>
-      <w:r>
-        <w:t xml:space="preserve">Verder moeten deze afhankelijkheden mee:</w:t>
-      </w:r>
-    </w:p>
-    <w:p>
-      <w:pPr>
-        <w:pStyle w:val="Compact"/>
-        <w:numPr>
-          <w:ilvl w:val="0"/>
-          <w:numId w:val="1002"/>
-        </w:numPr>
-      </w:pPr>
-      <w:r>
-        <w:t xml:space="preserve">foreign keys, indexes, rechten en eventuele routines of triggers;</w:t>
-      </w:r>
-    </w:p>
-    <w:p>
-      <w:pPr>
-        <w:pStyle w:val="Compact"/>
-        <w:numPr>
-          <w:ilvl w:val="0"/>
-          <w:numId w:val="1002"/>
-        </w:numPr>
-      </w:pPr>
-      <w:r>
-        <w:t xml:space="preserve">bestaande views en beveiligde onderzoeksviews die naar openbare NDFF-tabellen verwijzen, met behoud van de beveiligingsgrens;</w:t>
-      </w:r>
-    </w:p>
-    <w:p>
-      <w:pPr>
-        <w:pStyle w:val="Compact"/>
-        <w:numPr>
-          <w:ilvl w:val="0"/>
-          <w:numId w:val="1002"/>
-        </w:numPr>
-      </w:pPr>
-      <w:r>
-        <w:t xml:space="preserve">dynamische tabelnamen in imports en audits, naast letterlijk geschreven namen;</w:t>
-      </w:r>
-    </w:p>
-    <w:p>
-      <w:pPr>
-        <w:pStyle w:val="Compact"/>
-        <w:numPr>
-          <w:ilvl w:val="0"/>
-          <w:numId w:val="1002"/>
-        </w:numPr>
-      </w:pPr>
-      <w:r>
-        <w:t xml:space="preserve">tabelnamen die als gegevens zijn opgeslagen, waaronder</w:t>
-      </w:r>
-      <w:r>
-        <w:t xml:space="preserve"> </w:t>
-      </w:r>
-      <w:r>
-        <w:rPr>
-          <w:rStyle w:val="VerbatimChar"/>
-        </w:rPr>
-        <w:t xml:space="preserve">analyse_datareeks.bron_object</w:t>
-      </w:r>
-      <w:r>
-        <w:t xml:space="preserve"> </w:t>
-      </w:r>
-      <w:r>
-        <w:t xml:space="preserve">en ruimtelijke bronverwijzingen;</w:t>
-      </w:r>
-    </w:p>
-    <w:p>
-      <w:pPr>
-        <w:pStyle w:val="Compact"/>
-        <w:numPr>
-          <w:ilvl w:val="0"/>
-          <w:numId w:val="1002"/>
-        </w:numPr>
-      </w:pPr>
-      <w:r>
-        <w:t xml:space="preserve">de exportcontrole die nu expliciet</w:t>
-      </w:r>
-      <w:r>
-        <w:t xml:space="preserve"> </w:t>
-      </w:r>
-      <w:r>
-        <w:rPr>
-          <w:rStyle w:val="VerbatimChar"/>
-        </w:rPr>
-        <w:t xml:space="preserve">ndff_open_waarneming</w:t>
-      </w:r>
-      <w:r>
-        <w:t xml:space="preserve"> </w:t>
-      </w:r>
-      <w:r>
-        <w:t xml:space="preserve">verlangt, plus de dump- en Shiny-cachecontracten.</w:t>
-      </w:r>
-    </w:p>
-    <w:p>
-      <w:pPr>
-        <w:pStyle w:val="FirstParagraph"/>
-      </w:pPr>
-      <w:r>
-        <w:t xml:space="preserve">Bronbestanden, bron-ID's, hashes en historische regelversies worden niet cosmetisch herschreven. Er komen geen nieuwe overzichts- of compatibiliteitsviews. Bestaande noodzakelijke views moeten bij een daadwerkelijke migratie correct blijven verwijzen.</w:t>
-      </w:r>
-    </w:p>
-    <w:p>
-      <w:pPr>
-        <w:pStyle w:val="Heading2"/>
-      </w:pPr>
-      <w:bookmarkStart w:id="25" w:name="_ea82a111b7c3651db8ff74dc66ba0e01efd62c3"/>
-      <w:r>
-        <w:t xml:space="preserve">Veilige uitvoervolgorde</w:t>
-      </w:r>
-      <w:bookmarkEnd w:id="25"/>
-    </w:p>
-    <w:p>
-      <w:pPr>
-        <w:pStyle w:val="FirstParagraph"/>
-      </w:pPr>
-      <w:r>
-        <w:t xml:space="preserve">Eerst werken we één volledige familie uit op een geïsoleerde databasekopie. Libellen is daarvoor geschikt: 32.325 bronwaarnemingen uit 1950–2025, plus de bestaande route-, geometrie-, bezoek- en taxonbereikstructuur. De proef omvat meer dan vier namen veranderen. Zij moet bewijzen dat de groepsfamilie ook een tweede bron kan ontvangen zonder dubbele metingen, verlies van herkomst of wijziging van nulbetekenis. Een technische testlevering wordt als test gemarkeerd en wordt geen nieuwe ecologische bron.</w:t>
-      </w:r>
-    </w:p>
-    <w:p>
-      <w:pPr>
-        <w:pStyle w:val="BodyText"/>
-      </w:pPr>
-      <w:r>
-        <w:t xml:space="preserve">Daarna volgt de PQ-uitwerking: brongebonden locatie- en opname-identiteit toevoegen en een afgebakende, reeds gekoppelde LVD-selectie vergelijken met de provinciale reeks. Begin met bevestigde overeenkomsten; behandel waarschijnlijke koppelingen afzonderlijk. Voor iedere kandidaat staat vast of deze verrijkt, toevoegt, dubbel is of conflicteert. De eerste acceptatie-eis is behoud van de bestaande 513 plot-jaaruitkomsten uit 1981–2025.</w:t>
-      </w:r>
-    </w:p>
-    <w:p>
-      <w:pPr>
-        <w:pStyle w:val="BodyText"/>
-      </w:pPr>
-      <w:r>
-        <w:t xml:space="preserve">Vervolgens volgen de overige soortenfamilies in samenhangende groepen. Kevers zijn een bruikbare tweede soortproef omdat NDFF, Naturalis en Vangblik daar samenkomen. Gemengde monsters en de algemene beslis- en bronlaag gaan pas over wanneer hun volledige verwijzingsketen is uitgewerkt.</w:t>
-      </w:r>
-    </w:p>
-    <w:p>
-      <w:pPr>
-        <w:pStyle w:val="BodyText"/>
-      </w:pPr>
-      <w:r>
-        <w:t xml:space="preserve">Iedere proef levert een concrete oude–nieuwe objectkaart, sleutelvertaling, importaanpassing en herstelprocedure op. Vergelijk volledige sleutelsets, aantallen, inhoudshashes, bronverwijzingen, nulstatussen en toegelaten selecties. Een verschil is verklaard of blokkeert de overgang. Controleer tevens herhaalde import: hetzelfde bestand mag geen extra metingen opleveren.</w:t>
-      </w:r>
-    </w:p>
-    <w:p>
-      <w:pPr>
-        <w:pStyle w:val="BodyText"/>
-      </w:pPr>
-      <w:r>
-        <w:t xml:space="preserve">Pas na goedkeuring volgt uitvoering in de levende lokale database, met gecontroleerde back-up en zonder gelijktijdige imports. Daarna volgt de normale gevalideerde dump-, cache- en releaseketen. Productie blijft afnemer van de lokale canonieke database. Herstel bestaat uit een geteste schema- en gegevensherstelroute met de bijpassende codeversie; een algemene transactie-rollback is onvoldoende voor DDL-wijzigingen.</w:t>
-      </w:r>
-    </w:p>
-    <w:p>
-      <w:pPr>
-        <w:pStyle w:val="BodyText"/>
-      </w:pPr>
-      <w:r>
-        <w:t xml:space="preserve">De aanbevolen eerstvolgende stap is een concreet libellenproefontwerp, inclusief fysieke tabellen en migratiecontroles. Geen brede live-hernoeming. PQ blijft een eigen, bronoverstijgende familie en wordt expliciet als volgende migratieproef uitgewerkt.</w:t>
-      </w:r>
-    </w:p>
-    <w:p>
-      <w:pPr>
-        <w:pStyle w:val="Heading2"/>
-      </w:pPr>
-      <w:bookmarkStart w:id="26" w:name="_b3cd443c91657a82ff5685c38edcf4074cc84d4"/>
-      <w:r>
-        <w:t xml:space="preserve">Onderbouwing en grenzen</w:t>
-      </w:r>
-      <w:bookmarkEnd w:id="26"/>
-    </w:p>
-    <w:p>
-      <w:pPr>
-        <w:pStyle w:val="FirstParagraph"/>
-      </w:pPr>
-      <w:r>
-        <w:t xml:space="preserve">Groepen, rijtellingen en bronverdelingen zijn read-only gecontroleerd in de levende lokale database op 26 september 2026. Van de 248 fysieke tabellen staan er 163 in de bijlage: 146 NDFF, vier externe ecologie, zes Vangblik en zeven PQ. Ook de niet-vogelgegevens in AVIMAP zijn onderzocht.</w:t>
-      </w:r>
-    </w:p>
-    <w:p>
-      <w:pPr>
-        <w:pStyle w:val="BodyText"/>
-      </w:pPr>
-      <w:r>
-        <w:t xml:space="preserve">De bijlage geeft bestemmingsrichtingen, geen uitvoerbare naamskaart. Rijtellingen stammen uit de nulmeting van dezelfde datum. Niet alle reconstructietabellen hebben een afzonderlijk gecontroleerde meetperiode; hun technische rijaantallen zijn geen zelfstandige meetreeks.</w:t>
-      </w:r>
-    </w:p>
-    <w:p>
-      <w:pPr>
-        <w:pStyle w:val="BodyText"/>
-      </w:pPr>
-      <w:r>
-        <w:t xml:space="preserve">Geraadpleegd zijn de projectinstructies, README, TODO, DECISIONS, architectuur, eerdere inventaris en</w:t>
-      </w:r>
-      <w:r>
-        <w:t xml:space="preserve"> </w:t>
-      </w:r>
-      <w:r>
-        <w:rPr>
-          <w:rStyle w:val="VerbatimChar"/>
-        </w:rPr>
-        <w:t xml:space="preserve">docs/MEIJENDEL_BRONREGISTER.md</w:t>
-      </w:r>
-      <w:r>
-        <w:t xml:space="preserve">; de openbare NDFF-, protocolkwaliteit- en externe-ecologieschema's; import- en overlapdefinities; Shiny</w:t>
-      </w:r>
-      <w:r>
-        <w:t xml:space="preserve"> </w:t>
-      </w:r>
-      <w:r>
-        <w:rPr>
-          <w:rStyle w:val="VerbatimChar"/>
-        </w:rPr>
-        <w:t xml:space="preserve">helpers.R</w:t>
-      </w:r>
-      <w:r>
-        <w:t xml:space="preserve">, cachecontracttest, exportvalidator en websitequery voor plotvegetatie.</w:t>
-      </w:r>
-    </w:p>
-    <w:p>
-      <w:pPr>
-        <w:pStyle w:val="BodyText"/>
-      </w:pPr>
-      <w:r>
-        <w:t xml:space="preserve">Bronrechten, toelating en bruikbaarheid zijn niet opnieuw vastgesteld; het bronregister blijft leidend. Geen T7- of NAS-bestanden geopend, nieuwe bronnen aangevraagd of database, dump, cache en productie gewijzigd.</w:t>
-      </w:r>
-    </w:p>
-    <w:p>
-      <w:pPr>
-        <w:pStyle w:val="Heading2"/>
-      </w:pPr>
-      <w:bookmarkStart w:id="27" w:name="_3a68ce2518fa2826494f15f4a6805cb1b04675a"/>
-      <w:r>
-        <w:t xml:space="preserve">Bijlage huidige tabellen en bestemmingsrichting</w:t>
-      </w:r>
-      <w:bookmarkEnd w:id="27"/>
-    </w:p>
-    <w:p>
-      <w:pPr>
-        <w:pStyle w:val="FirstParagraph"/>
-      </w:pPr>
-      <w:r>
-        <w:t xml:space="preserve">Alle 163 tabelnamen blijven hier terugvindbaar. De aantallen zijn technische rijtellingen van 26 september 2026, geen optelbare onafhankelijke waarnemingen. Een richting met meerdere bestemmingen vereist gegevensverdeling; zij is geen RENAME-opdracht. Definitieve doelnamen en sleutelvertalingen worden in de migratieproef getoetst.</w:t>
-      </w:r>
-    </w:p>
-    <w:p>
-      <w:pPr>
-        <w:pStyle w:val="Heading3"/>
-      </w:pPr>
-      <w:bookmarkStart w:id="28" w:name="_soortgroepindexen"/>
-      <w:r>
-        <w:t xml:space="preserve">Soortgroepindexen</w:t>
-      </w:r>
-      <w:bookmarkEnd w:id="28"/>
-    </w:p>
-    <w:p>
-      <w:pPr>
-        <w:pStyle w:val="FirstParagraph"/>
-      </w:pPr>
-      <w:r>
-        <w:t xml:space="preserve">Voor elk van deze 26 indexen geldt: de bestemming wordt een volwaardige bronoverstijgende familie. Alleen de huidige enkelkolomsindex hernoemen is niet het eindbeeld.</w:t>
-      </w:r>
-    </w:p>
-    <w:tbl>
-      <w:tblPr>
-        <w:tblStyle w:val="Table"/>
-        <w:tblW w:type="auto" w:w="0"/>
-        <w:tblLook w:firstRow="1" w:lastRow="0" w:firstColumn="0" w:lastColumn="0" w:noHBand="0" w:noVBand="0" w:val="0020"/>
-      </w:tblPr>
-      <w:tblGrid>
-        <w:gridCol w:w="2640"/>
-        <w:gridCol w:w="2640"/>
-        <w:gridCol w:w="2640"/>
-      </w:tblGrid>
-      <w:tr>
-        <w:trPr>
-          <w:tblHeader w:val="on"/>
-        </w:trPr>
-        <w:tc>
-          <w:tcPr/>
-          <w:p>
-            <w:pPr>
-              <w:pStyle w:val="Compact"/>
-            </w:pPr>
-            <w:r>
               <w:t xml:space="preserve">Huidige tabel</w:t>
             </w:r>
           </w:p>
@@ -6368,13 +6373,14 @@
     <w:tbl>
       <w:tblPr>
         <w:tblStyle w:val="Table"/>
-        <w:tblW w:type="auto" w:w="0"/>
+        <w:tblW w:type="pct" w:w="5000"/>
+        <w:tblLayout w:type="fixed"/>
         <w:tblLook w:firstRow="1" w:lastRow="0" w:firstColumn="0" w:lastColumn="0" w:noHBand="0" w:noVBand="0" w:val="0020"/>
       </w:tblPr>
       <w:tblGrid>
-        <w:gridCol w:w="2640"/>
-        <w:gridCol w:w="2640"/>
-        <w:gridCol w:w="2640"/>
+        <w:gridCol w:w="2376"/>
+        <w:gridCol w:w="3168"/>
+        <w:gridCol w:w="2376"/>
       </w:tblGrid>
       <w:tr>
         <w:trPr>
@@ -9915,13 +9921,14 @@
     <w:tbl>
       <w:tblPr>
         <w:tblStyle w:val="Table"/>
-        <w:tblW w:type="auto" w:w="0"/>
+        <w:tblW w:type="pct" w:w="5000"/>
+        <w:tblLayout w:type="fixed"/>
         <w:tblLook w:firstRow="1" w:lastRow="0" w:firstColumn="0" w:lastColumn="0" w:noHBand="0" w:noVBand="0" w:val="0020"/>
       </w:tblPr>
       <w:tblGrid>
-        <w:gridCol w:w="2640"/>
-        <w:gridCol w:w="2640"/>
-        <w:gridCol w:w="2640"/>
+        <w:gridCol w:w="2376"/>
+        <w:gridCol w:w="3168"/>
+        <w:gridCol w:w="2376"/>
       </w:tblGrid>
       <w:tr>
         <w:trPr>
@@ -10756,13 +10763,14 @@
     <w:tbl>
       <w:tblPr>
         <w:tblStyle w:val="Table"/>
-        <w:tblW w:type="auto" w:w="0"/>
+        <w:tblW w:type="pct" w:w="5000"/>
+        <w:tblLayout w:type="fixed"/>
         <w:tblLook w:firstRow="1" w:lastRow="0" w:firstColumn="0" w:lastColumn="0" w:noHBand="0" w:noVBand="0" w:val="0020"/>
       </w:tblPr>
       <w:tblGrid>
-        <w:gridCol w:w="2640"/>
-        <w:gridCol w:w="2640"/>
-        <w:gridCol w:w="2640"/>
+        <w:gridCol w:w="2376"/>
+        <w:gridCol w:w="3168"/>
+        <w:gridCol w:w="2376"/>
       </w:tblGrid>
       <w:tr>
         <w:trPr>
@@ -11480,13 +11488,14 @@
     <w:tbl>
       <w:tblPr>
         <w:tblStyle w:val="Table"/>
-        <w:tblW w:type="auto" w:w="0"/>
+        <w:tblW w:type="pct" w:w="5000"/>
+        <w:tblLayout w:type="fixed"/>
         <w:tblLook w:firstRow="1" w:lastRow="0" w:firstColumn="0" w:lastColumn="0" w:noHBand="0" w:noVBand="0" w:val="0020"/>
       </w:tblPr>
       <w:tblGrid>
-        <w:gridCol w:w="2640"/>
-        <w:gridCol w:w="2640"/>
-        <w:gridCol w:w="2640"/>
+        <w:gridCol w:w="2376"/>
+        <w:gridCol w:w="3168"/>
+        <w:gridCol w:w="2376"/>
       </w:tblGrid>
       <w:tr>
         <w:trPr>
@@ -11697,13 +11706,14 @@
     <w:tbl>
       <w:tblPr>
         <w:tblStyle w:val="Table"/>
-        <w:tblW w:type="auto" w:w="0"/>
+        <w:tblW w:type="pct" w:w="5000"/>
+        <w:tblLayout w:type="fixed"/>
         <w:tblLook w:firstRow="1" w:lastRow="0" w:firstColumn="0" w:lastColumn="0" w:noHBand="0" w:noVBand="0" w:val="0020"/>
       </w:tblPr>
       <w:tblGrid>
-        <w:gridCol w:w="2640"/>
-        <w:gridCol w:w="2640"/>
-        <w:gridCol w:w="2640"/>
+        <w:gridCol w:w="2376"/>
+        <w:gridCol w:w="3168"/>
+        <w:gridCol w:w="2376"/>
       </w:tblGrid>
       <w:tr>
         <w:trPr>
@@ -11992,13 +12002,14 @@
     <w:tbl>
       <w:tblPr>
         <w:tblStyle w:val="Table"/>
-        <w:tblW w:type="auto" w:w="0"/>
+        <w:tblW w:type="pct" w:w="5000"/>
+        <w:tblLayout w:type="fixed"/>
         <w:tblLook w:firstRow="1" w:lastRow="0" w:firstColumn="0" w:lastColumn="0" w:noHBand="0" w:noVBand="0" w:val="0020"/>
       </w:tblPr>
       <w:tblGrid>
-        <w:gridCol w:w="2640"/>
-        <w:gridCol w:w="2640"/>
-        <w:gridCol w:w="2640"/>
+        <w:gridCol w:w="2376"/>
+        <w:gridCol w:w="3168"/>
+        <w:gridCol w:w="2376"/>
       </w:tblGrid>
       <w:tr>
         <w:trPr>

</xml_diff>

<commit_message>
Koppel begrazing Vallei Meijendel
</commit_message>
<xml_diff>
--- a/docs/database/MEIJENDEL_TABELINVENTARIS.docx
+++ b/docs/database/MEIJENDEL_TABELINVENTARIS.docx
@@ -4085,18 +4085,18 @@
               <w:jc w:val="right"/>
             </w:pPr>
             <w:r>
-              <w:t xml:space="preserve">143</w:t>
-            </w:r>
-          </w:p>
-        </w:tc>
-        <w:tc>
-          <w:tcPr/>
-          <w:p>
-            <w:pPr>
-              <w:pStyle w:val="Compact"/>
-            </w:pPr>
-            <w:r>
-              <w:t xml:space="preserve">Helmduinen is gekoppeld aan M15 en M16; M17a is retroactief verwijderd. Meeuwenduin en Prinsenduin hebben samen zeven relaties. Het maaibeheer in Ruygenhoek, Lange Strook en De Loopert heeft vijf relaties. Maatregel 22h heeft zes relaties. Het onderzochte maar niet uitgevoerde PAS-maaibeheer 23 is als zoekgebied gekoppeld aan tien kavels: M10-12-76, M12a, M62, M63, M64, M65, M72, M73, M74 en M75. Het PIM-leidingwerk heeft zeven relaties: M41, M42, M43, M45, M84, M84s en M85. Infiltratieplas 27.2 is gekoppeld aan M77. De precieze werkvoetafdrukken zijn niet gepubliceerd; de doorsnijdingspercentages blijven leeg.</w:t>
+              <w:t xml:space="preserve">152</w:t>
+            </w:r>
+          </w:p>
+        </w:tc>
+        <w:tc>
+          <w:tcPr/>
+          <w:p>
+            <w:pPr>
+              <w:pStyle w:val="Compact"/>
+            </w:pPr>
+            <w:r>
+              <w:t xml:space="preserve">Helmduinen is gekoppeld aan M15 en M16; M17a is retroactief verwijderd. Meeuwenduin en Prinsenduin hebben samen zeven relaties. Het maaibeheer in Ruygenhoek, Lange Strook en De Loopert heeft vijf relaties. Maatregel 22h heeft zes relaties. De jaarlijkse begrazing van Vallei Meijendel is gekoppeld aan de negen actuele kavels M3, M4-5, M51, M52, M53, M54a, M54b, M55 en M85; de historische voorgangers M4, M5 en M54 zijn uitgesloten. Het onderzochte maar niet uitgevoerde PAS-maaibeheer 23 is als zoekgebied gekoppeld aan tien kavels: M10-12-76, M12a, M62, M63, M64, M65, M72, M73, M74 en M75. Het PIM-leidingwerk heeft zeven relaties: M41, M42, M43, M45, M84, M84s en M85. Infiltratieplas 27.2 is gekoppeld aan M77. De precieze werkvoetafdrukken zijn niet gepubliceerd; de doorsnijdingspercentages blijven leeg.</w:t>
             </w:r>
           </w:p>
         </w:tc>

</xml_diff>

<commit_message>
docs: verduidelijk NDFF-opslag en historische tabelinventaris
</commit_message>
<xml_diff>
--- a/docs/database/MEIJENDEL_TABELINVENTARIS.docx
+++ b/docs/database/MEIJENDEL_TABELINVENTARIS.docx
@@ -18,6 +18,11 @@
       </w:pPr>
       <w:r>
         <w:t xml:space="preserve">Tabelinventaris en voorstel voor herinrichting. Stand van de controles: 16 oktober 2026. De aantallen volgen de levende lokale database. Voor HNS zijn v1 en v2 beide opgenomen: v2 is actueel; v1 blijft als auditspoor bewaard.</w:t>
+      </w:r>
+    </w:p>
+    <w:p>
+      <w:r>
+        <w:t>Historische inventaris. De tabellen en aantallen hieronder beschrijven de nulmeting van 26 september 2026 en het voorstel dat op 16 oktober is bijgewerkt; zij vormen geen actueel databaseschema. Op 23 oktober 2026 zijn de voormalige openbare ID-indexen ndff_mossen en ndff_korstmossen verwijderd. Hun 32.353 en 28.643 volledige bronregels staan nu in mossen_waarneming en korstmossen_waarneming; identificaties en fysieke opslaglocaties staan in ndff_open_waarneming_register. De historische rijen in de bijlage blijven voor de audit behouden. Voor de actuele opslag gelden het bronregister en de migratiedocumentatie.</w:t>
       </w:r>
     </w:p>
     <w:p>
@@ -5206,11 +5211,9 @@
       <w:pPr>
         <w:pStyle w:val="Heading2"/>
       </w:pPr>
-      <w:bookmarkStart w:id="27" w:name="_3a68ce2518fa2826494f15f4a6805cb1b04675a"/>
-      <w:r>
-        <w:t xml:space="preserve">Bijlage huidige tabellen en bestemmingsrichting</w:t>
-      </w:r>
-      <w:bookmarkEnd w:id="27"/>
+      <w:r>
+        <w:t>Bijlage tabellen bij de nulmeting en bestemmingsrichting</w:t>
+      </w:r>
     </w:p>
     <w:p>
       <w:pPr>
@@ -5256,11 +5259,8 @@
         <w:tc>
           <w:tcPr/>
           <w:p>
-            <w:pPr>
-              <w:pStyle w:val="Compact"/>
-            </w:pPr>
-            <w:r>
-              <w:t xml:space="preserve">Huidige tabel</w:t>
+            <w:r>
+              <w:t>Tabel bij nulmeting</w:t>
             </w:r>
           </w:p>
         </w:tc>
@@ -6410,11 +6410,8 @@
         <w:tc>
           <w:tcPr/>
           <w:p>
-            <w:pPr>
-              <w:pStyle w:val="Compact"/>
-            </w:pPr>
-            <w:r>
-              <w:t xml:space="preserve">Huidige tabel</w:t>
+            <w:r>
+              <w:t>Tabel bij nulmeting</w:t>
             </w:r>
           </w:p>
         </w:tc>
@@ -9958,11 +9955,8 @@
         <w:tc>
           <w:tcPr/>
           <w:p>
-            <w:pPr>
-              <w:pStyle w:val="Compact"/>
-            </w:pPr>
-            <w:r>
-              <w:t xml:space="preserve">Huidige tabel</w:t>
+            <w:r>
+              <w:t>Tabel bij nulmeting</w:t>
             </w:r>
           </w:p>
         </w:tc>
@@ -10800,11 +10794,8 @@
         <w:tc>
           <w:tcPr/>
           <w:p>
-            <w:pPr>
-              <w:pStyle w:val="Compact"/>
-            </w:pPr>
-            <w:r>
-              <w:t xml:space="preserve">Huidige tabel</w:t>
+            <w:r>
+              <w:t>Tabel bij nulmeting</w:t>
             </w:r>
           </w:p>
         </w:tc>
@@ -11525,11 +11516,8 @@
         <w:tc>
           <w:tcPr/>
           <w:p>
-            <w:pPr>
-              <w:pStyle w:val="Compact"/>
-            </w:pPr>
-            <w:r>
-              <w:t xml:space="preserve">Huidige tabel</w:t>
+            <w:r>
+              <w:t>Tabel bij nulmeting</w:t>
             </w:r>
           </w:p>
         </w:tc>
@@ -11743,11 +11731,8 @@
         <w:tc>
           <w:tcPr/>
           <w:p>
-            <w:pPr>
-              <w:pStyle w:val="Compact"/>
-            </w:pPr>
-            <w:r>
-              <w:t xml:space="preserve">Huidige tabel</w:t>
+            <w:r>
+              <w:t>Tabel bij nulmeting</w:t>
             </w:r>
           </w:p>
         </w:tc>
@@ -12039,11 +12024,8 @@
         <w:tc>
           <w:tcPr/>
           <w:p>
-            <w:pPr>
-              <w:pStyle w:val="Compact"/>
-            </w:pPr>
-            <w:r>
-              <w:t xml:space="preserve">Huidige tabel</w:t>
+            <w:r>
+              <w:t>Tabel bij nulmeting</w:t>
             </w:r>
           </w:p>
         </w:tc>

</xml_diff>